<commit_message>
Update Flutter portfolio projects, resume, and hero motion
</commit_message>
<xml_diff>
--- a/public/muhammed-mubashir-k-resume-flutter.docx
+++ b/public/muhammed-mubashir-k-resume-flutter.docx
@@ -5,725 +5,343 @@
     <w:p>
       <w:pPr>
         <w:pStyle w:val="Title"/>
-        <w:spacing w:after="20"/>
-        <w:jc w:val="center"/>
       </w:pPr>
       <w:r>
-        <w:rPr>
-          <w:rFonts w:ascii="Calibri" w:hAnsi="Calibri"/>
-          <w:b/>
-          <w:color w:val="000000"/>
-          <w:sz w:val="36"/>
-        </w:rPr>
         <w:t>MUHAMMED MUBASHIR K</w:t>
       </w:r>
     </w:p>
     <w:p>
-      <w:pPr>
-        <w:spacing w:after="80"/>
-        <w:jc w:val="center"/>
-      </w:pPr>
       <w:r>
         <w:rPr>
-          <w:rFonts w:ascii="Calibri" w:hAnsi="Calibri"/>
-          <w:b w:val="0"/>
-          <w:color w:val="2D2D2D"/>
-          <w:sz w:val="20"/>
+          <w:b/>
         </w:rPr>
-        <w:t>Flutter Developer | Dart | Android | iOS | REST APIs</w:t>
+        <w:t>Flutter Developer | Mobile &amp; POS Applications</w:t>
       </w:r>
     </w:p>
     <w:p>
-      <w:pPr>
-        <w:spacing w:after="160"/>
-        <w:jc w:val="center"/>
-      </w:pPr>
       <w:r>
         <w:rPr>
-          <w:rFonts w:ascii="Calibri" w:hAnsi="Calibri"/>
           <w:b w:val="0"/>
-          <w:color w:val="2D2D2D"/>
-          <w:sz w:val="19"/>
         </w:rPr>
-        <w:t xml:space="preserve">Kerala, India  |  </w:t>
+        <w:t xml:space="preserve">Kerala, India | </w:t>
       </w:r>
       <w:hyperlink r:id="rId9">
         <w:r>
           <w:rPr>
             <w:color w:val="000000"/>
-            <w:sz w:val="19"/>
-            <w:rFonts w:ascii="Calibri" w:hAnsi="Calibri"/>
-          </w:rPr>
-          <w:t>muhammedmubashir720@gmail.com</w:t>
-        </w:r>
-      </w:hyperlink>
-      <w:r>
-        <w:rPr>
-          <w:rFonts w:ascii="Calibri" w:hAnsi="Calibri"/>
-          <w:b w:val="0"/>
-          <w:color w:val="2D2D2D"/>
-          <w:sz w:val="19"/>
-        </w:rPr>
-        <w:t xml:space="preserve">  |  </w:t>
-      </w:r>
-      <w:hyperlink r:id="rId10">
-        <w:r>
-          <w:rPr>
-            <w:color w:val="000000"/>
-            <w:sz w:val="19"/>
+            <w:sz w:val="20"/>
             <w:rFonts w:ascii="Calibri" w:hAnsi="Calibri"/>
           </w:rPr>
           <w:t>+91 8089433955</w:t>
         </w:r>
       </w:hyperlink>
       <w:r>
-        <w:rPr>
-          <w:rFonts w:ascii="Calibri" w:hAnsi="Calibri"/>
-          <w:b w:val="0"/>
-          <w:color w:val="2D2D2D"/>
-          <w:sz w:val="19"/>
-        </w:rPr>
-        <w:t xml:space="preserve">  |  </w:t>
+        <w:t xml:space="preserve"> | </w:t>
       </w:r>
+      <w:hyperlink r:id="rId10">
+        <w:r>
+          <w:rPr>
+            <w:color w:val="000000"/>
+            <w:sz w:val="20"/>
+            <w:rFonts w:ascii="Calibri" w:hAnsi="Calibri"/>
+          </w:rPr>
+          <w:t>muhammedmubashir720@gmail.com</w:t>
+        </w:r>
+      </w:hyperlink>
+    </w:p>
+    <w:p>
       <w:hyperlink r:id="rId11">
         <w:r>
           <w:rPr>
             <w:color w:val="000000"/>
-            <w:sz w:val="19"/>
+            <w:sz w:val="20"/>
             <w:rFonts w:ascii="Calibri" w:hAnsi="Calibri"/>
           </w:rPr>
-          <w:t>github.com/MuhammedMubashir-dev</w:t>
+          <w:t>Portfolio</w:t>
         </w:r>
       </w:hyperlink>
       <w:r>
-        <w:rPr>
-          <w:rFonts w:ascii="Calibri" w:hAnsi="Calibri"/>
-          <w:b w:val="0"/>
-          <w:color w:val="2D2D2D"/>
-          <w:sz w:val="19"/>
-        </w:rPr>
-        <w:t xml:space="preserve">  |  </w:t>
+        <w:t xml:space="preserve"> | </w:t>
       </w:r>
       <w:hyperlink r:id="rId12">
         <w:r>
           <w:rPr>
             <w:color w:val="000000"/>
-            <w:sz w:val="19"/>
+            <w:sz w:val="20"/>
             <w:rFonts w:ascii="Calibri" w:hAnsi="Calibri"/>
           </w:rPr>
-          <w:t>linkedin.com/in/muhammed-mubashir-k</w:t>
+          <w:t>GitHub</w:t>
         </w:r>
       </w:hyperlink>
       <w:r>
-        <w:rPr>
-          <w:rFonts w:ascii="Calibri" w:hAnsi="Calibri"/>
-          <w:b w:val="0"/>
-          <w:color w:val="2D2D2D"/>
-          <w:sz w:val="19"/>
-        </w:rPr>
-        <w:t xml:space="preserve">  |  </w:t>
+        <w:t xml:space="preserve"> | </w:t>
       </w:r>
       <w:hyperlink r:id="rId13">
         <w:r>
           <w:rPr>
             <w:color w:val="000000"/>
-            <w:sz w:val="19"/>
+            <w:sz w:val="20"/>
             <w:rFonts w:ascii="Calibri" w:hAnsi="Calibri"/>
           </w:rPr>
-          <w:t>muhammed-mubashir-portfolio.netlify.app</w:t>
+          <w:t>LinkedIn</w:t>
         </w:r>
       </w:hyperlink>
     </w:p>
     <w:p>
       <w:pPr>
         <w:pStyle w:val="Heading1"/>
-        <w:spacing w:before="160" w:after="60"/>
       </w:pPr>
       <w:r>
-        <w:rPr>
-          <w:rFonts w:ascii="Calibri" w:hAnsi="Calibri"/>
-          <w:b/>
-          <w:color w:val="000000"/>
-          <w:sz w:val="22"/>
-        </w:rPr>
         <w:t>Professional Summary</w:t>
       </w:r>
     </w:p>
     <w:p>
-      <w:pPr>
-        <w:spacing w:after="80" w:line="276" w:lineRule="auto"/>
-      </w:pPr>
       <w:r>
         <w:rPr>
-          <w:rFonts w:ascii="Calibri" w:hAnsi="Calibri"/>
           <w:b w:val="0"/>
-          <w:color w:val="000000"/>
-          <w:sz w:val="21"/>
         </w:rPr>
-        <w:t>Flutter Developer with production experience building cross-platform Android and iOS applications for mobile POS, inventory management, logistics, and e-commerce products. Delivered billing, purchase return, packing, shipping, reporting, bilingual printing, Arabic and RTL localization, Google Maps, Razorpay payments, push notifications, in-app updates, and production release fixes. Experienced with REST APIs, responsive UI development, state management, Git, and collaboration with backend teams.</w:t>
+        <w:t>Flutter developer with production experience building POS, customer ordering, and delivery applications using Dart, Provider, and REST APIs. Delivered cash-management workflows, payment integrations, bilingual printing, and API optimizations, with regression tests for pricing and stock handling. Promoted to Junior Application Developer after three months at ENKE Consulting.</w:t>
       </w:r>
     </w:p>
     <w:p>
       <w:pPr>
         <w:pStyle w:val="Heading1"/>
-        <w:spacing w:before="160" w:after="60"/>
       </w:pPr>
       <w:r>
-        <w:rPr>
-          <w:rFonts w:ascii="Calibri" w:hAnsi="Calibri"/>
-          <w:b/>
-          <w:color w:val="000000"/>
-          <w:sz w:val="22"/>
-        </w:rPr>
         <w:t>Technical Skills</w:t>
       </w:r>
     </w:p>
     <w:p>
-      <w:pPr>
-        <w:spacing w:after="20"/>
-      </w:pPr>
       <w:r>
         <w:rPr>
-          <w:rFonts w:ascii="Calibri" w:hAnsi="Calibri"/>
           <w:b/>
-          <w:color w:val="000000"/>
-          <w:sz w:val="20"/>
         </w:rPr>
-        <w:t xml:space="preserve">Flutter Development: </w:t>
+        <w:t xml:space="preserve">Flutter and Dart: </w:t>
       </w:r>
       <w:r>
-        <w:rPr>
-          <w:rFonts w:ascii="Calibri" w:hAnsi="Calibri"/>
-          <w:b w:val="0"/>
-          <w:color w:val="000000"/>
-          <w:sz w:val="20"/>
-        </w:rPr>
-        <w:t>Flutter, Dart, Reusable Widgets, Responsive UI, State Management</w:t>
+        <w:t>Provider, ChangeNotifier, setState, reusable widgets, responsive layouts</w:t>
       </w:r>
     </w:p>
     <w:p>
-      <w:pPr>
-        <w:spacing w:after="20"/>
-      </w:pPr>
       <w:r>
         <w:rPr>
-          <w:rFonts w:ascii="Calibri" w:hAnsi="Calibri"/>
           <w:b/>
-          <w:color w:val="000000"/>
-          <w:sz w:val="20"/>
-        </w:rPr>
-        <w:t xml:space="preserve">Mobile Platforms: </w:t>
-      </w:r>
-      <w:r>
-        <w:rPr>
-          <w:rFonts w:ascii="Calibri" w:hAnsi="Calibri"/>
-          <w:b w:val="0"/>
-          <w:color w:val="000000"/>
-          <w:sz w:val="20"/>
-        </w:rPr>
-        <w:t>Android, iOS, Release Builds, Deep Linking, Push Notifications, In-App Updates</w:t>
-      </w:r>
-    </w:p>
-    <w:p>
-      <w:pPr>
-        <w:spacing w:after="20"/>
-      </w:pPr>
-      <w:r>
-        <w:rPr>
-          <w:rFonts w:ascii="Calibri" w:hAnsi="Calibri"/>
-          <w:b/>
-          <w:color w:val="000000"/>
-          <w:sz w:val="20"/>
-        </w:rPr>
-        <w:t xml:space="preserve">Architecture and APIs: </w:t>
-      </w:r>
-      <w:r>
-        <w:rPr>
-          <w:rFonts w:ascii="Calibri" w:hAnsi="Calibri"/>
-          <w:b w:val="0"/>
-          <w:color w:val="000000"/>
-          <w:sz w:val="20"/>
-        </w:rPr>
-        <w:t>REST APIs, Authentication, JSON, Pagination, Error Handling, Backend Integration</w:t>
-      </w:r>
-    </w:p>
-    <w:p>
-      <w:pPr>
-        <w:spacing w:after="20"/>
-      </w:pPr>
-      <w:r>
-        <w:rPr>
-          <w:rFonts w:ascii="Calibri" w:hAnsi="Calibri"/>
-          <w:b/>
-          <w:color w:val="000000"/>
-          <w:sz w:val="20"/>
         </w:rPr>
         <w:t xml:space="preserve">Integrations: </w:t>
       </w:r>
       <w:r>
-        <w:rPr>
-          <w:rFonts w:ascii="Calibri" w:hAnsi="Calibri"/>
-          <w:b w:val="0"/>
-          <w:color w:val="000000"/>
-          <w:sz w:val="20"/>
-        </w:rPr>
-        <w:t>Razorpay, Google Maps, Barcode Generation, Bilingual Printing, Arabic Localization, RTL</w:t>
+        <w:t>REST APIs, JSON, Razorpay, Stripe, Google Maps, push notifications, receipt printing, RTL</w:t>
       </w:r>
     </w:p>
     <w:p>
-      <w:pPr>
-        <w:spacing w:after="20"/>
-      </w:pPr>
       <w:r>
         <w:rPr>
-          <w:rFonts w:ascii="Calibri" w:hAnsi="Calibri"/>
           <w:b/>
-          <w:color w:val="000000"/>
-          <w:sz w:val="20"/>
         </w:rPr>
-        <w:t xml:space="preserve">Tools and Databases: </w:t>
+        <w:t xml:space="preserve">Web Development: </w:t>
       </w:r>
       <w:r>
+        <w:t>React, Next.js, JavaScript, TypeScript, Tailwind CSS</w:t>
+      </w:r>
+    </w:p>
+    <w:p>
+      <w:r>
         <w:rPr>
-          <w:rFonts w:ascii="Calibri" w:hAnsi="Calibri"/>
-          <w:b w:val="0"/>
-          <w:color w:val="000000"/>
-          <w:sz w:val="20"/>
+          <w:b/>
         </w:rPr>
-        <w:t>Git, GitHub, Postman, VS Code, Figma, MySQL, SQLite</w:t>
+        <w:t xml:space="preserve">Engineering Tools: </w:t>
+      </w:r>
+      <w:r>
+        <w:t>Git, GitHub, Postman, VS Code, SQLite, SharedPreferences</w:t>
       </w:r>
     </w:p>
     <w:p>
       <w:pPr>
         <w:pStyle w:val="Heading1"/>
-        <w:spacing w:before="160" w:after="60"/>
       </w:pPr>
       <w:r>
-        <w:rPr>
-          <w:rFonts w:ascii="Calibri" w:hAnsi="Calibri"/>
-          <w:b/>
-          <w:color w:val="000000"/>
-          <w:sz w:val="22"/>
-        </w:rPr>
         <w:t>Work Experience</w:t>
       </w:r>
     </w:p>
     <w:p>
-      <w:pPr>
-        <w:spacing w:before="40" w:after="20"/>
-      </w:pPr>
       <w:r>
         <w:rPr>
-          <w:rFonts w:ascii="Calibri" w:hAnsi="Calibri"/>
           <w:b/>
-          <w:color w:val="000000"/>
-          <w:sz w:val="22"/>
         </w:rPr>
-        <w:t>ENKE Consulting Services LLP</w:t>
-      </w:r>
-      <w:r>
-        <w:rPr>
-          <w:rFonts w:ascii="Calibri" w:hAnsi="Calibri"/>
-          <w:b w:val="0"/>
-          <w:color w:val="2D2D2D"/>
-          <w:sz w:val="19"/>
-        </w:rPr>
-        <w:t xml:space="preserve">  |  Apr 2026 - Present | 5 mos</w:t>
+        <w:t>ENKE Consulting Services LLP | Apr 2026 - Present</w:t>
       </w:r>
     </w:p>
     <w:p>
-      <w:pPr>
-        <w:spacing w:before="60" w:after="40"/>
-      </w:pPr>
       <w:r>
         <w:rPr>
-          <w:rFonts w:ascii="Calibri" w:hAnsi="Calibri"/>
           <w:b/>
-          <w:color w:val="000000"/>
-          <w:sz w:val="21"/>
         </w:rPr>
-        <w:t>Junior Application Developer</w:t>
-      </w:r>
-      <w:r>
-        <w:rPr>
-          <w:rFonts w:ascii="Calibri" w:hAnsi="Calibri"/>
-          <w:b w:val="0"/>
-          <w:color w:val="2D2D2D"/>
-          <w:sz w:val="20"/>
-        </w:rPr>
-        <w:t xml:space="preserve">  |  </w:t>
-      </w:r>
-      <w:r>
-        <w:rPr>
-          <w:rFonts w:ascii="Calibri" w:hAnsi="Calibri"/>
-          <w:b w:val="0"/>
-          <w:color w:val="2D2D2D"/>
-          <w:sz w:val="19"/>
-        </w:rPr>
-        <w:t>Jul 2026 - Present | 2 mos</w:t>
+        <w:t>Junior Application Developer | Jul 2026 - Present</w:t>
       </w:r>
     </w:p>
     <w:p>
       <w:pPr>
         <w:pStyle w:val="ListBullet"/>
-        <w:spacing w:after="40" w:line="269" w:lineRule="auto"/>
-        <w:ind w:left="288" w:hanging="288"/>
+        <w:ind w:left="202" w:hanging="202"/>
       </w:pPr>
       <w:r>
+        <w:t>Delivered production Flutter features across POS and logistics applications; diagnosed API edge cases, authentication failures, and Android and iOS release issues.</w:t>
+      </w:r>
+    </w:p>
+    <w:p>
+      <w:r>
         <w:rPr>
-          <w:rFonts w:ascii="Calibri" w:hAnsi="Calibri"/>
-          <w:b w:val="0"/>
-          <w:color w:val="000000"/>
-          <w:sz w:val="20"/>
+          <w:b/>
         </w:rPr>
-        <w:t>Developed Flutter POS workflows for billing, inventory, purchase returns, purchase orders, packing, shipping, Day Close, and stock reporting.</w:t>
+        <w:t>Full Stack Developer Trainee | Apr 2026 - Jul 2026</w:t>
       </w:r>
     </w:p>
     <w:p>
       <w:pPr>
         <w:pStyle w:val="ListBullet"/>
-        <w:spacing w:after="40" w:line="269" w:lineRule="auto"/>
-        <w:ind w:left="288" w:hanging="288"/>
+        <w:ind w:left="202" w:hanging="202"/>
       </w:pPr>
       <w:r>
+        <w:t>Integrated REST APIs and built reusable Flutter interfaces; contributed React and Next.js commerce features and collaborated with backend developers on API issues.</w:t>
+      </w:r>
+    </w:p>
+    <w:p>
+      <w:pPr>
+        <w:pStyle w:val="Heading1"/>
+      </w:pPr>
+      <w:r>
+        <w:t>Selected Projects</w:t>
+      </w:r>
+    </w:p>
+    <w:p>
+      <w:r>
         <w:rPr>
-          <w:rFonts w:ascii="Calibri" w:hAnsi="Calibri"/>
-          <w:b w:val="0"/>
-          <w:color w:val="000000"/>
-          <w:sz w:val="20"/>
+          <w:b/>
         </w:rPr>
-        <w:t>Implemented Arabic localization and RTL layouts across billing, sales, reports, settings, account, supplier, and customer workflows.</w:t>
+        <w:t>EPOSMOB | Retail POS and Inventory | Flutter, Provider</w:t>
       </w:r>
     </w:p>
     <w:p>
       <w:pPr>
         <w:pStyle w:val="ListBullet"/>
-        <w:spacing w:after="40" w:line="269" w:lineRule="auto"/>
-        <w:ind w:left="288" w:hanging="288"/>
+        <w:ind w:left="202" w:hanging="202"/>
       </w:pPr>
       <w:r>
-        <w:rPr>
-          <w:rFonts w:ascii="Calibri" w:hAnsi="Calibri"/>
-          <w:b w:val="0"/>
-          <w:color w:val="000000"/>
-          <w:sz w:val="20"/>
-        </w:rPr>
-        <w:t>Built bilingual receipt and invoice printing, fractional quantity handling, SKU search, and ZATCA-related order failure alerts.</w:t>
+        <w:t>Built shift-opening and Day Close workflows with cash-denomination calculations and pending-close alerts; implemented purchase-return screens using Provider and REST APIs.</w:t>
       </w:r>
     </w:p>
     <w:p>
       <w:pPr>
         <w:pStyle w:val="ListBullet"/>
-        <w:spacing w:after="40" w:line="269" w:lineRule="auto"/>
-        <w:ind w:left="288" w:hanging="288"/>
+        <w:ind w:left="202" w:hanging="202"/>
       </w:pPr>
       <w:r>
+        <w:t>Fixed English/Arabic invoice rendering and USB printing; corrected barcode pricing and variant-specific stock selection, adding regression tests for pricing fallbacks and stock isolation.</w:t>
+      </w:r>
+    </w:p>
+    <w:p>
+      <w:hyperlink r:id="rId14">
+        <w:r>
+          <w:rPr>
+            <w:color w:val="000000"/>
+            <w:sz w:val="20"/>
+            <w:rFonts w:ascii="Calibri" w:hAnsi="Calibri"/>
+          </w:rPr>
+          <w:t>EPOSMOB case study</w:t>
+        </w:r>
+      </w:hyperlink>
+    </w:p>
+    <w:p>
+      <w:r>
         <w:rPr>
-          <w:rFonts w:ascii="Calibri" w:hAnsi="Calibri"/>
-          <w:b w:val="0"/>
-          <w:color w:val="000000"/>
-          <w:sz w:val="20"/>
+          <w:b/>
         </w:rPr>
-        <w:t>Delivered Flutter logistics features including Google Maps navigation, Razorpay payments, push notifications, pagination, maintenance handling, and in-app updates.</w:t>
+        <w:t>Ganvin Customer | Delivery Booking and Tracking | Flutter, Provider</w:t>
       </w:r>
     </w:p>
     <w:p>
       <w:pPr>
         <w:pStyle w:val="ListBullet"/>
-        <w:spacing w:after="40" w:line="269" w:lineRule="auto"/>
-        <w:ind w:left="288" w:hanging="288"/>
+        <w:ind w:left="202" w:hanging="202"/>
       </w:pPr>
       <w:r>
-        <w:rPr>
-          <w:rFonts w:ascii="Calibri" w:hAnsi="Calibri"/>
-          <w:b w:val="0"/>
-          <w:color w:val="000000"/>
-          <w:sz w:val="20"/>
-        </w:rPr>
-        <w:t>Diagnosed Android and iOS release issues, API edge cases, authentication failures, date handling, and production UI defects.</w:t>
-      </w:r>
-    </w:p>
-    <w:p>
-      <w:pPr>
-        <w:spacing w:before="60" w:after="40"/>
-      </w:pPr>
-      <w:r>
-        <w:rPr>
-          <w:rFonts w:ascii="Calibri" w:hAnsi="Calibri"/>
-          <w:b/>
-          <w:color w:val="000000"/>
-          <w:sz w:val="21"/>
-        </w:rPr>
-        <w:t>Full Stack Developer Trainee</w:t>
-      </w:r>
-      <w:r>
-        <w:rPr>
-          <w:rFonts w:ascii="Calibri" w:hAnsi="Calibri"/>
-          <w:b w:val="0"/>
-          <w:color w:val="2D2D2D"/>
-          <w:sz w:val="20"/>
-        </w:rPr>
-        <w:t xml:space="preserve">  |  </w:t>
-      </w:r>
-      <w:r>
-        <w:rPr>
-          <w:rFonts w:ascii="Calibri" w:hAnsi="Calibri"/>
-          <w:b w:val="0"/>
-          <w:color w:val="2D2D2D"/>
-          <w:sz w:val="19"/>
-        </w:rPr>
-        <w:t>Apr 2026 - Jul 2026 | 3 mos</w:t>
+        <w:t>Integrated Razorpay checkout and corrected payment status messaging so customers see a confirming state before success; improved cart responsiveness and authentication navigation.</w:t>
       </w:r>
     </w:p>
     <w:p>
       <w:pPr>
         <w:pStyle w:val="ListBullet"/>
-        <w:spacing w:after="40" w:line="269" w:lineRule="auto"/>
-        <w:ind w:left="288" w:hanging="288"/>
+        <w:ind w:left="202" w:hanging="202"/>
       </w:pPr>
       <w:r>
+        <w:t>Reduced My Orders API calls from six to two by reusing responses for lists and counts; added optional and mandatory app-update prompts and maintenance handling.</w:t>
+      </w:r>
+    </w:p>
+    <w:p>
+      <w:r>
         <w:rPr>
-          <w:rFonts w:ascii="Calibri" w:hAnsi="Calibri"/>
-          <w:b w:val="0"/>
-          <w:color w:val="000000"/>
-          <w:sz w:val="20"/>
+          <w:b/>
         </w:rPr>
-        <w:t>Integrated REST APIs for authentication, profiles, product catalogs, orders, checkout, payments, and delivery workflows in Flutter applications.</w:t>
+        <w:t>Ganvin Executive | Staff Pickup and Delivery App | Flutter, setState</w:t>
       </w:r>
     </w:p>
     <w:p>
       <w:pPr>
         <w:pStyle w:val="ListBullet"/>
-        <w:spacing w:after="40" w:line="269" w:lineRule="auto"/>
-        <w:ind w:left="288" w:hanging="288"/>
+        <w:ind w:left="202" w:hanging="202"/>
       </w:pPr>
       <w:r>
-        <w:rPr>
-          <w:rFonts w:ascii="Calibri" w:hAnsi="Calibri"/>
-          <w:b w:val="0"/>
-          <w:color w:val="000000"/>
-          <w:sz w:val="20"/>
-        </w:rPr>
-        <w:t>Built reusable responsive interfaces with pagination, location management, date filters, image handling, and backend-driven data.</w:t>
+        <w:t>Implemented independent pagination and API date filters across four pickup/delivery stages; integrated Google Maps and saved locations for staff navigation.</w:t>
       </w:r>
     </w:p>
     <w:p>
       <w:pPr>
-        <w:pStyle w:val="Heading1"/>
-        <w:spacing w:before="160" w:after="60"/>
+        <w:pStyle w:val="ListBullet"/>
+        <w:ind w:left="202" w:hanging="202"/>
       </w:pPr>
       <w:r>
-        <w:rPr>
-          <w:rFonts w:ascii="Calibri" w:hAnsi="Calibri"/>
-          <w:b/>
-          <w:color w:val="000000"/>
-          <w:sz w:val="22"/>
-        </w:rPr>
+        <w:t>Replaced six OTP fields with one validated input; fixed null-response OTP failures and endless loading on empty/error list responses, and kept Verify controls visible for long item names.</w:t>
+      </w:r>
+    </w:p>
+    <w:p>
+      <w:hyperlink r:id="rId15">
+        <w:r>
+          <w:rPr>
+            <w:color w:val="000000"/>
+            <w:sz w:val="20"/>
+            <w:rFonts w:ascii="Calibri" w:hAnsi="Calibri"/>
+          </w:rPr>
+          <w:t>Ganvin Executive case study</w:t>
+        </w:r>
+      </w:hyperlink>
+    </w:p>
+    <w:p>
+      <w:pPr>
+        <w:pStyle w:val="Heading1"/>
+      </w:pPr>
+      <w:r>
         <w:t>Education</w:t>
       </w:r>
     </w:p>
     <w:p>
-      <w:pPr>
-        <w:spacing w:before="60" w:after="40"/>
-      </w:pPr>
       <w:r>
         <w:rPr>
-          <w:rFonts w:ascii="Calibri" w:hAnsi="Calibri"/>
           <w:b/>
-          <w:color w:val="000000"/>
-          <w:sz w:val="21"/>
         </w:rPr>
-        <w:t>Bachelor of Computer Applications (BCA)</w:t>
-      </w:r>
-      <w:r>
-        <w:rPr>
-          <w:rFonts w:ascii="Calibri" w:hAnsi="Calibri"/>
-          <w:b w:val="0"/>
-          <w:color w:val="2D2D2D"/>
-          <w:sz w:val="20"/>
-        </w:rPr>
-        <w:t xml:space="preserve">  |  </w:t>
-      </w:r>
-      <w:r>
-        <w:rPr>
-          <w:rFonts w:ascii="Calibri" w:hAnsi="Calibri"/>
-          <w:b w:val="0"/>
-          <w:color w:val="2D2D2D"/>
-          <w:sz w:val="19"/>
-        </w:rPr>
-        <w:t>2023 - 2026</w:t>
+        <w:t>Bachelor of Computer Applications | 2023 - 2026</w:t>
       </w:r>
     </w:p>
     <w:p>
-      <w:pPr>
-        <w:spacing w:after="40" w:line="276" w:lineRule="auto"/>
-      </w:pPr>
       <w:r>
         <w:rPr>
-          <w:rFonts w:ascii="Calibri" w:hAnsi="Calibri"/>
           <w:b w:val="0"/>
-          <w:color w:val="000000"/>
-          <w:sz w:val="21"/>
         </w:rPr>
         <w:t>Priyadarshini Arts and Science College, Melmuri, Malappuram | University of Calicut</w:t>
       </w:r>
     </w:p>
-    <w:p>
-      <w:pPr>
-        <w:pStyle w:val="Heading1"/>
-        <w:spacing w:before="160" w:after="60"/>
-      </w:pPr>
-      <w:r>
-        <w:rPr>
-          <w:rFonts w:ascii="Calibri" w:hAnsi="Calibri"/>
-          <w:b/>
-          <w:color w:val="000000"/>
-          <w:sz w:val="22"/>
-        </w:rPr>
-        <w:t>Projects</w:t>
-      </w:r>
-    </w:p>
-    <w:p>
-      <w:pPr>
-        <w:spacing w:before="60" w:after="40"/>
-      </w:pPr>
-      <w:r>
-        <w:rPr>
-          <w:rFonts w:ascii="Calibri" w:hAnsi="Calibri"/>
-          <w:b/>
-          <w:color w:val="000000"/>
-          <w:sz w:val="21"/>
-        </w:rPr>
-        <w:t>EPOSMOB</w:t>
-      </w:r>
-      <w:r>
-        <w:rPr>
-          <w:rFonts w:ascii="Calibri" w:hAnsi="Calibri"/>
-          <w:b w:val="0"/>
-          <w:color w:val="2D2D2D"/>
-          <w:sz w:val="20"/>
-        </w:rPr>
-        <w:t xml:space="preserve">  |  </w:t>
-      </w:r>
-      <w:r>
-        <w:rPr>
-          <w:rFonts w:ascii="Calibri" w:hAnsi="Calibri"/>
-          <w:b w:val="0"/>
-          <w:color w:val="2D2D2D"/>
-          <w:sz w:val="19"/>
-        </w:rPr>
-        <w:t>Mobile POS and Inventory Management (Flutter)</w:t>
-      </w:r>
-    </w:p>
-    <w:p>
-      <w:pPr>
-        <w:spacing w:after="60" w:line="276" w:lineRule="auto"/>
-      </w:pPr>
-      <w:r>
-        <w:rPr>
-          <w:rFonts w:ascii="Calibri" w:hAnsi="Calibri"/>
-          <w:b w:val="0"/>
-          <w:color w:val="000000"/>
-          <w:sz w:val="21"/>
-        </w:rPr>
-        <w:t>Developed billing, inventory, purchase return, packing, shipping, reporting, bilingual printing, and ZATCA-supporting workflows with broad Arabic localization and RTL support.</w:t>
-      </w:r>
-    </w:p>
-    <w:p>
-      <w:pPr>
-        <w:spacing w:before="60" w:after="40"/>
-      </w:pPr>
-      <w:r>
-        <w:rPr>
-          <w:rFonts w:ascii="Calibri" w:hAnsi="Calibri"/>
-          <w:b/>
-          <w:color w:val="000000"/>
-          <w:sz w:val="21"/>
-        </w:rPr>
-        <w:t>Ganvin</w:t>
-      </w:r>
-      <w:r>
-        <w:rPr>
-          <w:rFonts w:ascii="Calibri" w:hAnsi="Calibri"/>
-          <w:b w:val="0"/>
-          <w:color w:val="2D2D2D"/>
-          <w:sz w:val="20"/>
-        </w:rPr>
-        <w:t xml:space="preserve">  |  </w:t>
-      </w:r>
-      <w:r>
-        <w:rPr>
-          <w:rFonts w:ascii="Calibri" w:hAnsi="Calibri"/>
-          <w:b w:val="0"/>
-          <w:color w:val="2D2D2D"/>
-          <w:sz w:val="19"/>
-        </w:rPr>
-        <w:t>Logistics and Delivery Applications (Flutter)</w:t>
-      </w:r>
-    </w:p>
-    <w:p>
-      <w:pPr>
-        <w:spacing w:after="60" w:line="276" w:lineRule="auto"/>
-      </w:pPr>
-      <w:r>
-        <w:rPr>
-          <w:rFonts w:ascii="Calibri" w:hAnsi="Calibri"/>
-          <w:b w:val="0"/>
-          <w:color w:val="000000"/>
-          <w:sz w:val="21"/>
-        </w:rPr>
-        <w:t>Built customer and delivery applications with Google Maps navigation, location management, Razorpay payments, notifications, pagination, in-app updates, and production issue fixes.</w:t>
-      </w:r>
-    </w:p>
-    <w:p>
-      <w:pPr>
-        <w:spacing w:before="60" w:after="40"/>
-      </w:pPr>
-      <w:r>
-        <w:rPr>
-          <w:rFonts w:ascii="Calibri" w:hAnsi="Calibri"/>
-          <w:b/>
-          <w:color w:val="000000"/>
-          <w:sz w:val="21"/>
-        </w:rPr>
-        <w:t>FUNZCART and Luzine Bakes</w:t>
-      </w:r>
-      <w:r>
-        <w:rPr>
-          <w:rFonts w:ascii="Calibri" w:hAnsi="Calibri"/>
-          <w:b w:val="0"/>
-          <w:color w:val="2D2D2D"/>
-          <w:sz w:val="20"/>
-        </w:rPr>
-        <w:t xml:space="preserve">  |  </w:t>
-      </w:r>
-      <w:r>
-        <w:rPr>
-          <w:rFonts w:ascii="Calibri" w:hAnsi="Calibri"/>
-          <w:b w:val="0"/>
-          <w:color w:val="2D2D2D"/>
-          <w:sz w:val="19"/>
-        </w:rPr>
-        <w:t>Mobile Commerce Features (Flutter and APIs)</w:t>
-      </w:r>
-    </w:p>
-    <w:p>
-      <w:pPr>
-        <w:spacing w:after="60" w:line="276" w:lineRule="auto"/>
-      </w:pPr>
-      <w:r>
-        <w:rPr>
-          <w:rFonts w:ascii="Calibri" w:hAnsi="Calibri"/>
-          <w:b w:val="0"/>
-          <w:color w:val="000000"/>
-          <w:sz w:val="21"/>
-        </w:rPr>
-        <w:t>Integrated authentication, profiles, product catalogs, carts, checkout, payments, order workflows, and responsive customer-facing interfaces.</w:t>
-      </w:r>
-    </w:p>
     <w:sectPr>
-      <w:pgSz w:w="12240" w:h="15840"/>
-      <w:pgMar w:top="864" w:right="1008" w:bottom="864" w:left="1008" w:header="720" w:footer="720" w:gutter="0"/>
+      <w:pgSz w:w="11909" w:h="16834"/>
+      <w:pgMar w:top="835" w:right="936" w:bottom="835" w:left="936" w:header="720" w:footer="720" w:gutter="0"/>
       <w:cols w:space="720"/>
       <w:docGrid w:linePitch="360"/>
     </w:sectPr>
@@ -1094,9 +712,13 @@
     <w:name w:val="Normal"/>
     <w:qFormat/>
     <w:rsid w:val="00FC693F"/>
+    <w:pPr>
+      <w:spacing w:after="60" w:line="252" w:lineRule="auto"/>
+    </w:pPr>
     <w:rPr>
       <w:rFonts w:ascii="Calibri" w:hAnsi="Calibri"/>
-      <w:sz w:val="20"/>
+      <w:color w:val="000000"/>
+      <w:sz w:val="21"/>
     </w:rPr>
   </w:style>
   <w:style w:type="paragraph" w:styleId="Header">
@@ -1154,15 +776,15 @@
     <w:pPr>
       <w:keepNext/>
       <w:keepLines/>
-      <w:spacing w:before="480" w:after="0"/>
+      <w:spacing w:before="180" w:after="60" w:line="252" w:lineRule="auto"/>
       <w:outlineLvl w:val="0"/>
     </w:pPr>
     <w:rPr>
-      <w:rFonts w:asciiTheme="majorHAnsi" w:eastAsiaTheme="majorEastAsia" w:hAnsiTheme="majorHAnsi" w:cstheme="majorBidi"/>
+      <w:rFonts w:asciiTheme="majorHAnsi" w:eastAsiaTheme="majorEastAsia" w:hAnsiTheme="majorHAnsi" w:cstheme="majorBidi" w:ascii="Calibri" w:hAnsi="Calibri"/>
       <w:b/>
       <w:bCs/>
-      <w:color w:val="365F91" w:themeColor="accent1" w:themeShade="BF"/>
-      <w:sz w:val="28"/>
+      <w:color w:val="000000"/>
+      <w:sz w:val="22"/>
       <w:szCs w:val="28"/>
     </w:rPr>
   </w:style>
@@ -1440,18 +1062,16 @@
     <w:qFormat/>
     <w:rsid w:val="00FC693F"/>
     <w:pPr>
-      <w:pBdr>
-        <w:bottom w:val="single" w:sz="8" w:space="4" w:color="4F81BD" w:themeColor="accent1"/>
-      </w:pBdr>
-      <w:spacing w:after="300" w:line="240" w:lineRule="auto"/>
+      <w:spacing w:after="60" w:line="252" w:lineRule="auto"/>
       <w:contextualSpacing/>
     </w:pPr>
     <w:rPr>
-      <w:rFonts w:asciiTheme="majorHAnsi" w:eastAsiaTheme="majorEastAsia" w:hAnsiTheme="majorHAnsi" w:cstheme="majorBidi"/>
-      <w:color w:val="17365D" w:themeColor="text2" w:themeShade="BF"/>
+      <w:rFonts w:asciiTheme="majorHAnsi" w:eastAsiaTheme="majorEastAsia" w:hAnsiTheme="majorHAnsi" w:cstheme="majorBidi" w:ascii="Calibri" w:hAnsi="Calibri"/>
+      <w:b/>
+      <w:color w:val="000000"/>
       <w:spacing w:val="5"/>
       <w:kern w:val="28"/>
-      <w:sz w:val="52"/>
+      <w:sz w:val="44"/>
       <w:szCs w:val="52"/>
     </w:rPr>
   </w:style>
@@ -1625,8 +1245,14 @@
       <w:numPr>
         <w:numId w:val="1"/>
       </w:numPr>
+      <w:spacing w:after="60" w:line="252" w:lineRule="auto"/>
       <w:contextualSpacing/>
     </w:pPr>
+    <w:rPr>
+      <w:rFonts w:ascii="Calibri" w:hAnsi="Calibri"/>
+      <w:color w:val="000000"/>
+      <w:sz w:val="21"/>
+    </w:rPr>
   </w:style>
   <w:style w:type="paragraph" w:styleId="ListBullet2">
     <w:name w:val="List Bullet 2"/>
@@ -1927,9 +1553,6 @@
     <w:qFormat/>
     <w:rsid w:val="00FC693F"/>
     <w:pPr>
-      <w:pBdr>
-        <w:bottom w:val="single" w:sz="4" w:space="4" w:color="4F81BD" w:themeColor="accent1"/>
-      </w:pBdr>
       <w:spacing w:before="200" w:after="280"/>
       <w:ind w:left="936" w:right="936"/>
     </w:pPr>

</xml_diff>

<commit_message>
Add verified React Native experience to Flutter resume
</commit_message>
<xml_diff>
--- a/public/muhammed-mubashir-k-resume-flutter.docx
+++ b/public/muhammed-mubashir-k-resume-flutter.docx
@@ -138,10 +138,10 @@
         <w:rPr>
           <w:b/>
         </w:rPr>
-        <w:t xml:space="preserve">Web Development: </w:t>
+        <w:t xml:space="preserve">Additional Technologies: </w:t>
       </w:r>
       <w:r>
-        <w:t>React, Next.js, JavaScript, TypeScript, Tailwind CSS</w:t>
+        <w:t>React Native, React, Next.js, JavaScript, TypeScript, Tailwind CSS</w:t>
       </w:r>
     </w:p>
     <w:p>
@@ -186,6 +186,15 @@
       </w:pPr>
       <w:r>
         <w:t>Delivered production Flutter features across POS and logistics applications; diagnosed API edge cases, authentication failures, and Android and iOS release issues.</w:t>
+      </w:r>
+    </w:p>
+    <w:p>
+      <w:pPr>
+        <w:pStyle w:val="ListBullet"/>
+        <w:ind w:left="202" w:hanging="202"/>
+      </w:pPr>
+      <w:r>
+        <w:t>Integrated LinkedIn sign-in in Connect App (React Native, Android), with PKCE, backend API integration, and deep-link callback handling.</w:t>
       </w:r>
     </w:p>
     <w:p>

</xml_diff>

<commit_message>
Refresh mobile portfolio content and professional sections
</commit_message>
<xml_diff>
--- a/public/muhammed-mubashir-k-resume-flutter.docx
+++ b/public/muhammed-mubashir-k-resume-flutter.docx
@@ -11,26 +11,30 @@
       </w:r>
     </w:p>
     <w:p>
+      <w:pPr>
+        <w:pStyle w:val="Subtitle"/>
+      </w:pPr>
       <w:r>
-        <w:rPr>
-          <w:b/>
-        </w:rPr>
-        <w:t>Flutter Developer | Mobile &amp; POS Applications</w:t>
+        <w:t>Flutter Developer</w:t>
       </w:r>
     </w:p>
     <w:p>
+      <w:pPr>
+        <w:keepNext w:val="0"/>
+        <w:spacing w:before="0" w:after="50"/>
+      </w:pPr>
       <w:r>
         <w:rPr>
           <w:b w:val="0"/>
         </w:rPr>
-        <w:t xml:space="preserve">Kerala, India | </w:t>
+        <w:t xml:space="preserve">Malappuram, Kerala, India | </w:t>
       </w:r>
       <w:hyperlink r:id="rId9">
         <w:r>
           <w:rPr>
+            <w:rFonts w:ascii="Calibri" w:hAnsi="Calibri"/>
             <w:color w:val="000000"/>
-            <w:sz w:val="20"/>
-            <w:rFonts w:ascii="Calibri" w:hAnsi="Calibri"/>
+            <w:sz w:val="21"/>
           </w:rPr>
           <w:t>+91 8089433955</w:t>
         </w:r>
@@ -41,21 +45,30 @@
       <w:hyperlink r:id="rId10">
         <w:r>
           <w:rPr>
+            <w:rFonts w:ascii="Calibri" w:hAnsi="Calibri"/>
             <w:color w:val="000000"/>
-            <w:sz w:val="20"/>
-            <w:rFonts w:ascii="Calibri" w:hAnsi="Calibri"/>
+            <w:sz w:val="21"/>
           </w:rPr>
           <w:t>muhammedmubashir720@gmail.com</w:t>
         </w:r>
       </w:hyperlink>
     </w:p>
     <w:p>
+      <w:pPr>
+        <w:keepNext w:val="0"/>
+        <w:spacing w:before="0" w:after="50"/>
+      </w:pPr>
+      <w:r>
+        <w:rPr>
+          <w:b w:val="0"/>
+        </w:rPr>
+      </w:r>
       <w:hyperlink r:id="rId11">
         <w:r>
           <w:rPr>
+            <w:rFonts w:ascii="Calibri" w:hAnsi="Calibri"/>
             <w:color w:val="000000"/>
-            <w:sz w:val="20"/>
-            <w:rFonts w:ascii="Calibri" w:hAnsi="Calibri"/>
+            <w:sz w:val="21"/>
           </w:rPr>
           <w:t>Portfolio</w:t>
         </w:r>
@@ -66,9 +79,9 @@
       <w:hyperlink r:id="rId12">
         <w:r>
           <w:rPr>
+            <w:rFonts w:ascii="Calibri" w:hAnsi="Calibri"/>
             <w:color w:val="000000"/>
-            <w:sz w:val="20"/>
-            <w:rFonts w:ascii="Calibri" w:hAnsi="Calibri"/>
+            <w:sz w:val="21"/>
           </w:rPr>
           <w:t>GitHub</w:t>
         </w:r>
@@ -79,9 +92,9 @@
       <w:hyperlink r:id="rId13">
         <w:r>
           <w:rPr>
+            <w:rFonts w:ascii="Calibri" w:hAnsi="Calibri"/>
             <w:color w:val="000000"/>
-            <w:sz w:val="20"/>
-            <w:rFonts w:ascii="Calibri" w:hAnsi="Calibri"/>
+            <w:sz w:val="21"/>
           </w:rPr>
           <w:t>LinkedIn</w:t>
         </w:r>
@@ -96,11 +109,15 @@
       </w:r>
     </w:p>
     <w:p>
+      <w:pPr>
+        <w:keepNext w:val="0"/>
+        <w:spacing w:before="0" w:after="50"/>
+      </w:pPr>
       <w:r>
         <w:rPr>
           <w:b w:val="0"/>
         </w:rPr>
-        <w:t>Flutter developer with production experience building POS, customer ordering, and delivery applications using Dart, Provider, and REST APIs. Delivered cash-management workflows, payment integrations, bilingual printing, and API optimizations, with regression tests for pricing and stock handling. Promoted to Junior Application Developer after three months at ENKE Consulting.</w:t>
+        <w:t>Flutter developer with company experience building and maintaining POS, customer ordering, and delivery applications using Dart, Provider, and REST APIs. Contributions include cash management, bilingual printing, payments, reporting, and regression tests. Additional React Native experience covers Android and iOS authentication and deep linking.</w:t>
       </w:r>
     </w:p>
     <w:p>
@@ -112,17 +129,35 @@
       </w:r>
     </w:p>
     <w:p>
+      <w:pPr>
+        <w:keepNext w:val="0"/>
+        <w:spacing w:before="0" w:after="50"/>
+      </w:pPr>
+      <w:r>
+        <w:rPr>
+          <w:b w:val="0"/>
+        </w:rPr>
+      </w:r>
       <w:r>
         <w:rPr>
           <w:b/>
         </w:rPr>
-        <w:t xml:space="preserve">Flutter and Dart: </w:t>
+        <w:t xml:space="preserve">Mobile: </w:t>
       </w:r>
       <w:r>
-        <w:t>Provider, ChangeNotifier, setState, reusable widgets, responsive layouts</w:t>
+        <w:t>Flutter, Dart, Provider, ChangeNotifier, setState, React Native, responsive UI</w:t>
       </w:r>
     </w:p>
     <w:p>
+      <w:pPr>
+        <w:keepNext w:val="0"/>
+        <w:spacing w:before="0" w:after="50"/>
+      </w:pPr>
+      <w:r>
+        <w:rPr>
+          <w:b w:val="0"/>
+        </w:rPr>
+      </w:r>
       <w:r>
         <w:rPr>
           <w:b/>
@@ -130,29 +165,47 @@
         <w:t xml:space="preserve">Integrations: </w:t>
       </w:r>
       <w:r>
-        <w:t>REST APIs, JSON, Razorpay, Stripe, Google Maps, push notifications, receipt printing, RTL</w:t>
+        <w:t>REST APIs, JSON, Razorpay, Google Maps, PDF and USB receipt printing, Arabic and RTL</w:t>
       </w:r>
     </w:p>
     <w:p>
+      <w:pPr>
+        <w:keepNext w:val="0"/>
+        <w:spacing w:before="0" w:after="50"/>
+      </w:pPr>
+      <w:r>
+        <w:rPr>
+          <w:b w:val="0"/>
+        </w:rPr>
+      </w:r>
       <w:r>
         <w:rPr>
           <w:b/>
         </w:rPr>
-        <w:t xml:space="preserve">Additional Technologies: </w:t>
+        <w:t xml:space="preserve">Engineering: </w:t>
       </w:r>
       <w:r>
-        <w:t>React Native, React, Next.js, JavaScript, TypeScript, Tailwind CSS</w:t>
+        <w:t>Git, GitHub, Postman, unit and widget tests, pagination, API error handling</w:t>
       </w:r>
     </w:p>
     <w:p>
+      <w:pPr>
+        <w:keepNext w:val="0"/>
+        <w:spacing w:before="0" w:after="50"/>
+      </w:pPr>
+      <w:r>
+        <w:rPr>
+          <w:b w:val="0"/>
+        </w:rPr>
+      </w:r>
       <w:r>
         <w:rPr>
           <w:b/>
         </w:rPr>
-        <w:t xml:space="preserve">Engineering Tools: </w:t>
+        <w:t xml:space="preserve">Supporting web: </w:t>
       </w:r>
       <w:r>
-        <w:t>Git, GitHub, Postman, VS Code, SQLite, SharedPreferences</w:t>
+        <w:t>React, Next.js, JavaScript, TypeScript, Tailwind CSS, Stripe, ISR, i18n</w:t>
       </w:r>
     </w:p>
     <w:p>
@@ -164,6 +217,10 @@
       </w:r>
     </w:p>
     <w:p>
+      <w:pPr>
+        <w:keepNext/>
+        <w:spacing w:before="0" w:after="50"/>
+      </w:pPr>
       <w:r>
         <w:rPr>
           <w:b/>
@@ -172,46 +229,40 @@
       </w:r>
     </w:p>
     <w:p>
+      <w:pPr>
+        <w:keepNext/>
+        <w:spacing w:before="0" w:after="50"/>
+      </w:pPr>
       <w:r>
         <w:rPr>
           <w:b/>
         </w:rPr>
-        <w:t>Junior Application Developer | Jul 2026 - Present</w:t>
+        <w:t>Junior Full Stack Developer | Jul 2026 - Present</w:t>
       </w:r>
     </w:p>
     <w:p>
       <w:pPr>
-        <w:pStyle w:val="ListBullet"/>
-        <w:ind w:left="202" w:hanging="202"/>
+        <w:keepNext/>
+        <w:spacing w:before="0" w:after="50"/>
       </w:pPr>
       <w:r>
-        <w:t>Delivered production Flutter features across POS and logistics applications; diagnosed API edge cases, authentication failures, and Android and iOS release issues.</w:t>
-      </w:r>
-    </w:p>
-    <w:p>
-      <w:pPr>
-        <w:pStyle w:val="ListBullet"/>
-        <w:ind w:left="202" w:hanging="202"/>
-      </w:pPr>
-      <w:r>
-        <w:t>Integrated LinkedIn sign-in in Connect App (React Native, Android), with PKCE, backend API integration, and deep-link callback handling.</w:t>
-      </w:r>
-    </w:p>
-    <w:p>
-      <w:r>
         <w:rPr>
-          <w:b/>
+          <w:b w:val="0"/>
         </w:rPr>
         <w:t>Full Stack Developer Trainee | Apr 2026 - Jul 2026</w:t>
       </w:r>
     </w:p>
     <w:p>
       <w:pPr>
-        <w:pStyle w:val="ListBullet"/>
-        <w:ind w:left="202" w:hanging="202"/>
+        <w:keepNext w:val="0"/>
+        <w:spacing w:before="0" w:after="60"/>
+        <w:ind w:left="187" w:hanging="187"/>
       </w:pPr>
       <w:r>
-        <w:t>Integrated REST APIs and built reusable Flutter interfaces; contributed React and Next.js commerce features and collaborated with backend developers on API issues.</w:t>
+        <w:rPr>
+          <w:b w:val="0"/>
+        </w:rPr>
+        <w:t>• Contribute features and fixes across company mobile and web applications; collaborate with backend developers on API contracts and review changes through Git pull requests.</w:t>
       </w:r>
     </w:p>
     <w:p>
@@ -219,110 +270,209 @@
         <w:pStyle w:val="Heading1"/>
       </w:pPr>
       <w:r>
-        <w:t>Selected Projects</w:t>
+        <w:t>Selected Company Projects</w:t>
       </w:r>
     </w:p>
     <w:p>
+      <w:pPr>
+        <w:keepNext/>
+        <w:spacing w:before="70" w:after="40"/>
+      </w:pPr>
+      <w:r>
+        <w:rPr>
+          <w:b w:val="0"/>
+        </w:rPr>
+      </w:r>
+      <w:hyperlink r:id="rId14">
+        <w:r>
+          <w:rPr>
+            <w:rFonts w:ascii="Calibri" w:hAnsi="Calibri"/>
+            <w:color w:val="000000"/>
+            <w:sz w:val="21"/>
+            <w:b/>
+          </w:rPr>
+          <w:t>EPOSMOB</w:t>
+        </w:r>
+      </w:hyperlink>
+      <w:r>
+        <w:t xml:space="preserve"> | Retail POS and Inventory | Flutter, Provider</w:t>
+      </w:r>
+    </w:p>
+    <w:p>
+      <w:pPr>
+        <w:keepNext w:val="0"/>
+        <w:spacing w:before="0" w:after="60"/>
+        <w:ind w:left="187" w:hanging="187"/>
+      </w:pPr>
+      <w:r>
+        <w:rPr>
+          <w:b w:val="0"/>
+        </w:rPr>
+        <w:t>• Built shift opening and Day Close workflows with cash-denomination calculations and pending-close alerts; implemented purchase-return, packing, and shipping workflows.</w:t>
+      </w:r>
+    </w:p>
+    <w:p>
+      <w:pPr>
+        <w:keepNext w:val="0"/>
+        <w:spacing w:before="0" w:after="60"/>
+        <w:ind w:left="187" w:hanging="187"/>
+      </w:pPr>
+      <w:r>
+        <w:rPr>
+          <w:b w:val="0"/>
+        </w:rPr>
+        <w:t>• Developed responsive reporting and transaction listings with shared filters and Excel exports that fetch all matching pages and reject duplicate or incomplete results.</w:t>
+      </w:r>
+    </w:p>
+    <w:p>
+      <w:pPr>
+        <w:keepNext w:val="0"/>
+        <w:spacing w:before="0" w:after="60"/>
+        <w:ind w:left="187" w:hanging="187"/>
+      </w:pPr>
+      <w:r>
+        <w:rPr>
+          <w:b w:val="0"/>
+        </w:rPr>
+        <w:t>• Fixed English/Arabic invoice rendering, USB printing, barcode pricing, and variant stock isolation; guarded invoice loading against stale responses and added regression tests.</w:t>
+      </w:r>
+    </w:p>
+    <w:p>
+      <w:pPr>
+        <w:keepNext/>
+        <w:spacing w:before="70" w:after="40"/>
+      </w:pPr>
+      <w:r>
+        <w:rPr>
+          <w:b w:val="0"/>
+        </w:rPr>
+      </w:r>
       <w:r>
         <w:rPr>
           <w:b/>
         </w:rPr>
-        <w:t>EPOSMOB | Retail POS and Inventory | Flutter, Provider</w:t>
+        <w:t>Ganvin Customer</w:t>
+      </w:r>
+      <w:r>
+        <w:t xml:space="preserve"> | Laundry Ordering and Tracking | Flutter, Provider</w:t>
       </w:r>
     </w:p>
     <w:p>
       <w:pPr>
-        <w:pStyle w:val="ListBullet"/>
-        <w:ind w:left="202" w:hanging="202"/>
+        <w:keepNext w:val="0"/>
+        <w:spacing w:before="0" w:after="60"/>
+        <w:ind w:left="187" w:hanging="187"/>
       </w:pPr>
       <w:r>
-        <w:t>Built shift-opening and Day Close workflows with cash-denomination calculations and pending-close alerts; implemented purchase-return screens using Provider and REST APIs.</w:t>
+        <w:rPr>
+          <w:b w:val="0"/>
+        </w:rPr>
+        <w:t>• Integrated Razorpay checkout and corrected payment-confirmation messaging; reduced My Orders API requests from six to two by reusing responses for lists and counts.</w:t>
       </w:r>
     </w:p>
     <w:p>
       <w:pPr>
-        <w:pStyle w:val="ListBullet"/>
-        <w:ind w:left="202" w:hanging="202"/>
+        <w:keepNext w:val="0"/>
+        <w:spacing w:before="0" w:after="60"/>
+        <w:ind w:left="187" w:hanging="187"/>
       </w:pPr>
       <w:r>
-        <w:t>Fixed English/Arabic invoice rendering and USB printing; corrected barcode pricing and variant-specific stock selection, adding regression tests for pricing fallbacks and stock isolation.</w:t>
+        <w:rPr>
+          <w:b w:val="0"/>
+        </w:rPr>
+        <w:t>• Added optional and mandatory update prompts and maintenance handling; improved cart responsiveness, authentication navigation, and saved-address management.</w:t>
       </w:r>
     </w:p>
     <w:p>
-      <w:hyperlink r:id="rId14">
+      <w:pPr>
+        <w:keepNext/>
+        <w:spacing w:before="70" w:after="40"/>
+      </w:pPr>
+      <w:r>
+        <w:rPr>
+          <w:b w:val="0"/>
+        </w:rPr>
+      </w:r>
+      <w:hyperlink r:id="rId15">
         <w:r>
           <w:rPr>
+            <w:rFonts w:ascii="Calibri" w:hAnsi="Calibri"/>
             <w:color w:val="000000"/>
-            <w:sz w:val="20"/>
-            <w:rFonts w:ascii="Calibri" w:hAnsi="Calibri"/>
+            <w:sz w:val="21"/>
+            <w:b/>
           </w:rPr>
-          <w:t>EPOSMOB case study</w:t>
+          <w:t>Ganvin Executive</w:t>
         </w:r>
       </w:hyperlink>
+      <w:r>
+        <w:t xml:space="preserve"> | Staff Pickup and Delivery | Flutter, setState</w:t>
+      </w:r>
     </w:p>
     <w:p>
+      <w:pPr>
+        <w:keepNext w:val="0"/>
+        <w:spacing w:before="0" w:after="60"/>
+        <w:ind w:left="187" w:hanging="187"/>
+      </w:pPr>
+      <w:r>
+        <w:rPr>
+          <w:b w:val="0"/>
+        </w:rPr>
+        <w:t>• Implemented independent pagination and date filters across four delivery stages, Google Maps navigation, and saved locations; improved six-digit OTP entry and empty/error loading states.</w:t>
+      </w:r>
+    </w:p>
+    <w:p>
+      <w:pPr>
+        <w:keepNext/>
+        <w:spacing w:before="70" w:after="40"/>
+      </w:pPr>
+      <w:r>
+        <w:rPr>
+          <w:b w:val="0"/>
+        </w:rPr>
+      </w:r>
       <w:r>
         <w:rPr>
           <w:b/>
         </w:rPr>
-        <w:t>Ganvin Customer | Delivery Booking and Tracking | Flutter, Provider</w:t>
+        <w:t>Connect App</w:t>
+      </w:r>
+      <w:r>
+        <w:t xml:space="preserve"> | Business Networking | React Native, TypeScript</w:t>
       </w:r>
     </w:p>
     <w:p>
       <w:pPr>
-        <w:pStyle w:val="ListBullet"/>
-        <w:ind w:left="202" w:hanging="202"/>
+        <w:keepNext w:val="0"/>
+        <w:spacing w:before="0" w:after="60"/>
+        <w:ind w:left="187" w:hanging="187"/>
       </w:pPr>
       <w:r>
-        <w:t>Integrated Razorpay checkout and corrected payment status messaging so customers see a confirming state before success; improved cart responsiveness and authentication navigation.</w:t>
+        <w:rPr>
+          <w:b w:val="0"/>
+        </w:rPr>
+        <w:t>• Implemented LinkedIn login on Android and iOS using PKCE and native authentication modules; resolved deferred deep-link startup and navigation issues.</w:t>
       </w:r>
     </w:p>
     <w:p>
       <w:pPr>
-        <w:pStyle w:val="ListBullet"/>
-        <w:ind w:left="202" w:hanging="202"/>
+        <w:pStyle w:val="Heading1"/>
       </w:pPr>
       <w:r>
-        <w:t>Reduced My Orders API calls from six to two by reusing responses for lists and counts; added optional and mandatory app-update prompts and maintenance handling.</w:t>
-      </w:r>
-    </w:p>
-    <w:p>
-      <w:r>
-        <w:rPr>
-          <w:b/>
-        </w:rPr>
-        <w:t>Ganvin Executive | Staff Pickup and Delivery App | Flutter, setState</w:t>
+        <w:t>Supporting Web Experience</w:t>
       </w:r>
     </w:p>
     <w:p>
       <w:pPr>
-        <w:pStyle w:val="ListBullet"/>
-        <w:ind w:left="202" w:hanging="202"/>
+        <w:keepNext w:val="0"/>
+        <w:spacing w:before="0" w:after="50"/>
       </w:pPr>
       <w:r>
-        <w:t>Implemented independent pagination and API date filters across four pickup/delivery stages; integrated Google Maps and saved locations for staff navigation.</w:t>
+        <w:rPr>
+          <w:b w:val="0"/>
+        </w:rPr>
+        <w:t>CloudPOS and Juice World: contributed Next.js storefront themes, tenant-aware Stripe checkout, Razorpay integration, English/Arabic localization, ISR, and SEO metadata.</w:t>
       </w:r>
-    </w:p>
-    <w:p>
-      <w:pPr>
-        <w:pStyle w:val="ListBullet"/>
-        <w:ind w:left="202" w:hanging="202"/>
-      </w:pPr>
-      <w:r>
-        <w:t>Replaced six OTP fields with one validated input; fixed null-response OTP failures and endless loading on empty/error list responses, and kept Verify controls visible for long item names.</w:t>
-      </w:r>
-    </w:p>
-    <w:p>
-      <w:hyperlink r:id="rId15">
-        <w:r>
-          <w:rPr>
-            <w:color w:val="000000"/>
-            <w:sz w:val="20"/>
-            <w:rFonts w:ascii="Calibri" w:hAnsi="Calibri"/>
-          </w:rPr>
-          <w:t>Ganvin Executive case study</w:t>
-        </w:r>
-      </w:hyperlink>
     </w:p>
     <w:p>
       <w:pPr>
@@ -333,6 +483,10 @@
       </w:r>
     </w:p>
     <w:p>
+      <w:pPr>
+        <w:keepNext/>
+        <w:spacing w:before="0" w:after="50"/>
+      </w:pPr>
       <w:r>
         <w:rPr>
           <w:b/>
@@ -341,6 +495,10 @@
       </w:r>
     </w:p>
     <w:p>
+      <w:pPr>
+        <w:keepNext w:val="0"/>
+        <w:spacing w:before="0" w:after="0"/>
+      </w:pPr>
       <w:r>
         <w:rPr>
           <w:b w:val="0"/>
@@ -350,7 +508,7 @@
     </w:p>
     <w:sectPr>
       <w:pgSz w:w="11909" w:h="16834"/>
-      <w:pgMar w:top="835" w:right="936" w:bottom="835" w:left="936" w:header="720" w:footer="720" w:gutter="0"/>
+      <w:pgMar w:top="763" w:right="893" w:bottom="763" w:left="893" w:header="720" w:footer="720" w:gutter="0"/>
       <w:cols w:space="720"/>
       <w:docGrid w:linePitch="360"/>
     </w:sectPr>
@@ -722,7 +880,8 @@
     <w:qFormat/>
     <w:rsid w:val="00FC693F"/>
     <w:pPr>
-      <w:spacing w:after="60" w:line="252" w:lineRule="auto"/>
+      <w:widowControl/>
+      <w:spacing w:before="0" w:after="50" w:line="247" w:lineRule="auto"/>
     </w:pPr>
     <w:rPr>
       <w:rFonts w:ascii="Calibri" w:hAnsi="Calibri"/>
@@ -785,7 +944,8 @@
     <w:pPr>
       <w:keepNext/>
       <w:keepLines/>
-      <w:spacing w:before="180" w:after="60" w:line="252" w:lineRule="auto"/>
+      <w:widowControl/>
+      <w:spacing w:before="140" w:after="60" w:line="247" w:lineRule="auto"/>
       <w:outlineLvl w:val="0"/>
     </w:pPr>
     <w:rPr>
@@ -816,7 +976,7 @@
       <w:rFonts w:asciiTheme="majorHAnsi" w:eastAsiaTheme="majorEastAsia" w:hAnsiTheme="majorHAnsi" w:cstheme="majorBidi"/>
       <w:b/>
       <w:bCs/>
-      <w:color w:val="4F81BD" w:themeColor="accent1"/>
+      <w:color w:val="000000"/>
       <w:sz w:val="26"/>
       <w:szCs w:val="26"/>
     </w:rPr>
@@ -840,7 +1000,7 @@
       <w:rFonts w:asciiTheme="majorHAnsi" w:eastAsiaTheme="majorEastAsia" w:hAnsiTheme="majorHAnsi" w:cstheme="majorBidi"/>
       <w:b/>
       <w:bCs/>
-      <w:color w:val="4F81BD" w:themeColor="accent1"/>
+      <w:color w:val="000000"/>
     </w:rPr>
   </w:style>
   <w:style w:type="paragraph" w:styleId="Heading4">
@@ -865,7 +1025,7 @@
       <w:bCs/>
       <w:i/>
       <w:iCs/>
-      <w:color w:val="4F81BD" w:themeColor="accent1"/>
+      <w:color w:val="000000"/>
     </w:rPr>
   </w:style>
   <w:style w:type="paragraph" w:styleId="Heading5">
@@ -886,7 +1046,7 @@
     </w:pPr>
     <w:rPr>
       <w:rFonts w:asciiTheme="majorHAnsi" w:eastAsiaTheme="majorEastAsia" w:hAnsiTheme="majorHAnsi" w:cstheme="majorBidi"/>
-      <w:color w:val="243F60" w:themeColor="accent1" w:themeShade="7F"/>
+      <w:color w:val="000000"/>
     </w:rPr>
   </w:style>
   <w:style w:type="paragraph" w:styleId="Heading6">
@@ -909,7 +1069,7 @@
       <w:rFonts w:asciiTheme="majorHAnsi" w:eastAsiaTheme="majorEastAsia" w:hAnsiTheme="majorHAnsi" w:cstheme="majorBidi"/>
       <w:i/>
       <w:iCs/>
-      <w:color w:val="243F60" w:themeColor="accent1" w:themeShade="7F"/>
+      <w:color w:val="000000"/>
     </w:rPr>
   </w:style>
   <w:style w:type="paragraph" w:styleId="Heading7">
@@ -932,7 +1092,7 @@
       <w:rFonts w:asciiTheme="majorHAnsi" w:eastAsiaTheme="majorEastAsia" w:hAnsiTheme="majorHAnsi" w:cstheme="majorBidi"/>
       <w:i/>
       <w:iCs/>
-      <w:color w:val="404040" w:themeColor="text1" w:themeTint="BF"/>
+      <w:color w:val="000000"/>
     </w:rPr>
   </w:style>
   <w:style w:type="paragraph" w:styleId="Heading8">
@@ -953,7 +1113,7 @@
     </w:pPr>
     <w:rPr>
       <w:rFonts w:asciiTheme="majorHAnsi" w:eastAsiaTheme="majorEastAsia" w:hAnsiTheme="majorHAnsi" w:cstheme="majorBidi"/>
-      <w:color w:val="4F81BD" w:themeColor="accent1"/>
+      <w:color w:val="000000"/>
       <w:sz w:val="20"/>
       <w:szCs w:val="20"/>
     </w:rPr>
@@ -978,7 +1138,7 @@
       <w:rFonts w:asciiTheme="majorHAnsi" w:eastAsiaTheme="majorEastAsia" w:hAnsiTheme="majorHAnsi" w:cstheme="majorBidi"/>
       <w:i/>
       <w:iCs/>
-      <w:color w:val="404040" w:themeColor="text1" w:themeTint="BF"/>
+      <w:color w:val="000000"/>
       <w:sz w:val="20"/>
       <w:szCs w:val="20"/>
     </w:rPr>
@@ -1029,7 +1189,7 @@
       <w:rFonts w:asciiTheme="majorHAnsi" w:eastAsiaTheme="majorEastAsia" w:hAnsiTheme="majorHAnsi" w:cstheme="majorBidi"/>
       <w:b/>
       <w:bCs/>
-      <w:color w:val="365F91" w:themeColor="accent1" w:themeShade="BF"/>
+      <w:color w:val="000000"/>
       <w:sz w:val="28"/>
       <w:szCs w:val="28"/>
     </w:rPr>
@@ -1044,7 +1204,7 @@
       <w:rFonts w:asciiTheme="majorHAnsi" w:eastAsiaTheme="majorEastAsia" w:hAnsiTheme="majorHAnsi" w:cstheme="majorBidi"/>
       <w:b/>
       <w:bCs/>
-      <w:color w:val="4F81BD" w:themeColor="accent1"/>
+      <w:color w:val="000000"/>
       <w:sz w:val="26"/>
       <w:szCs w:val="26"/>
     </w:rPr>
@@ -1059,7 +1219,7 @@
       <w:rFonts w:asciiTheme="majorHAnsi" w:eastAsiaTheme="majorEastAsia" w:hAnsiTheme="majorHAnsi" w:cstheme="majorBidi"/>
       <w:b/>
       <w:bCs/>
-      <w:color w:val="4F81BD" w:themeColor="accent1"/>
+      <w:color w:val="000000"/>
     </w:rPr>
   </w:style>
   <w:style w:type="paragraph" w:styleId="Title">
@@ -1071,7 +1231,8 @@
     <w:qFormat/>
     <w:rsid w:val="00FC693F"/>
     <w:pPr>
-      <w:spacing w:after="60" w:line="252" w:lineRule="auto"/>
+      <w:widowControl/>
+      <w:spacing w:after="40" w:line="247" w:lineRule="auto" w:before="0"/>
       <w:contextualSpacing/>
     </w:pPr>
     <w:rPr>
@@ -1080,7 +1241,7 @@
       <w:color w:val="000000"/>
       <w:spacing w:val="5"/>
       <w:kern w:val="28"/>
-      <w:sz w:val="44"/>
+      <w:sz w:val="42"/>
       <w:szCs w:val="52"/>
     </w:rPr>
   </w:style>
@@ -1092,7 +1253,7 @@
     <w:rsid w:val="00FC693F"/>
     <w:rPr>
       <w:rFonts w:asciiTheme="majorHAnsi" w:eastAsiaTheme="majorEastAsia" w:hAnsiTheme="majorHAnsi" w:cstheme="majorBidi"/>
-      <w:color w:val="17365D" w:themeColor="text2" w:themeShade="BF"/>
+      <w:color w:val="000000"/>
       <w:spacing w:val="5"/>
       <w:kern w:val="28"/>
       <w:sz w:val="52"/>
@@ -1108,15 +1269,18 @@
     <w:qFormat/>
     <w:rsid w:val="00FC693F"/>
     <w:pPr>
+      <w:widowControl/>
       <w:numPr>
         <w:ilvl w:val="1"/>
       </w:numPr>
+      <w:spacing w:before="0" w:after="80" w:line="247" w:lineRule="auto"/>
     </w:pPr>
     <w:rPr>
-      <w:rFonts w:asciiTheme="majorHAnsi" w:eastAsiaTheme="majorEastAsia" w:hAnsiTheme="majorHAnsi" w:cstheme="majorBidi"/>
+      <w:rFonts w:asciiTheme="majorHAnsi" w:eastAsiaTheme="majorEastAsia" w:hAnsiTheme="majorHAnsi" w:cstheme="majorBidi" w:ascii="Calibri" w:hAnsi="Calibri"/>
+      <w:b/>
       <w:i/>
       <w:iCs/>
-      <w:color w:val="4F81BD" w:themeColor="accent1"/>
+      <w:color w:val="000000"/>
       <w:spacing w:val="15"/>
       <w:sz w:val="24"/>
       <w:szCs w:val="24"/>
@@ -1132,7 +1296,7 @@
       <w:rFonts w:asciiTheme="majorHAnsi" w:eastAsiaTheme="majorEastAsia" w:hAnsiTheme="majorHAnsi" w:cstheme="majorBidi"/>
       <w:i/>
       <w:iCs/>
-      <w:color w:val="4F81BD" w:themeColor="accent1"/>
+      <w:color w:val="000000"/>
       <w:spacing w:val="15"/>
       <w:sz w:val="24"/>
       <w:szCs w:val="24"/>
@@ -1254,14 +1418,8 @@
       <w:numPr>
         <w:numId w:val="1"/>
       </w:numPr>
-      <w:spacing w:after="60" w:line="252" w:lineRule="auto"/>
       <w:contextualSpacing/>
     </w:pPr>
-    <w:rPr>
-      <w:rFonts w:ascii="Calibri" w:hAnsi="Calibri"/>
-      <w:color w:val="000000"/>
-      <w:sz w:val="21"/>
-    </w:rPr>
   </w:style>
   <w:style w:type="paragraph" w:styleId="ListBullet2">
     <w:name w:val="List Bullet 2"/>
@@ -1410,7 +1568,7 @@
     <w:rPr>
       <w:i/>
       <w:iCs/>
-      <w:color w:val="000000" w:themeColor="text1"/>
+      <w:color w:val="000000"/>
     </w:rPr>
   </w:style>
   <w:style w:type="character" w:customStyle="1" w:styleId="QuoteChar">
@@ -1422,7 +1580,7 @@
     <w:rPr>
       <w:i/>
       <w:iCs/>
-      <w:color w:val="000000" w:themeColor="text1"/>
+      <w:color w:val="000000"/>
     </w:rPr>
   </w:style>
   <w:style w:type="character" w:customStyle="1" w:styleId="Heading4Char">
@@ -1438,7 +1596,7 @@
       <w:bCs/>
       <w:i/>
       <w:iCs/>
-      <w:color w:val="4F81BD" w:themeColor="accent1"/>
+      <w:color w:val="000000"/>
     </w:rPr>
   </w:style>
   <w:style w:type="character" w:customStyle="1" w:styleId="Heading5Char">
@@ -1450,7 +1608,7 @@
     <w:rsid w:val="00FC693F"/>
     <w:rPr>
       <w:rFonts w:asciiTheme="majorHAnsi" w:eastAsiaTheme="majorEastAsia" w:hAnsiTheme="majorHAnsi" w:cstheme="majorBidi"/>
-      <w:color w:val="243F60" w:themeColor="accent1" w:themeShade="7F"/>
+      <w:color w:val="000000"/>
     </w:rPr>
   </w:style>
   <w:style w:type="character" w:customStyle="1" w:styleId="Heading6Char">
@@ -1464,7 +1622,7 @@
       <w:rFonts w:asciiTheme="majorHAnsi" w:eastAsiaTheme="majorEastAsia" w:hAnsiTheme="majorHAnsi" w:cstheme="majorBidi"/>
       <w:i/>
       <w:iCs/>
-      <w:color w:val="243F60" w:themeColor="accent1" w:themeShade="7F"/>
+      <w:color w:val="000000"/>
     </w:rPr>
   </w:style>
   <w:style w:type="character" w:customStyle="1" w:styleId="Heading7Char">
@@ -1478,7 +1636,7 @@
       <w:rFonts w:asciiTheme="majorHAnsi" w:eastAsiaTheme="majorEastAsia" w:hAnsiTheme="majorHAnsi" w:cstheme="majorBidi"/>
       <w:i/>
       <w:iCs/>
-      <w:color w:val="404040" w:themeColor="text1" w:themeTint="BF"/>
+      <w:color w:val="000000"/>
     </w:rPr>
   </w:style>
   <w:style w:type="character" w:customStyle="1" w:styleId="Heading8Char">
@@ -1490,7 +1648,7 @@
     <w:rsid w:val="00FC693F"/>
     <w:rPr>
       <w:rFonts w:asciiTheme="majorHAnsi" w:eastAsiaTheme="majorEastAsia" w:hAnsiTheme="majorHAnsi" w:cstheme="majorBidi"/>
-      <w:color w:val="4F81BD" w:themeColor="accent1"/>
+      <w:color w:val="000000"/>
       <w:sz w:val="20"/>
       <w:szCs w:val="20"/>
     </w:rPr>
@@ -1506,7 +1664,7 @@
       <w:rFonts w:asciiTheme="majorHAnsi" w:eastAsiaTheme="majorEastAsia" w:hAnsiTheme="majorHAnsi" w:cstheme="majorBidi"/>
       <w:i/>
       <w:iCs/>
-      <w:color w:val="404040" w:themeColor="text1" w:themeTint="BF"/>
+      <w:color w:val="000000"/>
       <w:sz w:val="20"/>
       <w:szCs w:val="20"/>
     </w:rPr>
@@ -1526,7 +1684,7 @@
     <w:rPr>
       <w:b/>
       <w:bCs/>
-      <w:color w:val="4F81BD" w:themeColor="accent1"/>
+      <w:color w:val="000000"/>
       <w:sz w:val="18"/>
       <w:szCs w:val="18"/>
     </w:rPr>
@@ -1570,7 +1728,7 @@
       <w:bCs/>
       <w:i/>
       <w:iCs/>
-      <w:color w:val="4F81BD" w:themeColor="accent1"/>
+      <w:color w:val="000000"/>
     </w:rPr>
   </w:style>
   <w:style w:type="character" w:customStyle="1" w:styleId="IntenseQuoteChar">
@@ -1584,7 +1742,7 @@
       <w:bCs/>
       <w:i/>
       <w:iCs/>
-      <w:color w:val="4F81BD" w:themeColor="accent1"/>
+      <w:color w:val="000000"/>
     </w:rPr>
   </w:style>
   <w:style w:type="character" w:styleId="SubtleEmphasis">
@@ -1596,7 +1754,7 @@
     <w:rPr>
       <w:i/>
       <w:iCs/>
-      <w:color w:val="808080" w:themeColor="text1" w:themeTint="7F"/>
+      <w:color w:val="000000"/>
     </w:rPr>
   </w:style>
   <w:style w:type="character" w:styleId="IntenseEmphasis">
@@ -1610,7 +1768,7 @@
       <w:bCs/>
       <w:i/>
       <w:iCs/>
-      <w:color w:val="4F81BD" w:themeColor="accent1"/>
+      <w:color w:val="000000"/>
     </w:rPr>
   </w:style>
   <w:style w:type="character" w:styleId="SubtleReference">
@@ -1621,7 +1779,7 @@
     <w:rsid w:val="00FC693F"/>
     <w:rPr>
       <w:smallCaps/>
-      <w:color w:val="C0504D" w:themeColor="accent2"/>
+      <w:color w:val="000000"/>
       <w:u w:val="single"/>
     </w:rPr>
   </w:style>
@@ -1635,7 +1793,7 @@
       <w:b/>
       <w:bCs/>
       <w:smallCaps/>
-      <w:color w:val="C0504D" w:themeColor="accent2"/>
+      <w:color w:val="000000"/>
       <w:spacing w:val="5"/>
       <w:u w:val="single"/>
     </w:rPr>
@@ -1701,7 +1859,7 @@
       <w:spacing w:after="0" w:line="240" w:lineRule="auto"/>
     </w:pPr>
     <w:rPr>
-      <w:color w:val="000000" w:themeColor="text1" w:themeShade="BF"/>
+      <w:color w:val="000000"/>
     </w:rPr>
     <w:tblPr>
       <w:tblStyleRowBandSize w:val="1"/>
@@ -1804,7 +1962,7 @@
       <w:spacing w:after="0" w:line="240" w:lineRule="auto"/>
     </w:pPr>
     <w:rPr>
-      <w:color w:val="365F91" w:themeColor="accent1" w:themeShade="BF"/>
+      <w:color w:val="000000"/>
     </w:rPr>
     <w:tblPr>
       <w:tblStyleRowBandSize w:val="1"/>
@@ -1907,7 +2065,7 @@
       <w:spacing w:after="0" w:line="240" w:lineRule="auto"/>
     </w:pPr>
     <w:rPr>
-      <w:color w:val="943634" w:themeColor="accent2" w:themeShade="BF"/>
+      <w:color w:val="000000"/>
     </w:rPr>
     <w:tblPr>
       <w:tblStyleRowBandSize w:val="1"/>
@@ -2010,7 +2168,7 @@
       <w:spacing w:after="0" w:line="240" w:lineRule="auto"/>
     </w:pPr>
     <w:rPr>
-      <w:color w:val="76923C" w:themeColor="accent3" w:themeShade="BF"/>
+      <w:color w:val="000000"/>
     </w:rPr>
     <w:tblPr>
       <w:tblStyleRowBandSize w:val="1"/>
@@ -2113,7 +2271,7 @@
       <w:spacing w:after="0" w:line="240" w:lineRule="auto"/>
     </w:pPr>
     <w:rPr>
-      <w:color w:val="5F497A" w:themeColor="accent4" w:themeShade="BF"/>
+      <w:color w:val="000000"/>
     </w:rPr>
     <w:tblPr>
       <w:tblStyleRowBandSize w:val="1"/>
@@ -2216,7 +2374,7 @@
       <w:spacing w:after="0" w:line="240" w:lineRule="auto"/>
     </w:pPr>
     <w:rPr>
-      <w:color w:val="31849B" w:themeColor="accent5" w:themeShade="BF"/>
+      <w:color w:val="000000"/>
     </w:rPr>
     <w:tblPr>
       <w:tblStyleRowBandSize w:val="1"/>
@@ -2319,7 +2477,7 @@
       <w:spacing w:after="0" w:line="240" w:lineRule="auto"/>
     </w:pPr>
     <w:rPr>
-      <w:color w:val="E36C0A" w:themeColor="accent6" w:themeShade="BF"/>
+      <w:color w:val="000000"/>
     </w:rPr>
     <w:tblPr>
       <w:tblStyleRowBandSize w:val="1"/>
@@ -2445,7 +2603,7 @@
       <w:rPr>
         <w:b/>
         <w:bCs/>
-        <w:color w:val="FFFFFF" w:themeColor="background1"/>
+        <w:color w:val="000000"/>
       </w:rPr>
       <w:tblPr/>
       <w:tcPr>
@@ -2537,7 +2695,7 @@
       <w:rPr>
         <w:b/>
         <w:bCs/>
-        <w:color w:val="FFFFFF" w:themeColor="background1"/>
+        <w:color w:val="000000"/>
       </w:rPr>
       <w:tblPr/>
       <w:tcPr>
@@ -2629,7 +2787,7 @@
       <w:rPr>
         <w:b/>
         <w:bCs/>
-        <w:color w:val="FFFFFF" w:themeColor="background1"/>
+        <w:color w:val="000000"/>
       </w:rPr>
       <w:tblPr/>
       <w:tcPr>
@@ -2721,7 +2879,7 @@
       <w:rPr>
         <w:b/>
         <w:bCs/>
-        <w:color w:val="FFFFFF" w:themeColor="background1"/>
+        <w:color w:val="000000"/>
       </w:rPr>
       <w:tblPr/>
       <w:tcPr>
@@ -2813,7 +2971,7 @@
       <w:rPr>
         <w:b/>
         <w:bCs/>
-        <w:color w:val="FFFFFF" w:themeColor="background1"/>
+        <w:color w:val="000000"/>
       </w:rPr>
       <w:tblPr/>
       <w:tcPr>
@@ -2905,7 +3063,7 @@
       <w:rPr>
         <w:b/>
         <w:bCs/>
-        <w:color w:val="FFFFFF" w:themeColor="background1"/>
+        <w:color w:val="000000"/>
       </w:rPr>
       <w:tblPr/>
       <w:tcPr>
@@ -2997,7 +3155,7 @@
       <w:rPr>
         <w:b/>
         <w:bCs/>
-        <w:color w:val="FFFFFF" w:themeColor="background1"/>
+        <w:color w:val="000000"/>
       </w:rPr>
       <w:tblPr/>
       <w:tcPr>
@@ -4000,7 +4158,7 @@
       <w:rPr>
         <w:b/>
         <w:bCs/>
-        <w:color w:val="FFFFFF" w:themeColor="background1"/>
+        <w:color w:val="000000"/>
       </w:rPr>
       <w:tblPr/>
       <w:tcPr>
@@ -4106,7 +4264,7 @@
       <w:rPr>
         <w:b/>
         <w:bCs/>
-        <w:color w:val="FFFFFF" w:themeColor="background1"/>
+        <w:color w:val="000000"/>
       </w:rPr>
       <w:tblPr/>
       <w:tcPr>
@@ -4212,7 +4370,7 @@
       <w:rPr>
         <w:b/>
         <w:bCs/>
-        <w:color w:val="FFFFFF" w:themeColor="background1"/>
+        <w:color w:val="000000"/>
       </w:rPr>
       <w:tblPr/>
       <w:tcPr>
@@ -4318,7 +4476,7 @@
       <w:rPr>
         <w:b/>
         <w:bCs/>
-        <w:color w:val="FFFFFF" w:themeColor="background1"/>
+        <w:color w:val="000000"/>
       </w:rPr>
       <w:tblPr/>
       <w:tcPr>
@@ -4424,7 +4582,7 @@
       <w:rPr>
         <w:b/>
         <w:bCs/>
-        <w:color w:val="FFFFFF" w:themeColor="background1"/>
+        <w:color w:val="000000"/>
       </w:rPr>
       <w:tblPr/>
       <w:tcPr>
@@ -4530,7 +4688,7 @@
       <w:rPr>
         <w:b/>
         <w:bCs/>
-        <w:color w:val="FFFFFF" w:themeColor="background1"/>
+        <w:color w:val="000000"/>
       </w:rPr>
       <w:tblPr/>
       <w:tcPr>
@@ -4636,7 +4794,7 @@
       <w:rPr>
         <w:b/>
         <w:bCs/>
-        <w:color w:val="FFFFFF" w:themeColor="background1"/>
+        <w:color w:val="000000"/>
       </w:rPr>
       <w:tblPr/>
       <w:tcPr>
@@ -4739,7 +4897,7 @@
       <w:rPr>
         <w:b/>
         <w:bCs/>
-        <w:color w:val="FFFFFF" w:themeColor="background1"/>
+        <w:color w:val="000000"/>
       </w:rPr>
       <w:tblPr/>
       <w:tcPr>
@@ -4759,7 +4917,7 @@
         <w:spacing w:before="0" w:after="0" w:line="240" w:lineRule="auto"/>
       </w:pPr>
       <w:rPr>
-        <w:color w:val="auto"/>
+        <w:color w:val="000000"/>
       </w:rPr>
       <w:tblPr/>
       <w:tcPr>
@@ -4778,7 +4936,7 @@
       <w:rPr>
         <w:b/>
         <w:bCs/>
-        <w:color w:val="FFFFFF" w:themeColor="background1"/>
+        <w:color w:val="000000"/>
       </w:rPr>
       <w:tblPr/>
       <w:tcPr>
@@ -4797,7 +4955,7 @@
       <w:rPr>
         <w:b/>
         <w:bCs/>
-        <w:color w:val="FFFFFF" w:themeColor="background1"/>
+        <w:color w:val="000000"/>
       </w:rPr>
       <w:tblPr/>
       <w:tcPr>
@@ -4843,7 +5001,7 @@
     </w:tblStylePr>
     <w:tblStylePr w:type="nwCell">
       <w:rPr>
-        <w:color w:val="FFFFFF" w:themeColor="background1"/>
+        <w:color w:val="000000"/>
       </w:rPr>
       <w:tblPr/>
       <w:tcPr>
@@ -4888,7 +5046,7 @@
       <w:rPr>
         <w:b/>
         <w:bCs/>
-        <w:color w:val="FFFFFF" w:themeColor="background1"/>
+        <w:color w:val="000000"/>
       </w:rPr>
       <w:tblPr/>
       <w:tcPr>
@@ -4908,7 +5066,7 @@
         <w:spacing w:before="0" w:after="0" w:line="240" w:lineRule="auto"/>
       </w:pPr>
       <w:rPr>
-        <w:color w:val="auto"/>
+        <w:color w:val="000000"/>
       </w:rPr>
       <w:tblPr/>
       <w:tcPr>
@@ -4927,7 +5085,7 @@
       <w:rPr>
         <w:b/>
         <w:bCs/>
-        <w:color w:val="FFFFFF" w:themeColor="background1"/>
+        <w:color w:val="000000"/>
       </w:rPr>
       <w:tblPr/>
       <w:tcPr>
@@ -4946,7 +5104,7 @@
       <w:rPr>
         <w:b/>
         <w:bCs/>
-        <w:color w:val="FFFFFF" w:themeColor="background1"/>
+        <w:color w:val="000000"/>
       </w:rPr>
       <w:tblPr/>
       <w:tcPr>
@@ -4992,7 +5150,7 @@
     </w:tblStylePr>
     <w:tblStylePr w:type="nwCell">
       <w:rPr>
-        <w:color w:val="FFFFFF" w:themeColor="background1"/>
+        <w:color w:val="000000"/>
       </w:rPr>
       <w:tblPr/>
       <w:tcPr>
@@ -5037,7 +5195,7 @@
       <w:rPr>
         <w:b/>
         <w:bCs/>
-        <w:color w:val="FFFFFF" w:themeColor="background1"/>
+        <w:color w:val="000000"/>
       </w:rPr>
       <w:tblPr/>
       <w:tcPr>
@@ -5057,7 +5215,7 @@
         <w:spacing w:before="0" w:after="0" w:line="240" w:lineRule="auto"/>
       </w:pPr>
       <w:rPr>
-        <w:color w:val="auto"/>
+        <w:color w:val="000000"/>
       </w:rPr>
       <w:tblPr/>
       <w:tcPr>
@@ -5076,7 +5234,7 @@
       <w:rPr>
         <w:b/>
         <w:bCs/>
-        <w:color w:val="FFFFFF" w:themeColor="background1"/>
+        <w:color w:val="000000"/>
       </w:rPr>
       <w:tblPr/>
       <w:tcPr>
@@ -5095,7 +5253,7 @@
       <w:rPr>
         <w:b/>
         <w:bCs/>
-        <w:color w:val="FFFFFF" w:themeColor="background1"/>
+        <w:color w:val="000000"/>
       </w:rPr>
       <w:tblPr/>
       <w:tcPr>
@@ -5141,7 +5299,7 @@
     </w:tblStylePr>
     <w:tblStylePr w:type="nwCell">
       <w:rPr>
-        <w:color w:val="FFFFFF" w:themeColor="background1"/>
+        <w:color w:val="000000"/>
       </w:rPr>
       <w:tblPr/>
       <w:tcPr>
@@ -5186,7 +5344,7 @@
       <w:rPr>
         <w:b/>
         <w:bCs/>
-        <w:color w:val="FFFFFF" w:themeColor="background1"/>
+        <w:color w:val="000000"/>
       </w:rPr>
       <w:tblPr/>
       <w:tcPr>
@@ -5206,7 +5364,7 @@
         <w:spacing w:before="0" w:after="0" w:line="240" w:lineRule="auto"/>
       </w:pPr>
       <w:rPr>
-        <w:color w:val="auto"/>
+        <w:color w:val="000000"/>
       </w:rPr>
       <w:tblPr/>
       <w:tcPr>
@@ -5225,7 +5383,7 @@
       <w:rPr>
         <w:b/>
         <w:bCs/>
-        <w:color w:val="FFFFFF" w:themeColor="background1"/>
+        <w:color w:val="000000"/>
       </w:rPr>
       <w:tblPr/>
       <w:tcPr>
@@ -5244,7 +5402,7 @@
       <w:rPr>
         <w:b/>
         <w:bCs/>
-        <w:color w:val="FFFFFF" w:themeColor="background1"/>
+        <w:color w:val="000000"/>
       </w:rPr>
       <w:tblPr/>
       <w:tcPr>
@@ -5290,7 +5448,7 @@
     </w:tblStylePr>
     <w:tblStylePr w:type="nwCell">
       <w:rPr>
-        <w:color w:val="FFFFFF" w:themeColor="background1"/>
+        <w:color w:val="000000"/>
       </w:rPr>
       <w:tblPr/>
       <w:tcPr>
@@ -5335,7 +5493,7 @@
       <w:rPr>
         <w:b/>
         <w:bCs/>
-        <w:color w:val="FFFFFF" w:themeColor="background1"/>
+        <w:color w:val="000000"/>
       </w:rPr>
       <w:tblPr/>
       <w:tcPr>
@@ -5355,7 +5513,7 @@
         <w:spacing w:before="0" w:after="0" w:line="240" w:lineRule="auto"/>
       </w:pPr>
       <w:rPr>
-        <w:color w:val="auto"/>
+        <w:color w:val="000000"/>
       </w:rPr>
       <w:tblPr/>
       <w:tcPr>
@@ -5374,7 +5532,7 @@
       <w:rPr>
         <w:b/>
         <w:bCs/>
-        <w:color w:val="FFFFFF" w:themeColor="background1"/>
+        <w:color w:val="000000"/>
       </w:rPr>
       <w:tblPr/>
       <w:tcPr>
@@ -5393,7 +5551,7 @@
       <w:rPr>
         <w:b/>
         <w:bCs/>
-        <w:color w:val="FFFFFF" w:themeColor="background1"/>
+        <w:color w:val="000000"/>
       </w:rPr>
       <w:tblPr/>
       <w:tcPr>
@@ -5439,7 +5597,7 @@
     </w:tblStylePr>
     <w:tblStylePr w:type="nwCell">
       <w:rPr>
-        <w:color w:val="FFFFFF" w:themeColor="background1"/>
+        <w:color w:val="000000"/>
       </w:rPr>
       <w:tblPr/>
       <w:tcPr>
@@ -5484,7 +5642,7 @@
       <w:rPr>
         <w:b/>
         <w:bCs/>
-        <w:color w:val="FFFFFF" w:themeColor="background1"/>
+        <w:color w:val="000000"/>
       </w:rPr>
       <w:tblPr/>
       <w:tcPr>
@@ -5504,7 +5662,7 @@
         <w:spacing w:before="0" w:after="0" w:line="240" w:lineRule="auto"/>
       </w:pPr>
       <w:rPr>
-        <w:color w:val="auto"/>
+        <w:color w:val="000000"/>
       </w:rPr>
       <w:tblPr/>
       <w:tcPr>
@@ -5523,7 +5681,7 @@
       <w:rPr>
         <w:b/>
         <w:bCs/>
-        <w:color w:val="FFFFFF" w:themeColor="background1"/>
+        <w:color w:val="000000"/>
       </w:rPr>
       <w:tblPr/>
       <w:tcPr>
@@ -5542,7 +5700,7 @@
       <w:rPr>
         <w:b/>
         <w:bCs/>
-        <w:color w:val="FFFFFF" w:themeColor="background1"/>
+        <w:color w:val="000000"/>
       </w:rPr>
       <w:tblPr/>
       <w:tcPr>
@@ -5588,7 +5746,7 @@
     </w:tblStylePr>
     <w:tblStylePr w:type="nwCell">
       <w:rPr>
-        <w:color w:val="FFFFFF" w:themeColor="background1"/>
+        <w:color w:val="000000"/>
       </w:rPr>
       <w:tblPr/>
       <w:tcPr>
@@ -5633,7 +5791,7 @@
       <w:rPr>
         <w:b/>
         <w:bCs/>
-        <w:color w:val="FFFFFF" w:themeColor="background1"/>
+        <w:color w:val="000000"/>
       </w:rPr>
       <w:tblPr/>
       <w:tcPr>
@@ -5653,7 +5811,7 @@
         <w:spacing w:before="0" w:after="0" w:line="240" w:lineRule="auto"/>
       </w:pPr>
       <w:rPr>
-        <w:color w:val="auto"/>
+        <w:color w:val="000000"/>
       </w:rPr>
       <w:tblPr/>
       <w:tcPr>
@@ -5672,7 +5830,7 @@
       <w:rPr>
         <w:b/>
         <w:bCs/>
-        <w:color w:val="FFFFFF" w:themeColor="background1"/>
+        <w:color w:val="000000"/>
       </w:rPr>
       <w:tblPr/>
       <w:tcPr>
@@ -5691,7 +5849,7 @@
       <w:rPr>
         <w:b/>
         <w:bCs/>
-        <w:color w:val="FFFFFF" w:themeColor="background1"/>
+        <w:color w:val="000000"/>
       </w:rPr>
       <w:tblPr/>
       <w:tcPr>
@@ -5737,7 +5895,7 @@
     </w:tblStylePr>
     <w:tblStylePr w:type="nwCell">
       <w:rPr>
-        <w:color w:val="FFFFFF" w:themeColor="background1"/>
+        <w:color w:val="000000"/>
       </w:rPr>
       <w:tblPr/>
       <w:tcPr>
@@ -5761,7 +5919,7 @@
       <w:spacing w:after="0" w:line="240" w:lineRule="auto"/>
     </w:pPr>
     <w:rPr>
-      <w:color w:val="000000" w:themeColor="text1"/>
+      <w:color w:val="000000"/>
     </w:rPr>
     <w:tblPr>
       <w:tblStyleRowBandSize w:val="1"/>
@@ -5794,7 +5952,7 @@
       <w:rPr>
         <w:b/>
         <w:bCs/>
-        <w:color w:val="1F497D" w:themeColor="text2"/>
+        <w:color w:val="000000"/>
       </w:rPr>
       <w:tblPr/>
       <w:tcPr>
@@ -5845,7 +6003,7 @@
       <w:spacing w:after="0" w:line="240" w:lineRule="auto"/>
     </w:pPr>
     <w:rPr>
-      <w:color w:val="000000" w:themeColor="text1"/>
+      <w:color w:val="000000"/>
     </w:rPr>
     <w:tblPr>
       <w:tblStyleRowBandSize w:val="1"/>
@@ -5878,7 +6036,7 @@
       <w:rPr>
         <w:b/>
         <w:bCs/>
-        <w:color w:val="1F497D" w:themeColor="text2"/>
+        <w:color w:val="000000"/>
       </w:rPr>
       <w:tblPr/>
       <w:tcPr>
@@ -5929,7 +6087,7 @@
       <w:spacing w:after="0" w:line="240" w:lineRule="auto"/>
     </w:pPr>
     <w:rPr>
-      <w:color w:val="000000" w:themeColor="text1"/>
+      <w:color w:val="000000"/>
     </w:rPr>
     <w:tblPr>
       <w:tblStyleRowBandSize w:val="1"/>
@@ -5962,7 +6120,7 @@
       <w:rPr>
         <w:b/>
         <w:bCs/>
-        <w:color w:val="1F497D" w:themeColor="text2"/>
+        <w:color w:val="000000"/>
       </w:rPr>
       <w:tblPr/>
       <w:tcPr>
@@ -6013,7 +6171,7 @@
       <w:spacing w:after="0" w:line="240" w:lineRule="auto"/>
     </w:pPr>
     <w:rPr>
-      <w:color w:val="000000" w:themeColor="text1"/>
+      <w:color w:val="000000"/>
     </w:rPr>
     <w:tblPr>
       <w:tblStyleRowBandSize w:val="1"/>
@@ -6046,7 +6204,7 @@
       <w:rPr>
         <w:b/>
         <w:bCs/>
-        <w:color w:val="1F497D" w:themeColor="text2"/>
+        <w:color w:val="000000"/>
       </w:rPr>
       <w:tblPr/>
       <w:tcPr>
@@ -6097,7 +6255,7 @@
       <w:spacing w:after="0" w:line="240" w:lineRule="auto"/>
     </w:pPr>
     <w:rPr>
-      <w:color w:val="000000" w:themeColor="text1"/>
+      <w:color w:val="000000"/>
     </w:rPr>
     <w:tblPr>
       <w:tblStyleRowBandSize w:val="1"/>
@@ -6130,7 +6288,7 @@
       <w:rPr>
         <w:b/>
         <w:bCs/>
-        <w:color w:val="1F497D" w:themeColor="text2"/>
+        <w:color w:val="000000"/>
       </w:rPr>
       <w:tblPr/>
       <w:tcPr>
@@ -6181,7 +6339,7 @@
       <w:spacing w:after="0" w:line="240" w:lineRule="auto"/>
     </w:pPr>
     <w:rPr>
-      <w:color w:val="000000" w:themeColor="text1"/>
+      <w:color w:val="000000"/>
     </w:rPr>
     <w:tblPr>
       <w:tblStyleRowBandSize w:val="1"/>
@@ -6214,7 +6372,7 @@
       <w:rPr>
         <w:b/>
         <w:bCs/>
-        <w:color w:val="1F497D" w:themeColor="text2"/>
+        <w:color w:val="000000"/>
       </w:rPr>
       <w:tblPr/>
       <w:tcPr>
@@ -6265,7 +6423,7 @@
       <w:spacing w:after="0" w:line="240" w:lineRule="auto"/>
     </w:pPr>
     <w:rPr>
-      <w:color w:val="000000" w:themeColor="text1"/>
+      <w:color w:val="000000"/>
     </w:rPr>
     <w:tblPr>
       <w:tblStyleRowBandSize w:val="1"/>
@@ -6298,7 +6456,7 @@
       <w:rPr>
         <w:b/>
         <w:bCs/>
-        <w:color w:val="1F497D" w:themeColor="text2"/>
+        <w:color w:val="000000"/>
       </w:rPr>
       <w:tblPr/>
       <w:tcPr>
@@ -6350,7 +6508,7 @@
     </w:pPr>
     <w:rPr>
       <w:rFonts w:asciiTheme="majorHAnsi" w:eastAsiaTheme="majorEastAsia" w:hAnsiTheme="majorHAnsi" w:cstheme="majorBidi"/>
-      <w:color w:val="000000" w:themeColor="text1"/>
+      <w:color w:val="000000"/>
     </w:rPr>
     <w:tblPr>
       <w:tblStyleRowBandSize w:val="1"/>
@@ -6478,7 +6636,7 @@
     </w:pPr>
     <w:rPr>
       <w:rFonts w:asciiTheme="majorHAnsi" w:eastAsiaTheme="majorEastAsia" w:hAnsiTheme="majorHAnsi" w:cstheme="majorBidi"/>
-      <w:color w:val="000000" w:themeColor="text1"/>
+      <w:color w:val="000000"/>
     </w:rPr>
     <w:tblPr>
       <w:tblStyleRowBandSize w:val="1"/>
@@ -6606,7 +6764,7 @@
     </w:pPr>
     <w:rPr>
       <w:rFonts w:asciiTheme="majorHAnsi" w:eastAsiaTheme="majorEastAsia" w:hAnsiTheme="majorHAnsi" w:cstheme="majorBidi"/>
-      <w:color w:val="000000" w:themeColor="text1"/>
+      <w:color w:val="000000"/>
     </w:rPr>
     <w:tblPr>
       <w:tblStyleRowBandSize w:val="1"/>
@@ -6734,7 +6892,7 @@
     </w:pPr>
     <w:rPr>
       <w:rFonts w:asciiTheme="majorHAnsi" w:eastAsiaTheme="majorEastAsia" w:hAnsiTheme="majorHAnsi" w:cstheme="majorBidi"/>
-      <w:color w:val="000000" w:themeColor="text1"/>
+      <w:color w:val="000000"/>
     </w:rPr>
     <w:tblPr>
       <w:tblStyleRowBandSize w:val="1"/>
@@ -6862,7 +7020,7 @@
     </w:pPr>
     <w:rPr>
       <w:rFonts w:asciiTheme="majorHAnsi" w:eastAsiaTheme="majorEastAsia" w:hAnsiTheme="majorHAnsi" w:cstheme="majorBidi"/>
-      <w:color w:val="000000" w:themeColor="text1"/>
+      <w:color w:val="000000"/>
     </w:rPr>
     <w:tblPr>
       <w:tblStyleRowBandSize w:val="1"/>
@@ -6990,7 +7148,7 @@
     </w:pPr>
     <w:rPr>
       <w:rFonts w:asciiTheme="majorHAnsi" w:eastAsiaTheme="majorEastAsia" w:hAnsiTheme="majorHAnsi" w:cstheme="majorBidi"/>
-      <w:color w:val="000000" w:themeColor="text1"/>
+      <w:color w:val="000000"/>
     </w:rPr>
     <w:tblPr>
       <w:tblStyleRowBandSize w:val="1"/>
@@ -7118,7 +7276,7 @@
     </w:pPr>
     <w:rPr>
       <w:rFonts w:asciiTheme="majorHAnsi" w:eastAsiaTheme="majorEastAsia" w:hAnsiTheme="majorHAnsi" w:cstheme="majorBidi"/>
-      <w:color w:val="000000" w:themeColor="text1"/>
+      <w:color w:val="000000"/>
     </w:rPr>
     <w:tblPr>
       <w:tblStyleRowBandSize w:val="1"/>
@@ -7757,7 +7915,7 @@
     </w:pPr>
     <w:rPr>
       <w:rFonts w:asciiTheme="majorHAnsi" w:eastAsiaTheme="majorEastAsia" w:hAnsiTheme="majorHAnsi" w:cstheme="majorBidi"/>
-      <w:color w:val="000000" w:themeColor="text1"/>
+      <w:color w:val="000000"/>
     </w:rPr>
     <w:tblPr>
       <w:tblStyleRowBandSize w:val="1"/>
@@ -7785,7 +7943,7 @@
       <w:rPr>
         <w:b/>
         <w:bCs/>
-        <w:color w:val="000000" w:themeColor="text1"/>
+        <w:color w:val="000000"/>
       </w:rPr>
       <w:tblPr/>
       <w:tcPr>
@@ -7796,7 +7954,7 @@
       <w:rPr>
         <w:b/>
         <w:bCs/>
-        <w:color w:val="000000" w:themeColor="text1"/>
+        <w:color w:val="000000"/>
       </w:rPr>
       <w:tblPr/>
       <w:tcPr>
@@ -7815,7 +7973,7 @@
       <w:rPr>
         <w:b/>
         <w:bCs/>
-        <w:color w:val="000000" w:themeColor="text1"/>
+        <w:color w:val="000000"/>
       </w:rPr>
       <w:tblPr/>
       <w:tcPr>
@@ -7834,7 +7992,7 @@
       <w:rPr>
         <w:b w:val="0"/>
         <w:bCs w:val="0"/>
-        <w:color w:val="000000" w:themeColor="text1"/>
+        <w:color w:val="000000"/>
       </w:rPr>
       <w:tblPr/>
       <w:tcPr>
@@ -7882,7 +8040,7 @@
     </w:pPr>
     <w:rPr>
       <w:rFonts w:asciiTheme="majorHAnsi" w:eastAsiaTheme="majorEastAsia" w:hAnsiTheme="majorHAnsi" w:cstheme="majorBidi"/>
-      <w:color w:val="000000" w:themeColor="text1"/>
+      <w:color w:val="000000"/>
     </w:rPr>
     <w:tblPr>
       <w:tblStyleRowBandSize w:val="1"/>
@@ -7910,7 +8068,7 @@
       <w:rPr>
         <w:b/>
         <w:bCs/>
-        <w:color w:val="000000" w:themeColor="text1"/>
+        <w:color w:val="000000"/>
       </w:rPr>
       <w:tblPr/>
       <w:tcPr>
@@ -7921,7 +8079,7 @@
       <w:rPr>
         <w:b/>
         <w:bCs/>
-        <w:color w:val="000000" w:themeColor="text1"/>
+        <w:color w:val="000000"/>
       </w:rPr>
       <w:tblPr/>
       <w:tcPr>
@@ -7940,7 +8098,7 @@
       <w:rPr>
         <w:b/>
         <w:bCs/>
-        <w:color w:val="000000" w:themeColor="text1"/>
+        <w:color w:val="000000"/>
       </w:rPr>
       <w:tblPr/>
       <w:tcPr>
@@ -7959,7 +8117,7 @@
       <w:rPr>
         <w:b w:val="0"/>
         <w:bCs w:val="0"/>
-        <w:color w:val="000000" w:themeColor="text1"/>
+        <w:color w:val="000000"/>
       </w:rPr>
       <w:tblPr/>
       <w:tcPr>
@@ -8007,7 +8165,7 @@
     </w:pPr>
     <w:rPr>
       <w:rFonts w:asciiTheme="majorHAnsi" w:eastAsiaTheme="majorEastAsia" w:hAnsiTheme="majorHAnsi" w:cstheme="majorBidi"/>
-      <w:color w:val="000000" w:themeColor="text1"/>
+      <w:color w:val="000000"/>
     </w:rPr>
     <w:tblPr>
       <w:tblStyleRowBandSize w:val="1"/>
@@ -8035,7 +8193,7 @@
       <w:rPr>
         <w:b/>
         <w:bCs/>
-        <w:color w:val="000000" w:themeColor="text1"/>
+        <w:color w:val="000000"/>
       </w:rPr>
       <w:tblPr/>
       <w:tcPr>
@@ -8046,7 +8204,7 @@
       <w:rPr>
         <w:b/>
         <w:bCs/>
-        <w:color w:val="000000" w:themeColor="text1"/>
+        <w:color w:val="000000"/>
       </w:rPr>
       <w:tblPr/>
       <w:tcPr>
@@ -8065,7 +8223,7 @@
       <w:rPr>
         <w:b/>
         <w:bCs/>
-        <w:color w:val="000000" w:themeColor="text1"/>
+        <w:color w:val="000000"/>
       </w:rPr>
       <w:tblPr/>
       <w:tcPr>
@@ -8084,7 +8242,7 @@
       <w:rPr>
         <w:b w:val="0"/>
         <w:bCs w:val="0"/>
-        <w:color w:val="000000" w:themeColor="text1"/>
+        <w:color w:val="000000"/>
       </w:rPr>
       <w:tblPr/>
       <w:tcPr>
@@ -8132,7 +8290,7 @@
     </w:pPr>
     <w:rPr>
       <w:rFonts w:asciiTheme="majorHAnsi" w:eastAsiaTheme="majorEastAsia" w:hAnsiTheme="majorHAnsi" w:cstheme="majorBidi"/>
-      <w:color w:val="000000" w:themeColor="text1"/>
+      <w:color w:val="000000"/>
     </w:rPr>
     <w:tblPr>
       <w:tblStyleRowBandSize w:val="1"/>
@@ -8160,7 +8318,7 @@
       <w:rPr>
         <w:b/>
         <w:bCs/>
-        <w:color w:val="000000" w:themeColor="text1"/>
+        <w:color w:val="000000"/>
       </w:rPr>
       <w:tblPr/>
       <w:tcPr>
@@ -8171,7 +8329,7 @@
       <w:rPr>
         <w:b/>
         <w:bCs/>
-        <w:color w:val="000000" w:themeColor="text1"/>
+        <w:color w:val="000000"/>
       </w:rPr>
       <w:tblPr/>
       <w:tcPr>
@@ -8190,7 +8348,7 @@
       <w:rPr>
         <w:b/>
         <w:bCs/>
-        <w:color w:val="000000" w:themeColor="text1"/>
+        <w:color w:val="000000"/>
       </w:rPr>
       <w:tblPr/>
       <w:tcPr>
@@ -8209,7 +8367,7 @@
       <w:rPr>
         <w:b w:val="0"/>
         <w:bCs w:val="0"/>
-        <w:color w:val="000000" w:themeColor="text1"/>
+        <w:color w:val="000000"/>
       </w:rPr>
       <w:tblPr/>
       <w:tcPr>
@@ -8257,7 +8415,7 @@
     </w:pPr>
     <w:rPr>
       <w:rFonts w:asciiTheme="majorHAnsi" w:eastAsiaTheme="majorEastAsia" w:hAnsiTheme="majorHAnsi" w:cstheme="majorBidi"/>
-      <w:color w:val="000000" w:themeColor="text1"/>
+      <w:color w:val="000000"/>
     </w:rPr>
     <w:tblPr>
       <w:tblStyleRowBandSize w:val="1"/>
@@ -8285,7 +8443,7 @@
       <w:rPr>
         <w:b/>
         <w:bCs/>
-        <w:color w:val="000000" w:themeColor="text1"/>
+        <w:color w:val="000000"/>
       </w:rPr>
       <w:tblPr/>
       <w:tcPr>
@@ -8296,7 +8454,7 @@
       <w:rPr>
         <w:b/>
         <w:bCs/>
-        <w:color w:val="000000" w:themeColor="text1"/>
+        <w:color w:val="000000"/>
       </w:rPr>
       <w:tblPr/>
       <w:tcPr>
@@ -8315,7 +8473,7 @@
       <w:rPr>
         <w:b/>
         <w:bCs/>
-        <w:color w:val="000000" w:themeColor="text1"/>
+        <w:color w:val="000000"/>
       </w:rPr>
       <w:tblPr/>
       <w:tcPr>
@@ -8334,7 +8492,7 @@
       <w:rPr>
         <w:b w:val="0"/>
         <w:bCs w:val="0"/>
-        <w:color w:val="000000" w:themeColor="text1"/>
+        <w:color w:val="000000"/>
       </w:rPr>
       <w:tblPr/>
       <w:tcPr>
@@ -8382,7 +8540,7 @@
     </w:pPr>
     <w:rPr>
       <w:rFonts w:asciiTheme="majorHAnsi" w:eastAsiaTheme="majorEastAsia" w:hAnsiTheme="majorHAnsi" w:cstheme="majorBidi"/>
-      <w:color w:val="000000" w:themeColor="text1"/>
+      <w:color w:val="000000"/>
     </w:rPr>
     <w:tblPr>
       <w:tblStyleRowBandSize w:val="1"/>
@@ -8410,7 +8568,7 @@
       <w:rPr>
         <w:b/>
         <w:bCs/>
-        <w:color w:val="000000" w:themeColor="text1"/>
+        <w:color w:val="000000"/>
       </w:rPr>
       <w:tblPr/>
       <w:tcPr>
@@ -8421,7 +8579,7 @@
       <w:rPr>
         <w:b/>
         <w:bCs/>
-        <w:color w:val="000000" w:themeColor="text1"/>
+        <w:color w:val="000000"/>
       </w:rPr>
       <w:tblPr/>
       <w:tcPr>
@@ -8440,7 +8598,7 @@
       <w:rPr>
         <w:b/>
         <w:bCs/>
-        <w:color w:val="000000" w:themeColor="text1"/>
+        <w:color w:val="000000"/>
       </w:rPr>
       <w:tblPr/>
       <w:tcPr>
@@ -8459,7 +8617,7 @@
       <w:rPr>
         <w:b w:val="0"/>
         <w:bCs w:val="0"/>
-        <w:color w:val="000000" w:themeColor="text1"/>
+        <w:color w:val="000000"/>
       </w:rPr>
       <w:tblPr/>
       <w:tcPr>
@@ -8507,7 +8665,7 @@
     </w:pPr>
     <w:rPr>
       <w:rFonts w:asciiTheme="majorHAnsi" w:eastAsiaTheme="majorEastAsia" w:hAnsiTheme="majorHAnsi" w:cstheme="majorBidi"/>
-      <w:color w:val="000000" w:themeColor="text1"/>
+      <w:color w:val="000000"/>
     </w:rPr>
     <w:tblPr>
       <w:tblStyleRowBandSize w:val="1"/>
@@ -8535,7 +8693,7 @@
       <w:rPr>
         <w:b/>
         <w:bCs/>
-        <w:color w:val="000000" w:themeColor="text1"/>
+        <w:color w:val="000000"/>
       </w:rPr>
       <w:tblPr/>
       <w:tcPr>
@@ -8546,7 +8704,7 @@
       <w:rPr>
         <w:b/>
         <w:bCs/>
-        <w:color w:val="000000" w:themeColor="text1"/>
+        <w:color w:val="000000"/>
       </w:rPr>
       <w:tblPr/>
       <w:tcPr>
@@ -8565,7 +8723,7 @@
       <w:rPr>
         <w:b/>
         <w:bCs/>
-        <w:color w:val="000000" w:themeColor="text1"/>
+        <w:color w:val="000000"/>
       </w:rPr>
       <w:tblPr/>
       <w:tcPr>
@@ -8584,7 +8742,7 @@
       <w:rPr>
         <w:b w:val="0"/>
         <w:bCs w:val="0"/>
-        <w:color w:val="000000" w:themeColor="text1"/>
+        <w:color w:val="000000"/>
       </w:rPr>
       <w:tblPr/>
       <w:tcPr>
@@ -8658,7 +8816,7 @@
         <w:bCs/>
         <w:i w:val="0"/>
         <w:iCs w:val="0"/>
-        <w:color w:val="FFFFFF" w:themeColor="background1"/>
+        <w:color w:val="000000"/>
       </w:rPr>
       <w:tblPr/>
       <w:tcPr>
@@ -8679,7 +8837,7 @@
         <w:bCs/>
         <w:i w:val="0"/>
         <w:iCs w:val="0"/>
-        <w:color w:val="FFFFFF" w:themeColor="background1"/>
+        <w:color w:val="000000"/>
       </w:rPr>
       <w:tblPr/>
       <w:tcPr>
@@ -8700,7 +8858,7 @@
         <w:bCs/>
         <w:i w:val="0"/>
         <w:iCs w:val="0"/>
-        <w:color w:val="FFFFFF" w:themeColor="background1"/>
+        <w:color w:val="000000"/>
       </w:rPr>
       <w:tblPr/>
       <w:tcPr>
@@ -8719,7 +8877,7 @@
         <w:bCs/>
         <w:i w:val="0"/>
         <w:iCs w:val="0"/>
-        <w:color w:val="FFFFFF" w:themeColor="background1"/>
+        <w:color w:val="000000"/>
       </w:rPr>
       <w:tblPr/>
       <w:tcPr>
@@ -8799,7 +8957,7 @@
         <w:bCs/>
         <w:i w:val="0"/>
         <w:iCs w:val="0"/>
-        <w:color w:val="FFFFFF" w:themeColor="background1"/>
+        <w:color w:val="000000"/>
       </w:rPr>
       <w:tblPr/>
       <w:tcPr>
@@ -8820,7 +8978,7 @@
         <w:bCs/>
         <w:i w:val="0"/>
         <w:iCs w:val="0"/>
-        <w:color w:val="FFFFFF" w:themeColor="background1"/>
+        <w:color w:val="000000"/>
       </w:rPr>
       <w:tblPr/>
       <w:tcPr>
@@ -8841,7 +8999,7 @@
         <w:bCs/>
         <w:i w:val="0"/>
         <w:iCs w:val="0"/>
-        <w:color w:val="FFFFFF" w:themeColor="background1"/>
+        <w:color w:val="000000"/>
       </w:rPr>
       <w:tblPr/>
       <w:tcPr>
@@ -8860,7 +9018,7 @@
         <w:bCs/>
         <w:i w:val="0"/>
         <w:iCs w:val="0"/>
-        <w:color w:val="FFFFFF" w:themeColor="background1"/>
+        <w:color w:val="000000"/>
       </w:rPr>
       <w:tblPr/>
       <w:tcPr>
@@ -8940,7 +9098,7 @@
         <w:bCs/>
         <w:i w:val="0"/>
         <w:iCs w:val="0"/>
-        <w:color w:val="FFFFFF" w:themeColor="background1"/>
+        <w:color w:val="000000"/>
       </w:rPr>
       <w:tblPr/>
       <w:tcPr>
@@ -8961,7 +9119,7 @@
         <w:bCs/>
         <w:i w:val="0"/>
         <w:iCs w:val="0"/>
-        <w:color w:val="FFFFFF" w:themeColor="background1"/>
+        <w:color w:val="000000"/>
       </w:rPr>
       <w:tblPr/>
       <w:tcPr>
@@ -8982,7 +9140,7 @@
         <w:bCs/>
         <w:i w:val="0"/>
         <w:iCs w:val="0"/>
-        <w:color w:val="FFFFFF" w:themeColor="background1"/>
+        <w:color w:val="000000"/>
       </w:rPr>
       <w:tblPr/>
       <w:tcPr>
@@ -9001,7 +9159,7 @@
         <w:bCs/>
         <w:i w:val="0"/>
         <w:iCs w:val="0"/>
-        <w:color w:val="FFFFFF" w:themeColor="background1"/>
+        <w:color w:val="000000"/>
       </w:rPr>
       <w:tblPr/>
       <w:tcPr>
@@ -9081,7 +9239,7 @@
         <w:bCs/>
         <w:i w:val="0"/>
         <w:iCs w:val="0"/>
-        <w:color w:val="FFFFFF" w:themeColor="background1"/>
+        <w:color w:val="000000"/>
       </w:rPr>
       <w:tblPr/>
       <w:tcPr>
@@ -9102,7 +9260,7 @@
         <w:bCs/>
         <w:i w:val="0"/>
         <w:iCs w:val="0"/>
-        <w:color w:val="FFFFFF" w:themeColor="background1"/>
+        <w:color w:val="000000"/>
       </w:rPr>
       <w:tblPr/>
       <w:tcPr>
@@ -9123,7 +9281,7 @@
         <w:bCs/>
         <w:i w:val="0"/>
         <w:iCs w:val="0"/>
-        <w:color w:val="FFFFFF" w:themeColor="background1"/>
+        <w:color w:val="000000"/>
       </w:rPr>
       <w:tblPr/>
       <w:tcPr>
@@ -9142,7 +9300,7 @@
         <w:bCs/>
         <w:i w:val="0"/>
         <w:iCs w:val="0"/>
-        <w:color w:val="FFFFFF" w:themeColor="background1"/>
+        <w:color w:val="000000"/>
       </w:rPr>
       <w:tblPr/>
       <w:tcPr>
@@ -9222,7 +9380,7 @@
         <w:bCs/>
         <w:i w:val="0"/>
         <w:iCs w:val="0"/>
-        <w:color w:val="FFFFFF" w:themeColor="background1"/>
+        <w:color w:val="000000"/>
       </w:rPr>
       <w:tblPr/>
       <w:tcPr>
@@ -9243,7 +9401,7 @@
         <w:bCs/>
         <w:i w:val="0"/>
         <w:iCs w:val="0"/>
-        <w:color w:val="FFFFFF" w:themeColor="background1"/>
+        <w:color w:val="000000"/>
       </w:rPr>
       <w:tblPr/>
       <w:tcPr>
@@ -9264,7 +9422,7 @@
         <w:bCs/>
         <w:i w:val="0"/>
         <w:iCs w:val="0"/>
-        <w:color w:val="FFFFFF" w:themeColor="background1"/>
+        <w:color w:val="000000"/>
       </w:rPr>
       <w:tblPr/>
       <w:tcPr>
@@ -9283,7 +9441,7 @@
         <w:bCs/>
         <w:i w:val="0"/>
         <w:iCs w:val="0"/>
-        <w:color w:val="FFFFFF" w:themeColor="background1"/>
+        <w:color w:val="000000"/>
       </w:rPr>
       <w:tblPr/>
       <w:tcPr>
@@ -9363,7 +9521,7 @@
         <w:bCs/>
         <w:i w:val="0"/>
         <w:iCs w:val="0"/>
-        <w:color w:val="FFFFFF" w:themeColor="background1"/>
+        <w:color w:val="000000"/>
       </w:rPr>
       <w:tblPr/>
       <w:tcPr>
@@ -9384,7 +9542,7 @@
         <w:bCs/>
         <w:i w:val="0"/>
         <w:iCs w:val="0"/>
-        <w:color w:val="FFFFFF" w:themeColor="background1"/>
+        <w:color w:val="000000"/>
       </w:rPr>
       <w:tblPr/>
       <w:tcPr>
@@ -9405,7 +9563,7 @@
         <w:bCs/>
         <w:i w:val="0"/>
         <w:iCs w:val="0"/>
-        <w:color w:val="FFFFFF" w:themeColor="background1"/>
+        <w:color w:val="000000"/>
       </w:rPr>
       <w:tblPr/>
       <w:tcPr>
@@ -9424,7 +9582,7 @@
         <w:bCs/>
         <w:i w:val="0"/>
         <w:iCs w:val="0"/>
-        <w:color w:val="FFFFFF" w:themeColor="background1"/>
+        <w:color w:val="000000"/>
       </w:rPr>
       <w:tblPr/>
       <w:tcPr>
@@ -9504,7 +9662,7 @@
         <w:bCs/>
         <w:i w:val="0"/>
         <w:iCs w:val="0"/>
-        <w:color w:val="FFFFFF" w:themeColor="background1"/>
+        <w:color w:val="000000"/>
       </w:rPr>
       <w:tblPr/>
       <w:tcPr>
@@ -9525,7 +9683,7 @@
         <w:bCs/>
         <w:i w:val="0"/>
         <w:iCs w:val="0"/>
-        <w:color w:val="FFFFFF" w:themeColor="background1"/>
+        <w:color w:val="000000"/>
       </w:rPr>
       <w:tblPr/>
       <w:tcPr>
@@ -9546,7 +9704,7 @@
         <w:bCs/>
         <w:i w:val="0"/>
         <w:iCs w:val="0"/>
-        <w:color w:val="FFFFFF" w:themeColor="background1"/>
+        <w:color w:val="000000"/>
       </w:rPr>
       <w:tblPr/>
       <w:tcPr>
@@ -9565,7 +9723,7 @@
         <w:bCs/>
         <w:i w:val="0"/>
         <w:iCs w:val="0"/>
-        <w:color w:val="FFFFFF" w:themeColor="background1"/>
+        <w:color w:val="000000"/>
       </w:rPr>
       <w:tblPr/>
       <w:tcPr>
@@ -9618,7 +9776,7 @@
       <w:spacing w:after="0" w:line="240" w:lineRule="auto"/>
     </w:pPr>
     <w:rPr>
-      <w:color w:val="FFFFFF" w:themeColor="background1"/>
+      <w:color w:val="000000"/>
     </w:rPr>
     <w:tblPr>
       <w:tblStyleRowBandSize w:val="1"/>
@@ -9732,7 +9890,7 @@
       <w:spacing w:after="0" w:line="240" w:lineRule="auto"/>
     </w:pPr>
     <w:rPr>
-      <w:color w:val="FFFFFF" w:themeColor="background1"/>
+      <w:color w:val="000000"/>
     </w:rPr>
     <w:tblPr>
       <w:tblStyleRowBandSize w:val="1"/>
@@ -9846,7 +10004,7 @@
       <w:spacing w:after="0" w:line="240" w:lineRule="auto"/>
     </w:pPr>
     <w:rPr>
-      <w:color w:val="FFFFFF" w:themeColor="background1"/>
+      <w:color w:val="000000"/>
     </w:rPr>
     <w:tblPr>
       <w:tblStyleRowBandSize w:val="1"/>
@@ -9960,7 +10118,7 @@
       <w:spacing w:after="0" w:line="240" w:lineRule="auto"/>
     </w:pPr>
     <w:rPr>
-      <w:color w:val="FFFFFF" w:themeColor="background1"/>
+      <w:color w:val="000000"/>
     </w:rPr>
     <w:tblPr>
       <w:tblStyleRowBandSize w:val="1"/>
@@ -10074,7 +10232,7 @@
       <w:spacing w:after="0" w:line="240" w:lineRule="auto"/>
     </w:pPr>
     <w:rPr>
-      <w:color w:val="FFFFFF" w:themeColor="background1"/>
+      <w:color w:val="000000"/>
     </w:rPr>
     <w:tblPr>
       <w:tblStyleRowBandSize w:val="1"/>
@@ -10188,7 +10346,7 @@
       <w:spacing w:after="0" w:line="240" w:lineRule="auto"/>
     </w:pPr>
     <w:rPr>
-      <w:color w:val="FFFFFF" w:themeColor="background1"/>
+      <w:color w:val="000000"/>
     </w:rPr>
     <w:tblPr>
       <w:tblStyleRowBandSize w:val="1"/>
@@ -10302,7 +10460,7 @@
       <w:spacing w:after="0" w:line="240" w:lineRule="auto"/>
     </w:pPr>
     <w:rPr>
-      <w:color w:val="FFFFFF" w:themeColor="background1"/>
+      <w:color w:val="000000"/>
     </w:rPr>
     <w:tblPr>
       <w:tblStyleRowBandSize w:val="1"/>
@@ -10416,7 +10574,7 @@
       <w:spacing w:after="0" w:line="240" w:lineRule="auto"/>
     </w:pPr>
     <w:rPr>
-      <w:color w:val="000000" w:themeColor="text1"/>
+      <w:color w:val="000000"/>
     </w:rPr>
     <w:tblPr>
       <w:tblStyleRowBandSize w:val="1"/>
@@ -10462,7 +10620,7 @@
       <w:rPr>
         <w:b/>
         <w:bCs/>
-        <w:color w:val="FFFFFF" w:themeColor="background1"/>
+        <w:color w:val="000000"/>
       </w:rPr>
       <w:tblPr/>
       <w:tcPr>
@@ -10474,7 +10632,7 @@
     </w:tblStylePr>
     <w:tblStylePr w:type="firstCol">
       <w:rPr>
-        <w:color w:val="FFFFFF" w:themeColor="background1"/>
+        <w:color w:val="000000"/>
       </w:rPr>
       <w:tblPr/>
       <w:tcPr>
@@ -10491,7 +10649,7 @@
     </w:tblStylePr>
     <w:tblStylePr w:type="lastCol">
       <w:rPr>
-        <w:color w:val="FFFFFF" w:themeColor="background1"/>
+        <w:color w:val="000000"/>
       </w:rPr>
       <w:tblPr/>
       <w:tcPr>
@@ -10520,12 +10678,12 @@
     </w:tblStylePr>
     <w:tblStylePr w:type="neCell">
       <w:rPr>
-        <w:color w:val="000000" w:themeColor="text1"/>
+        <w:color w:val="000000"/>
       </w:rPr>
     </w:tblStylePr>
     <w:tblStylePr w:type="nwCell">
       <w:rPr>
-        <w:color w:val="000000" w:themeColor="text1"/>
+        <w:color w:val="000000"/>
       </w:rPr>
     </w:tblStylePr>
   </w:style>
@@ -10538,7 +10696,7 @@
       <w:spacing w:after="0" w:line="240" w:lineRule="auto"/>
     </w:pPr>
     <w:rPr>
-      <w:color w:val="000000" w:themeColor="text1"/>
+      <w:color w:val="000000"/>
     </w:rPr>
     <w:tblPr>
       <w:tblStyleRowBandSize w:val="1"/>
@@ -10584,7 +10742,7 @@
       <w:rPr>
         <w:b/>
         <w:bCs/>
-        <w:color w:val="FFFFFF" w:themeColor="background1"/>
+        <w:color w:val="000000"/>
       </w:rPr>
       <w:tblPr/>
       <w:tcPr>
@@ -10596,7 +10754,7 @@
     </w:tblStylePr>
     <w:tblStylePr w:type="firstCol">
       <w:rPr>
-        <w:color w:val="FFFFFF" w:themeColor="background1"/>
+        <w:color w:val="000000"/>
       </w:rPr>
       <w:tblPr/>
       <w:tcPr>
@@ -10613,7 +10771,7 @@
     </w:tblStylePr>
     <w:tblStylePr w:type="lastCol">
       <w:rPr>
-        <w:color w:val="FFFFFF" w:themeColor="background1"/>
+        <w:color w:val="000000"/>
       </w:rPr>
       <w:tblPr/>
       <w:tcPr>
@@ -10642,12 +10800,12 @@
     </w:tblStylePr>
     <w:tblStylePr w:type="neCell">
       <w:rPr>
-        <w:color w:val="000000" w:themeColor="text1"/>
+        <w:color w:val="000000"/>
       </w:rPr>
     </w:tblStylePr>
     <w:tblStylePr w:type="nwCell">
       <w:rPr>
-        <w:color w:val="000000" w:themeColor="text1"/>
+        <w:color w:val="000000"/>
       </w:rPr>
     </w:tblStylePr>
   </w:style>
@@ -10660,7 +10818,7 @@
       <w:spacing w:after="0" w:line="240" w:lineRule="auto"/>
     </w:pPr>
     <w:rPr>
-      <w:color w:val="000000" w:themeColor="text1"/>
+      <w:color w:val="000000"/>
     </w:rPr>
     <w:tblPr>
       <w:tblStyleRowBandSize w:val="1"/>
@@ -10706,7 +10864,7 @@
       <w:rPr>
         <w:b/>
         <w:bCs/>
-        <w:color w:val="FFFFFF" w:themeColor="background1"/>
+        <w:color w:val="000000"/>
       </w:rPr>
       <w:tblPr/>
       <w:tcPr>
@@ -10718,7 +10876,7 @@
     </w:tblStylePr>
     <w:tblStylePr w:type="firstCol">
       <w:rPr>
-        <w:color w:val="FFFFFF" w:themeColor="background1"/>
+        <w:color w:val="000000"/>
       </w:rPr>
       <w:tblPr/>
       <w:tcPr>
@@ -10735,7 +10893,7 @@
     </w:tblStylePr>
     <w:tblStylePr w:type="lastCol">
       <w:rPr>
-        <w:color w:val="FFFFFF" w:themeColor="background1"/>
+        <w:color w:val="000000"/>
       </w:rPr>
       <w:tblPr/>
       <w:tcPr>
@@ -10764,12 +10922,12 @@
     </w:tblStylePr>
     <w:tblStylePr w:type="neCell">
       <w:rPr>
-        <w:color w:val="000000" w:themeColor="text1"/>
+        <w:color w:val="000000"/>
       </w:rPr>
     </w:tblStylePr>
     <w:tblStylePr w:type="nwCell">
       <w:rPr>
-        <w:color w:val="000000" w:themeColor="text1"/>
+        <w:color w:val="000000"/>
       </w:rPr>
     </w:tblStylePr>
   </w:style>
@@ -10782,7 +10940,7 @@
       <w:spacing w:after="0" w:line="240" w:lineRule="auto"/>
     </w:pPr>
     <w:rPr>
-      <w:color w:val="000000" w:themeColor="text1"/>
+      <w:color w:val="000000"/>
     </w:rPr>
     <w:tblPr>
       <w:tblStyleRowBandSize w:val="1"/>
@@ -10828,7 +10986,7 @@
       <w:rPr>
         <w:b/>
         <w:bCs/>
-        <w:color w:val="FFFFFF" w:themeColor="background1"/>
+        <w:color w:val="000000"/>
       </w:rPr>
       <w:tblPr/>
       <w:tcPr>
@@ -10840,7 +10998,7 @@
     </w:tblStylePr>
     <w:tblStylePr w:type="firstCol">
       <w:rPr>
-        <w:color w:val="FFFFFF" w:themeColor="background1"/>
+        <w:color w:val="000000"/>
       </w:rPr>
       <w:tblPr/>
       <w:tcPr>
@@ -10857,7 +11015,7 @@
     </w:tblStylePr>
     <w:tblStylePr w:type="lastCol">
       <w:rPr>
-        <w:color w:val="FFFFFF" w:themeColor="background1"/>
+        <w:color w:val="000000"/>
       </w:rPr>
       <w:tblPr/>
       <w:tcPr>
@@ -10894,7 +11052,7 @@
       <w:spacing w:after="0" w:line="240" w:lineRule="auto"/>
     </w:pPr>
     <w:rPr>
-      <w:color w:val="000000" w:themeColor="text1"/>
+      <w:color w:val="000000"/>
     </w:rPr>
     <w:tblPr>
       <w:tblStyleRowBandSize w:val="1"/>
@@ -10940,7 +11098,7 @@
       <w:rPr>
         <w:b/>
         <w:bCs/>
-        <w:color w:val="FFFFFF" w:themeColor="background1"/>
+        <w:color w:val="000000"/>
       </w:rPr>
       <w:tblPr/>
       <w:tcPr>
@@ -10952,7 +11110,7 @@
     </w:tblStylePr>
     <w:tblStylePr w:type="firstCol">
       <w:rPr>
-        <w:color w:val="FFFFFF" w:themeColor="background1"/>
+        <w:color w:val="000000"/>
       </w:rPr>
       <w:tblPr/>
       <w:tcPr>
@@ -10969,7 +11127,7 @@
     </w:tblStylePr>
     <w:tblStylePr w:type="lastCol">
       <w:rPr>
-        <w:color w:val="FFFFFF" w:themeColor="background1"/>
+        <w:color w:val="000000"/>
       </w:rPr>
       <w:tblPr/>
       <w:tcPr>
@@ -10998,12 +11156,12 @@
     </w:tblStylePr>
     <w:tblStylePr w:type="neCell">
       <w:rPr>
-        <w:color w:val="000000" w:themeColor="text1"/>
+        <w:color w:val="000000"/>
       </w:rPr>
     </w:tblStylePr>
     <w:tblStylePr w:type="nwCell">
       <w:rPr>
-        <w:color w:val="000000" w:themeColor="text1"/>
+        <w:color w:val="000000"/>
       </w:rPr>
     </w:tblStylePr>
   </w:style>
@@ -11016,7 +11174,7 @@
       <w:spacing w:after="0" w:line="240" w:lineRule="auto"/>
     </w:pPr>
     <w:rPr>
-      <w:color w:val="000000" w:themeColor="text1"/>
+      <w:color w:val="000000"/>
     </w:rPr>
     <w:tblPr>
       <w:tblStyleRowBandSize w:val="1"/>
@@ -11062,7 +11220,7 @@
       <w:rPr>
         <w:b/>
         <w:bCs/>
-        <w:color w:val="FFFFFF" w:themeColor="background1"/>
+        <w:color w:val="000000"/>
       </w:rPr>
       <w:tblPr/>
       <w:tcPr>
@@ -11074,7 +11232,7 @@
     </w:tblStylePr>
     <w:tblStylePr w:type="firstCol">
       <w:rPr>
-        <w:color w:val="FFFFFF" w:themeColor="background1"/>
+        <w:color w:val="000000"/>
       </w:rPr>
       <w:tblPr/>
       <w:tcPr>
@@ -11091,7 +11249,7 @@
     </w:tblStylePr>
     <w:tblStylePr w:type="lastCol">
       <w:rPr>
-        <w:color w:val="FFFFFF" w:themeColor="background1"/>
+        <w:color w:val="000000"/>
       </w:rPr>
       <w:tblPr/>
       <w:tcPr>
@@ -11120,12 +11278,12 @@
     </w:tblStylePr>
     <w:tblStylePr w:type="neCell">
       <w:rPr>
-        <w:color w:val="000000" w:themeColor="text1"/>
+        <w:color w:val="000000"/>
       </w:rPr>
     </w:tblStylePr>
     <w:tblStylePr w:type="nwCell">
       <w:rPr>
-        <w:color w:val="000000" w:themeColor="text1"/>
+        <w:color w:val="000000"/>
       </w:rPr>
     </w:tblStylePr>
   </w:style>
@@ -11138,7 +11296,7 @@
       <w:spacing w:after="0" w:line="240" w:lineRule="auto"/>
     </w:pPr>
     <w:rPr>
-      <w:color w:val="000000" w:themeColor="text1"/>
+      <w:color w:val="000000"/>
     </w:rPr>
     <w:tblPr>
       <w:tblStyleRowBandSize w:val="1"/>
@@ -11184,7 +11342,7 @@
       <w:rPr>
         <w:b/>
         <w:bCs/>
-        <w:color w:val="FFFFFF" w:themeColor="background1"/>
+        <w:color w:val="000000"/>
       </w:rPr>
       <w:tblPr/>
       <w:tcPr>
@@ -11196,7 +11354,7 @@
     </w:tblStylePr>
     <w:tblStylePr w:type="firstCol">
       <w:rPr>
-        <w:color w:val="FFFFFF" w:themeColor="background1"/>
+        <w:color w:val="000000"/>
       </w:rPr>
       <w:tblPr/>
       <w:tcPr>
@@ -11213,7 +11371,7 @@
     </w:tblStylePr>
     <w:tblStylePr w:type="lastCol">
       <w:rPr>
-        <w:color w:val="FFFFFF" w:themeColor="background1"/>
+        <w:color w:val="000000"/>
       </w:rPr>
       <w:tblPr/>
       <w:tcPr>
@@ -11242,12 +11400,12 @@
     </w:tblStylePr>
     <w:tblStylePr w:type="neCell">
       <w:rPr>
-        <w:color w:val="000000" w:themeColor="text1"/>
+        <w:color w:val="000000"/>
       </w:rPr>
     </w:tblStylePr>
     <w:tblStylePr w:type="nwCell">
       <w:rPr>
-        <w:color w:val="000000" w:themeColor="text1"/>
+        <w:color w:val="000000"/>
       </w:rPr>
     </w:tblStylePr>
   </w:style>
@@ -11260,7 +11418,7 @@
       <w:spacing w:after="0" w:line="240" w:lineRule="auto"/>
     </w:pPr>
     <w:rPr>
-      <w:color w:val="000000" w:themeColor="text1"/>
+      <w:color w:val="000000"/>
     </w:rPr>
     <w:tblPr>
       <w:tblStyleRowBandSize w:val="1"/>
@@ -11280,7 +11438,7 @@
       <w:rPr>
         <w:b/>
         <w:bCs/>
-        <w:color w:val="FFFFFF" w:themeColor="background1"/>
+        <w:color w:val="000000"/>
       </w:rPr>
       <w:tblPr/>
       <w:tcPr>
@@ -11294,7 +11452,7 @@
       <w:rPr>
         <w:b/>
         <w:bCs/>
-        <w:color w:val="9E3A38" w:themeColor="accent2" w:themeShade="CC"/>
+        <w:color w:val="000000"/>
       </w:rPr>
       <w:tblPr/>
       <w:tcPr>
@@ -11346,7 +11504,7 @@
       <w:spacing w:after="0" w:line="240" w:lineRule="auto"/>
     </w:pPr>
     <w:rPr>
-      <w:color w:val="000000" w:themeColor="text1"/>
+      <w:color w:val="000000"/>
     </w:rPr>
     <w:tblPr>
       <w:tblStyleRowBandSize w:val="1"/>
@@ -11366,7 +11524,7 @@
       <w:rPr>
         <w:b/>
         <w:bCs/>
-        <w:color w:val="FFFFFF" w:themeColor="background1"/>
+        <w:color w:val="000000"/>
       </w:rPr>
       <w:tblPr/>
       <w:tcPr>
@@ -11380,7 +11538,7 @@
       <w:rPr>
         <w:b/>
         <w:bCs/>
-        <w:color w:val="9E3A38" w:themeColor="accent2" w:themeShade="CC"/>
+        <w:color w:val="000000"/>
       </w:rPr>
       <w:tblPr/>
       <w:tcPr>
@@ -11432,7 +11590,7 @@
       <w:spacing w:after="0" w:line="240" w:lineRule="auto"/>
     </w:pPr>
     <w:rPr>
-      <w:color w:val="000000" w:themeColor="text1"/>
+      <w:color w:val="000000"/>
     </w:rPr>
     <w:tblPr>
       <w:tblStyleRowBandSize w:val="1"/>
@@ -11452,7 +11610,7 @@
       <w:rPr>
         <w:b/>
         <w:bCs/>
-        <w:color w:val="FFFFFF" w:themeColor="background1"/>
+        <w:color w:val="000000"/>
       </w:rPr>
       <w:tblPr/>
       <w:tcPr>
@@ -11466,7 +11624,7 @@
       <w:rPr>
         <w:b/>
         <w:bCs/>
-        <w:color w:val="9E3A38" w:themeColor="accent2" w:themeShade="CC"/>
+        <w:color w:val="000000"/>
       </w:rPr>
       <w:tblPr/>
       <w:tcPr>
@@ -11518,7 +11676,7 @@
       <w:spacing w:after="0" w:line="240" w:lineRule="auto"/>
     </w:pPr>
     <w:rPr>
-      <w:color w:val="000000" w:themeColor="text1"/>
+      <w:color w:val="000000"/>
     </w:rPr>
     <w:tblPr>
       <w:tblStyleRowBandSize w:val="1"/>
@@ -11538,7 +11696,7 @@
       <w:rPr>
         <w:b/>
         <w:bCs/>
-        <w:color w:val="FFFFFF" w:themeColor="background1"/>
+        <w:color w:val="000000"/>
       </w:rPr>
       <w:tblPr/>
       <w:tcPr>
@@ -11552,7 +11710,7 @@
       <w:rPr>
         <w:b/>
         <w:bCs/>
-        <w:color w:val="664E82" w:themeColor="accent4" w:themeShade="CC"/>
+        <w:color w:val="000000"/>
       </w:rPr>
       <w:tblPr/>
       <w:tcPr>
@@ -11604,7 +11762,7 @@
       <w:spacing w:after="0" w:line="240" w:lineRule="auto"/>
     </w:pPr>
     <w:rPr>
-      <w:color w:val="000000" w:themeColor="text1"/>
+      <w:color w:val="000000"/>
     </w:rPr>
     <w:tblPr>
       <w:tblStyleRowBandSize w:val="1"/>
@@ -11624,7 +11782,7 @@
       <w:rPr>
         <w:b/>
         <w:bCs/>
-        <w:color w:val="FFFFFF" w:themeColor="background1"/>
+        <w:color w:val="000000"/>
       </w:rPr>
       <w:tblPr/>
       <w:tcPr>
@@ -11638,7 +11796,7 @@
       <w:rPr>
         <w:b/>
         <w:bCs/>
-        <w:color w:val="7E9C40" w:themeColor="accent3" w:themeShade="CC"/>
+        <w:color w:val="000000"/>
       </w:rPr>
       <w:tblPr/>
       <w:tcPr>
@@ -11690,7 +11848,7 @@
       <w:spacing w:after="0" w:line="240" w:lineRule="auto"/>
     </w:pPr>
     <w:rPr>
-      <w:color w:val="000000" w:themeColor="text1"/>
+      <w:color w:val="000000"/>
     </w:rPr>
     <w:tblPr>
       <w:tblStyleRowBandSize w:val="1"/>
@@ -11710,7 +11868,7 @@
       <w:rPr>
         <w:b/>
         <w:bCs/>
-        <w:color w:val="FFFFFF" w:themeColor="background1"/>
+        <w:color w:val="000000"/>
       </w:rPr>
       <w:tblPr/>
       <w:tcPr>
@@ -11724,7 +11882,7 @@
       <w:rPr>
         <w:b/>
         <w:bCs/>
-        <w:color w:val="F2730A" w:themeColor="accent6" w:themeShade="CC"/>
+        <w:color w:val="000000"/>
       </w:rPr>
       <w:tblPr/>
       <w:tcPr>
@@ -11776,7 +11934,7 @@
       <w:spacing w:after="0" w:line="240" w:lineRule="auto"/>
     </w:pPr>
     <w:rPr>
-      <w:color w:val="000000" w:themeColor="text1"/>
+      <w:color w:val="000000"/>
     </w:rPr>
     <w:tblPr>
       <w:tblStyleRowBandSize w:val="1"/>
@@ -11796,7 +11954,7 @@
       <w:rPr>
         <w:b/>
         <w:bCs/>
-        <w:color w:val="FFFFFF" w:themeColor="background1"/>
+        <w:color w:val="000000"/>
       </w:rPr>
       <w:tblPr/>
       <w:tcPr>
@@ -11810,7 +11968,7 @@
       <w:rPr>
         <w:b/>
         <w:bCs/>
-        <w:color w:val="348DA5" w:themeColor="accent5" w:themeShade="CC"/>
+        <w:color w:val="000000"/>
       </w:rPr>
       <w:tblPr/>
       <w:tcPr>
@@ -11862,7 +12020,7 @@
       <w:spacing w:after="0" w:line="240" w:lineRule="auto"/>
     </w:pPr>
     <w:rPr>
-      <w:color w:val="000000" w:themeColor="text1"/>
+      <w:color w:val="000000"/>
     </w:rPr>
     <w:tblPr>
       <w:tblStyleRowBandSize w:val="1"/>
@@ -11895,7 +12053,7 @@
       <w:rPr>
         <w:b/>
         <w:bCs/>
-        <w:color w:val="000000" w:themeColor="text1"/>
+        <w:color w:val="000000"/>
       </w:rPr>
       <w:tblPr/>
       <w:tcPr>
@@ -11904,7 +12062,7 @@
     </w:tblStylePr>
     <w:tblStylePr w:type="firstCol">
       <w:rPr>
-        <w:color w:val="FFFFFF" w:themeColor="background1"/>
+        <w:color w:val="000000"/>
       </w:rPr>
       <w:tblPr/>
       <w:tcPr>
@@ -11913,7 +12071,7 @@
     </w:tblStylePr>
     <w:tblStylePr w:type="lastCol">
       <w:rPr>
-        <w:color w:val="FFFFFF" w:themeColor="background1"/>
+        <w:color w:val="000000"/>
       </w:rPr>
       <w:tblPr/>
       <w:tcPr>
@@ -11942,7 +12100,7 @@
       <w:spacing w:after="0" w:line="240" w:lineRule="auto"/>
     </w:pPr>
     <w:rPr>
-      <w:color w:val="000000" w:themeColor="text1"/>
+      <w:color w:val="000000"/>
     </w:rPr>
     <w:tblPr>
       <w:tblStyleRowBandSize w:val="1"/>
@@ -11975,7 +12133,7 @@
       <w:rPr>
         <w:b/>
         <w:bCs/>
-        <w:color w:val="000000" w:themeColor="text1"/>
+        <w:color w:val="000000"/>
       </w:rPr>
       <w:tblPr/>
       <w:tcPr>
@@ -11984,7 +12142,7 @@
     </w:tblStylePr>
     <w:tblStylePr w:type="firstCol">
       <w:rPr>
-        <w:color w:val="FFFFFF" w:themeColor="background1"/>
+        <w:color w:val="000000"/>
       </w:rPr>
       <w:tblPr/>
       <w:tcPr>
@@ -11993,7 +12151,7 @@
     </w:tblStylePr>
     <w:tblStylePr w:type="lastCol">
       <w:rPr>
-        <w:color w:val="FFFFFF" w:themeColor="background1"/>
+        <w:color w:val="000000"/>
       </w:rPr>
       <w:tblPr/>
       <w:tcPr>
@@ -12022,7 +12180,7 @@
       <w:spacing w:after="0" w:line="240" w:lineRule="auto"/>
     </w:pPr>
     <w:rPr>
-      <w:color w:val="000000" w:themeColor="text1"/>
+      <w:color w:val="000000"/>
     </w:rPr>
     <w:tblPr>
       <w:tblStyleRowBandSize w:val="1"/>
@@ -12055,7 +12213,7 @@
       <w:rPr>
         <w:b/>
         <w:bCs/>
-        <w:color w:val="000000" w:themeColor="text1"/>
+        <w:color w:val="000000"/>
       </w:rPr>
       <w:tblPr/>
       <w:tcPr>
@@ -12064,7 +12222,7 @@
     </w:tblStylePr>
     <w:tblStylePr w:type="firstCol">
       <w:rPr>
-        <w:color w:val="FFFFFF" w:themeColor="background1"/>
+        <w:color w:val="000000"/>
       </w:rPr>
       <w:tblPr/>
       <w:tcPr>
@@ -12073,7 +12231,7 @@
     </w:tblStylePr>
     <w:tblStylePr w:type="lastCol">
       <w:rPr>
-        <w:color w:val="FFFFFF" w:themeColor="background1"/>
+        <w:color w:val="000000"/>
       </w:rPr>
       <w:tblPr/>
       <w:tcPr>
@@ -12102,7 +12260,7 @@
       <w:spacing w:after="0" w:line="240" w:lineRule="auto"/>
     </w:pPr>
     <w:rPr>
-      <w:color w:val="000000" w:themeColor="text1"/>
+      <w:color w:val="000000"/>
     </w:rPr>
     <w:tblPr>
       <w:tblStyleRowBandSize w:val="1"/>
@@ -12135,7 +12293,7 @@
       <w:rPr>
         <w:b/>
         <w:bCs/>
-        <w:color w:val="000000" w:themeColor="text1"/>
+        <w:color w:val="000000"/>
       </w:rPr>
       <w:tblPr/>
       <w:tcPr>
@@ -12144,7 +12302,7 @@
     </w:tblStylePr>
     <w:tblStylePr w:type="firstCol">
       <w:rPr>
-        <w:color w:val="FFFFFF" w:themeColor="background1"/>
+        <w:color w:val="000000"/>
       </w:rPr>
       <w:tblPr/>
       <w:tcPr>
@@ -12153,7 +12311,7 @@
     </w:tblStylePr>
     <w:tblStylePr w:type="lastCol">
       <w:rPr>
-        <w:color w:val="FFFFFF" w:themeColor="background1"/>
+        <w:color w:val="000000"/>
       </w:rPr>
       <w:tblPr/>
       <w:tcPr>
@@ -12182,7 +12340,7 @@
       <w:spacing w:after="0" w:line="240" w:lineRule="auto"/>
     </w:pPr>
     <w:rPr>
-      <w:color w:val="000000" w:themeColor="text1"/>
+      <w:color w:val="000000"/>
     </w:rPr>
     <w:tblPr>
       <w:tblStyleRowBandSize w:val="1"/>
@@ -12215,7 +12373,7 @@
       <w:rPr>
         <w:b/>
         <w:bCs/>
-        <w:color w:val="000000" w:themeColor="text1"/>
+        <w:color w:val="000000"/>
       </w:rPr>
       <w:tblPr/>
       <w:tcPr>
@@ -12224,7 +12382,7 @@
     </w:tblStylePr>
     <w:tblStylePr w:type="firstCol">
       <w:rPr>
-        <w:color w:val="FFFFFF" w:themeColor="background1"/>
+        <w:color w:val="000000"/>
       </w:rPr>
       <w:tblPr/>
       <w:tcPr>
@@ -12233,7 +12391,7 @@
     </w:tblStylePr>
     <w:tblStylePr w:type="lastCol">
       <w:rPr>
-        <w:color w:val="FFFFFF" w:themeColor="background1"/>
+        <w:color w:val="000000"/>
       </w:rPr>
       <w:tblPr/>
       <w:tcPr>
@@ -12262,7 +12420,7 @@
       <w:spacing w:after="0" w:line="240" w:lineRule="auto"/>
     </w:pPr>
     <w:rPr>
-      <w:color w:val="000000" w:themeColor="text1"/>
+      <w:color w:val="000000"/>
     </w:rPr>
     <w:tblPr>
       <w:tblStyleRowBandSize w:val="1"/>
@@ -12295,7 +12453,7 @@
       <w:rPr>
         <w:b/>
         <w:bCs/>
-        <w:color w:val="000000" w:themeColor="text1"/>
+        <w:color w:val="000000"/>
       </w:rPr>
       <w:tblPr/>
       <w:tcPr>
@@ -12304,7 +12462,7 @@
     </w:tblStylePr>
     <w:tblStylePr w:type="firstCol">
       <w:rPr>
-        <w:color w:val="FFFFFF" w:themeColor="background1"/>
+        <w:color w:val="000000"/>
       </w:rPr>
       <w:tblPr/>
       <w:tcPr>
@@ -12313,7 +12471,7 @@
     </w:tblStylePr>
     <w:tblStylePr w:type="lastCol">
       <w:rPr>
-        <w:color w:val="FFFFFF" w:themeColor="background1"/>
+        <w:color w:val="000000"/>
       </w:rPr>
       <w:tblPr/>
       <w:tcPr>
@@ -12342,7 +12500,7 @@
       <w:spacing w:after="0" w:line="240" w:lineRule="auto"/>
     </w:pPr>
     <w:rPr>
-      <w:color w:val="000000" w:themeColor="text1"/>
+      <w:color w:val="000000"/>
     </w:rPr>
     <w:tblPr>
       <w:tblStyleRowBandSize w:val="1"/>
@@ -12375,7 +12533,7 @@
       <w:rPr>
         <w:b/>
         <w:bCs/>
-        <w:color w:val="000000" w:themeColor="text1"/>
+        <w:color w:val="000000"/>
       </w:rPr>
       <w:tblPr/>
       <w:tcPr>
@@ -12384,7 +12542,7 @@
     </w:tblStylePr>
     <w:tblStylePr w:type="firstCol">
       <w:rPr>
-        <w:color w:val="FFFFFF" w:themeColor="background1"/>
+        <w:color w:val="000000"/>
       </w:rPr>
       <w:tblPr/>
       <w:tcPr>
@@ -12393,7 +12551,7 @@
     </w:tblStylePr>
     <w:tblStylePr w:type="lastCol">
       <w:rPr>
-        <w:color w:val="FFFFFF" w:themeColor="background1"/>
+        <w:color w:val="000000"/>
       </w:rPr>
       <w:tblPr/>
       <w:tcPr>

</xml_diff>

<commit_message>
Refresh hero, About section, and Flutter résumé
- Hero: "Mobile App Developer" headline, name-first intro, merged
  description, GitHub/LinkedIn links, tighter spacing; remove duplicate
  nav availability pill
- About: illustrated avatar (Notionists, CC0) replaces the 3D portrait;
  stack chips, highlighted intro, interactive capability rows and
  numbered strength cards
- Use official title "Junior Application Developer" across the site
- Flutter résumé: role bullets, leaner skills, split bullets, visible
  links, heading rules, en-dash dates; still one page
- Add 3D device hero assets with credits and ignore local drafts

Co-Authored-By: Claude Opus 5.5 <noreply@anthropic.com>
</commit_message>
<xml_diff>
--- a/public/muhammed-mubashir-k-resume-flutter.docx
+++ b/public/muhammed-mubashir-k-resume-flutter.docx
@@ -68,12 +68,15 @@
           <w:rPr>
             <w:rFonts w:ascii="Calibri" w:hAnsi="Calibri"/>
             <w:color w:val="000000"/>
-            <w:sz w:val="21"/>
+            <w:sz w:val="19"/>
           </w:rPr>
-          <w:t>Portfolio</w:t>
+          <w:t>muhammed-mubashir-portfolio.netlify.app</w:t>
         </w:r>
       </w:hyperlink>
       <w:r>
+        <w:rPr>
+          <w:sz w:val="19"/>
+        </w:rPr>
         <w:t xml:space="preserve"> | </w:t>
       </w:r>
       <w:hyperlink r:id="rId12">
@@ -81,12 +84,15 @@
           <w:rPr>
             <w:rFonts w:ascii="Calibri" w:hAnsi="Calibri"/>
             <w:color w:val="000000"/>
-            <w:sz w:val="21"/>
+            <w:sz w:val="19"/>
           </w:rPr>
-          <w:t>GitHub</w:t>
+          <w:t>github.com/MuhammedMubashir-dev</w:t>
         </w:r>
       </w:hyperlink>
       <w:r>
+        <w:rPr>
+          <w:sz w:val="19"/>
+        </w:rPr>
         <w:t xml:space="preserve"> | </w:t>
       </w:r>
       <w:hyperlink r:id="rId13">
@@ -94,15 +100,18 @@
           <w:rPr>
             <w:rFonts w:ascii="Calibri" w:hAnsi="Calibri"/>
             <w:color w:val="000000"/>
-            <w:sz w:val="21"/>
+            <w:sz w:val="19"/>
           </w:rPr>
-          <w:t>LinkedIn</w:t>
+          <w:t>linkedin.com/in/muhammed-mubashir-k</w:t>
         </w:r>
       </w:hyperlink>
     </w:p>
     <w:p>
       <w:pPr>
         <w:pStyle w:val="Heading1"/>
+        <w:pBdr>
+          <w:bottom w:val="single" w:sz="4" w:space="1" w:color="000000"/>
+        </w:pBdr>
       </w:pPr>
       <w:r>
         <w:t>Professional Summary</w:t>
@@ -123,6 +132,9 @@
     <w:p>
       <w:pPr>
         <w:pStyle w:val="Heading1"/>
+        <w:pBdr>
+          <w:bottom w:val="single" w:sz="4" w:space="1" w:color="000000"/>
+        </w:pBdr>
       </w:pPr>
       <w:r>
         <w:t>Technical Skills</w:t>
@@ -145,7 +157,7 @@
         <w:t xml:space="preserve">Mobile: </w:t>
       </w:r>
       <w:r>
-        <w:t>Flutter, Dart, Provider, ChangeNotifier, setState, React Native, responsive UI</w:t>
+        <w:t>Flutter, Dart, Provider, React Native, Android and iOS, responsive UI</w:t>
       </w:r>
     </w:p>
     <w:p>
@@ -165,7 +177,7 @@
         <w:t xml:space="preserve">Integrations: </w:t>
       </w:r>
       <w:r>
-        <w:t>REST APIs, JSON, Razorpay, Google Maps, PDF and USB receipt printing, Arabic and RTL</w:t>
+        <w:t>REST APIs, Razorpay, Google Maps, PDF and USB receipt printing, Arabic/RTL localization</w:t>
       </w:r>
     </w:p>
     <w:p>
@@ -185,7 +197,7 @@
         <w:t xml:space="preserve">Engineering: </w:t>
       </w:r>
       <w:r>
-        <w:t>Git, GitHub, Postman, unit and widget tests, pagination, API error handling</w:t>
+        <w:t>Git, GitHub, Postman, unit and widget testing</w:t>
       </w:r>
     </w:p>
     <w:p>
@@ -205,12 +217,15 @@
         <w:t xml:space="preserve">Supporting web: </w:t>
       </w:r>
       <w:r>
-        <w:t>React, Next.js, JavaScript, TypeScript, Tailwind CSS, Stripe, ISR, i18n</w:t>
+        <w:t>React, Next.js, JavaScript, TypeScript, Tailwind CSS, Stripe</w:t>
       </w:r>
     </w:p>
     <w:p>
       <w:pPr>
         <w:pStyle w:val="Heading1"/>
+        <w:pBdr>
+          <w:bottom w:val="single" w:sz="4" w:space="1" w:color="000000"/>
+        </w:pBdr>
       </w:pPr>
       <w:r>
         <w:t>Work Experience</w:t>
@@ -225,7 +240,7 @@
         <w:rPr>
           <w:b/>
         </w:rPr>
-        <w:t>ENKE Consulting Services LLP | Apr 2026 - Present</w:t>
+        <w:t>ENKE Consulting Services LLP | Apr 2026 – Present</w:t>
       </w:r>
     </w:p>
     <w:p>
@@ -237,19 +252,7 @@
         <w:rPr>
           <w:b/>
         </w:rPr>
-        <w:t>Junior Full Stack Developer | Jul 2026 - Present</w:t>
-      </w:r>
-    </w:p>
-    <w:p>
-      <w:pPr>
-        <w:keepNext/>
-        <w:spacing w:before="0" w:after="50"/>
-      </w:pPr>
-      <w:r>
-        <w:rPr>
-          <w:b w:val="0"/>
-        </w:rPr>
-        <w:t>Full Stack Developer Trainee | Apr 2026 - Jul 2026</w:t>
+        <w:t>Junior Application Developer | Jul 2026 – Present</w:t>
       </w:r>
     </w:p>
     <w:p>
@@ -262,12 +265,66 @@
         <w:rPr>
           <w:b w:val="0"/>
         </w:rPr>
-        <w:t>• Contribute features and fixes across company mobile and web applications; collaborate with backend developers on API contracts and review changes through Git pull requests.</w:t>
+        <w:t>• Develop and maintain features in existing Flutter codebases for POS, laundry ordering, and staff delivery apps.</w:t>
+      </w:r>
+    </w:p>
+    <w:p>
+      <w:pPr>
+        <w:keepNext w:val="0"/>
+        <w:spacing w:before="0" w:after="60"/>
+        <w:ind w:left="187" w:hanging="187"/>
+      </w:pPr>
+      <w:r>
+        <w:rPr>
+          <w:b w:val="0"/>
+        </w:rPr>
+        <w:t>• Coordinate API contracts with backend developers and investigate request, payload, and authentication issues.</w:t>
+      </w:r>
+    </w:p>
+    <w:p>
+      <w:pPr>
+        <w:keepNext w:val="0"/>
+        <w:spacing w:before="0" w:after="60"/>
+        <w:ind w:left="187" w:hanging="187"/>
+      </w:pPr>
+      <w:r>
+        <w:rPr>
+          <w:b w:val="0"/>
+        </w:rPr>
+        <w:t>• Verify changes with unit, widget, and regression tests, and support Android and iOS release configuration.</w:t>
+      </w:r>
+    </w:p>
+    <w:p>
+      <w:pPr>
+        <w:keepNext/>
+        <w:spacing w:before="40" w:after="50"/>
+      </w:pPr>
+      <w:r>
+        <w:rPr>
+          <w:b w:val="0"/>
+        </w:rPr>
+        <w:t>Full Stack Developer Trainee | Apr 2026 – Jul 2026</w:t>
+      </w:r>
+    </w:p>
+    <w:p>
+      <w:pPr>
+        <w:keepNext w:val="0"/>
+        <w:spacing w:before="0" w:after="60"/>
+        <w:ind w:left="187" w:hanging="187"/>
+      </w:pPr>
+      <w:r>
+        <w:rPr>
+          <w:b w:val="0"/>
+        </w:rPr>
+        <w:t>• Implemented Flutter interfaces and REST API integration for pickup and delivery workflows.</w:t>
       </w:r>
     </w:p>
     <w:p>
       <w:pPr>
         <w:pStyle w:val="Heading1"/>
+        <w:pBdr>
+          <w:bottom w:val="single" w:sz="4" w:space="1" w:color="000000"/>
+        </w:pBdr>
       </w:pPr>
       <w:r>
         <w:t>Selected Company Projects</w:t>
@@ -308,7 +365,7 @@
         <w:rPr>
           <w:b w:val="0"/>
         </w:rPr>
-        <w:t>• Built shift opening and Day Close workflows with cash-denomination calculations and pending-close alerts; implemented purchase-return, packing, and shipping workflows.</w:t>
+        <w:t>• Built shift opening and Day Close workflows with cash-denomination calculations and pending-close alerts.</w:t>
       </w:r>
     </w:p>
     <w:p>
@@ -321,7 +378,7 @@
         <w:rPr>
           <w:b w:val="0"/>
         </w:rPr>
-        <w:t>• Developed responsive reporting and transaction listings with shared filters and Excel exports that fetch all matching pages and reject duplicate or incomplete results.</w:t>
+        <w:t>• Implemented purchase-return, packing, and shipping workflows.</w:t>
       </w:r>
     </w:p>
     <w:p>
@@ -334,7 +391,20 @@
         <w:rPr>
           <w:b w:val="0"/>
         </w:rPr>
-        <w:t>• Fixed English/Arabic invoice rendering, USB printing, barcode pricing, and variant stock isolation; guarded invoice loading against stale responses and added regression tests.</w:t>
+        <w:t>• Developed reporting and transaction listings with shared filters and validated Excel exports.</w:t>
+      </w:r>
+    </w:p>
+    <w:p>
+      <w:pPr>
+        <w:keepNext w:val="0"/>
+        <w:spacing w:before="0" w:after="60"/>
+        <w:ind w:left="187" w:hanging="187"/>
+      </w:pPr>
+      <w:r>
+        <w:rPr>
+          <w:b w:val="0"/>
+        </w:rPr>
+        <w:t>• Fixed English/Arabic invoice rendering, USB printing, barcode pricing, and stock isolation, with regression tests.</w:t>
       </w:r>
     </w:p>
     <w:p>
@@ -367,7 +437,7 @@
         <w:rPr>
           <w:b w:val="0"/>
         </w:rPr>
-        <w:t>• Integrated Razorpay checkout and corrected payment-confirmation messaging; reduced My Orders API requests from six to two by reusing responses for lists and counts.</w:t>
+        <w:t>• Integrated Razorpay checkout and corrected payment-confirmation messaging.</w:t>
       </w:r>
     </w:p>
     <w:p>
@@ -380,7 +450,20 @@
         <w:rPr>
           <w:b w:val="0"/>
         </w:rPr>
-        <w:t>• Added optional and mandatory update prompts and maintenance handling; improved cart responsiveness, authentication navigation, and saved-address management.</w:t>
+        <w:t>• Reduced My Orders API requests from six to two by reusing responses for lists and counts.</w:t>
+      </w:r>
+    </w:p>
+    <w:p>
+      <w:pPr>
+        <w:keepNext w:val="0"/>
+        <w:spacing w:before="0" w:after="60"/>
+        <w:ind w:left="187" w:hanging="187"/>
+      </w:pPr>
+      <w:r>
+        <w:rPr>
+          <w:b w:val="0"/>
+        </w:rPr>
+        <w:t>• Added update prompts and maintenance-mode handling, and improved cart, login navigation, and saved addresses.</w:t>
       </w:r>
     </w:p>
     <w:p>
@@ -405,7 +488,7 @@
         </w:r>
       </w:hyperlink>
       <w:r>
-        <w:t xml:space="preserve"> | Staff Pickup and Delivery | Flutter, setState</w:t>
+        <w:t xml:space="preserve"> | Staff Pickup and Delivery | Flutter</w:t>
       </w:r>
     </w:p>
     <w:p>
@@ -418,7 +501,20 @@
         <w:rPr>
           <w:b w:val="0"/>
         </w:rPr>
-        <w:t>• Implemented independent pagination and date filters across four delivery stages, Google Maps navigation, and saved locations; improved six-digit OTP entry and empty/error loading states.</w:t>
+        <w:t>• Implemented independent pagination and date filters across four delivery stages.</w:t>
+      </w:r>
+    </w:p>
+    <w:p>
+      <w:pPr>
+        <w:keepNext w:val="0"/>
+        <w:spacing w:before="0" w:after="60"/>
+        <w:ind w:left="187" w:hanging="187"/>
+      </w:pPr>
+      <w:r>
+        <w:rPr>
+          <w:b w:val="0"/>
+        </w:rPr>
+        <w:t>• Added Google Maps navigation and saved locations, and improved OTP entry and empty/error states.</w:t>
       </w:r>
     </w:p>
     <w:p>
@@ -451,12 +547,15 @@
         <w:rPr>
           <w:b w:val="0"/>
         </w:rPr>
-        <w:t>• Implemented LinkedIn login on Android and iOS using PKCE and native authentication modules; resolved deferred deep-link startup and navigation issues.</w:t>
+        <w:t>• Implemented LinkedIn login on Android and iOS with PKCE and native modules, and fixed deferred deep links.</w:t>
       </w:r>
     </w:p>
     <w:p>
       <w:pPr>
         <w:pStyle w:val="Heading1"/>
+        <w:pBdr>
+          <w:bottom w:val="single" w:sz="4" w:space="1" w:color="000000"/>
+        </w:pBdr>
       </w:pPr>
       <w:r>
         <w:t>Supporting Web Experience</w:t>
@@ -477,6 +576,9 @@
     <w:p>
       <w:pPr>
         <w:pStyle w:val="Heading1"/>
+        <w:pBdr>
+          <w:bottom w:val="single" w:sz="4" w:space="1" w:color="000000"/>
+        </w:pBdr>
       </w:pPr>
       <w:r>
         <w:t>Education</w:t>
@@ -491,7 +593,7 @@
         <w:rPr>
           <w:b/>
         </w:rPr>
-        <w:t>Bachelor of Computer Applications | 2023 - 2026</w:t>
+        <w:t>Bachelor of Computer Applications | 2023 – 2026</w:t>
       </w:r>
     </w:p>
     <w:p>

</xml_diff>

<commit_message>
Make the general résumé the portfolio download
One-page Junior Full Stack Developer résumé replaces the Flutter-only
version; DOCX from the tailored builder, PDF exported from Word.

Co-Authored-By: Claude Fable 5.1 <noreply@anthropic.com>
</commit_message>
<xml_diff>
--- a/public/muhammed-mubashir-k-resume-flutter.docx
+++ b/public/muhammed-mubashir-k-resume-flutter.docx
@@ -11,145 +11,317 @@
       </w:r>
     </w:p>
     <w:p>
-      <w:pPr>
-        <w:pStyle w:val="Subtitle"/>
-      </w:pPr>
       <w:r>
-        <w:t>Flutter Developer</w:t>
+        <w:rPr>
+          <w:b/>
+        </w:rPr>
+        <w:t>Junior Full Stack Developer  |  Flutter, React Native, Next.js, Node.js</w:t>
       </w:r>
     </w:p>
     <w:p>
-      <w:pPr>
-        <w:keepNext w:val="0"/>
-        <w:spacing w:before="0" w:after="50"/>
-      </w:pPr>
       <w:r>
-        <w:rPr>
-          <w:b w:val="0"/>
-        </w:rPr>
-        <w:t xml:space="preserve">Malappuram, Kerala, India | </w:t>
+        <w:t>Malappuram, Kerala, India (open to remote and relocation)</w:t>
+      </w:r>
+      <w:r>
+        <w:t xml:space="preserve">  |  </w:t>
       </w:r>
       <w:hyperlink r:id="rId9">
         <w:r>
           <w:rPr>
+            <w:color w:val="000000"/>
+            <w:sz w:val="19"/>
             <w:rFonts w:ascii="Calibri" w:hAnsi="Calibri"/>
-            <w:color w:val="000000"/>
-            <w:sz w:val="21"/>
           </w:rPr>
           <w:t>+91 8089433955</w:t>
         </w:r>
       </w:hyperlink>
       <w:r>
-        <w:t xml:space="preserve"> | </w:t>
+        <w:t xml:space="preserve">  |  </w:t>
       </w:r>
       <w:hyperlink r:id="rId10">
         <w:r>
           <w:rPr>
+            <w:color w:val="000000"/>
+            <w:sz w:val="19"/>
             <w:rFonts w:ascii="Calibri" w:hAnsi="Calibri"/>
-            <w:color w:val="000000"/>
-            <w:sz w:val="21"/>
           </w:rPr>
           <w:t>muhammedmubashir720@gmail.com</w:t>
         </w:r>
       </w:hyperlink>
     </w:p>
     <w:p>
-      <w:pPr>
-        <w:keepNext w:val="0"/>
-        <w:spacing w:before="0" w:after="50"/>
-      </w:pPr>
-      <w:r>
-        <w:rPr>
-          <w:b w:val="0"/>
-        </w:rPr>
-      </w:r>
       <w:hyperlink r:id="rId11">
         <w:r>
           <w:rPr>
-            <w:rFonts w:ascii="Calibri" w:hAnsi="Calibri"/>
             <w:color w:val="000000"/>
             <w:sz w:val="19"/>
+            <w:rFonts w:ascii="Calibri" w:hAnsi="Calibri"/>
           </w:rPr>
-          <w:t>muhammed-mubashir-portfolio.netlify.app</w:t>
+          <w:t>Portfolio</w:t>
         </w:r>
       </w:hyperlink>
       <w:r>
-        <w:rPr>
-          <w:sz w:val="19"/>
-        </w:rPr>
-        <w:t xml:space="preserve"> | </w:t>
+        <w:t xml:space="preserve">  |  </w:t>
       </w:r>
       <w:hyperlink r:id="rId12">
         <w:r>
           <w:rPr>
-            <w:rFonts w:ascii="Calibri" w:hAnsi="Calibri"/>
             <w:color w:val="000000"/>
             <w:sz w:val="19"/>
+            <w:rFonts w:ascii="Calibri" w:hAnsi="Calibri"/>
           </w:rPr>
-          <w:t>github.com/MuhammedMubashir-dev</w:t>
+          <w:t>GitHub</w:t>
         </w:r>
       </w:hyperlink>
       <w:r>
-        <w:rPr>
-          <w:sz w:val="19"/>
-        </w:rPr>
-        <w:t xml:space="preserve"> | </w:t>
+        <w:t xml:space="preserve">  |  </w:t>
       </w:r>
       <w:hyperlink r:id="rId13">
         <w:r>
           <w:rPr>
-            <w:rFonts w:ascii="Calibri" w:hAnsi="Calibri"/>
             <w:color w:val="000000"/>
             <w:sz w:val="19"/>
+            <w:rFonts w:ascii="Calibri" w:hAnsi="Calibri"/>
           </w:rPr>
-          <w:t>linkedin.com/in/muhammed-mubashir-k</w:t>
+          <w:t>LinkedIn</w:t>
         </w:r>
       </w:hyperlink>
     </w:p>
     <w:p>
       <w:pPr>
         <w:pStyle w:val="Heading1"/>
-        <w:pBdr>
-          <w:bottom w:val="single" w:sz="4" w:space="1" w:color="000000"/>
-        </w:pBdr>
       </w:pPr>
       <w:r>
-        <w:t>Professional Summary</w:t>
+        <w:t>Summary</w:t>
       </w:r>
     </w:p>
     <w:p>
-      <w:pPr>
-        <w:keepNext w:val="0"/>
-        <w:spacing w:before="0" w:after="50"/>
-      </w:pPr>
       <w:r>
         <w:rPr>
           <w:b w:val="0"/>
         </w:rPr>
-        <w:t>Flutter developer with company experience building and maintaining POS, customer ordering, and delivery applications using Dart, Provider, and REST APIs. Contributions include cash management, bilingual printing, payments, reporting, and regression tests. Additional React Native experience covers Android and iOS authentication and deep linking.</w:t>
+        <w:t>Junior full stack developer with six production apps shipped at ENKE Consulting since April 2026 and 71 merged pull requests across Flutter, React Native, and Next.js codebases. Flutter is my main stack: point-of-sale, delivery, and customer ordering apps with payments, bilingual interfaces, and regression tests. I also build the other layers, with Next.js storefronts at work and a Node.js, Express, and PostgreSQL backend for my own marketplace project, and I ship complete flows with the loading, empty, error, and retry states handled.</w:t>
       </w:r>
     </w:p>
     <w:p>
       <w:pPr>
         <w:pStyle w:val="Heading1"/>
-        <w:pBdr>
-          <w:bottom w:val="single" w:sz="4" w:space="1" w:color="000000"/>
-        </w:pBdr>
       </w:pPr>
       <w:r>
-        <w:t>Technical Skills</w:t>
+        <w:t>Shipped at ENKE Consulting (production, since April 2026)</w:t>
+      </w:r>
+    </w:p>
+    <w:p>
+      <w:r>
+        <w:rPr>
+          <w:b/>
+        </w:rPr>
+        <w:t>EPOSMOB  |  Flutter point of sale  |  52 merged PRs since July 2026</w:t>
       </w:r>
     </w:p>
     <w:p>
       <w:pPr>
-        <w:keepNext w:val="0"/>
-        <w:spacing w:before="0" w:after="50"/>
+        <w:pStyle w:val="ListBullet"/>
+        <w:ind w:left="202" w:hanging="202"/>
       </w:pPr>
       <w:r>
+        <w:t>Consolidated 25+ list and report screens onto one shared listing UI with validated Excel export that fetches every page and rejects duplicate or incomplete results.</w:t>
+      </w:r>
+    </w:p>
+    <w:p>
+      <w:pPr>
+        <w:pStyle w:val="ListBullet"/>
+        <w:ind w:left="202" w:hanging="202"/>
+      </w:pPr>
+      <w:r>
+        <w:t>Built Day Close with cash-denomination validation, bilingual English/Arabic receipts and PDF invoices, and regression tests for pagination, stale responses, and filter state.</w:t>
+      </w:r>
+    </w:p>
+    <w:p>
+      <w:hyperlink r:id="rId14">
+        <w:r>
+          <w:rPr>
+            <w:color w:val="000000"/>
+            <w:sz w:val="19"/>
+            <w:rFonts w:ascii="Calibri" w:hAnsi="Calibri"/>
+          </w:rPr>
+          <w:t>EPOSMOB case study</w:t>
+        </w:r>
+      </w:hyperlink>
+    </w:p>
+    <w:p>
+      <w:r>
         <w:rPr>
-          <w:b w:val="0"/>
+          <w:b/>
         </w:rPr>
+        <w:t>Ganvin Customer and Executive  |  Flutter delivery apps</w:t>
       </w:r>
+    </w:p>
+    <w:p>
+      <w:pPr>
+        <w:pStyle w:val="ListBullet"/>
+        <w:ind w:left="202" w:hanging="202"/>
+      </w:pPr>
+      <w:r>
+        <w:t>Integrated Razorpay checkout with correct confirmation states, plus optional and mandatory update prompts and a maintenance mode; cut order-history API calls from six to two by reusing responses.</w:t>
+      </w:r>
+    </w:p>
+    <w:p>
+      <w:pPr>
+        <w:pStyle w:val="ListBullet"/>
+        <w:ind w:left="202" w:hanging="202"/>
+      </w:pPr>
+      <w:r>
+        <w:t>Implemented independent pagination and date filters per delivery stage, fixed OTP and endless-loading failures, and traced missing orders to a server timezone mismatch with the backend team.</w:t>
+      </w:r>
+    </w:p>
+    <w:p>
+      <w:hyperlink r:id="rId15">
+        <w:r>
+          <w:rPr>
+            <w:color w:val="000000"/>
+            <w:sz w:val="19"/>
+            <w:rFonts w:ascii="Calibri" w:hAnsi="Calibri"/>
+          </w:rPr>
+          <w:t>Ganvin case study</w:t>
+        </w:r>
+      </w:hyperlink>
+    </w:p>
+    <w:p>
+      <w:r>
+        <w:rPr>
+          <w:b/>
+        </w:rPr>
+        <w:t>Connect App  |  React Native, Kotlin, Swift</w:t>
+      </w:r>
+    </w:p>
+    <w:p>
+      <w:pPr>
+        <w:pStyle w:val="ListBullet"/>
+        <w:ind w:left="202" w:hanging="202"/>
+      </w:pPr>
+      <w:r>
+        <w:t>Implemented LinkedIn sign-in with PKCE and native modules on Android and iOS, kept deferred deep links alive through app startup, and added authentication regression tests.</w:t>
+      </w:r>
+    </w:p>
+    <w:p>
+      <w:r>
+        <w:rPr>
+          <w:b/>
+        </w:rPr>
+        <w:t>CloudPOS and Juice World  |  Next.js storefronts</w:t>
+      </w:r>
+    </w:p>
+    <w:p>
+      <w:pPr>
+        <w:pStyle w:val="ListBullet"/>
+        <w:ind w:left="202" w:hanging="202"/>
+      </w:pPr>
+      <w:r>
+        <w:t>Delivered tenant-aware Stripe and Razorpay checkout, reusable theme packs, and an English/Arabic right-to-left storefront with ISR and SEO metadata.</w:t>
+      </w:r>
+    </w:p>
+    <w:p>
+      <w:pPr>
+        <w:pStyle w:val="Heading1"/>
+      </w:pPr>
+      <w:r>
+        <w:t>Personal projects (built end to end)</w:t>
+      </w:r>
+    </w:p>
+    <w:p>
+      <w:r>
+        <w:rPr>
+          <w:b/>
+        </w:rPr>
+        <w:t>Laundry pickup and delivery marketplace  |  Flutter, Express, PostgreSQL  |  2026, private repos, demo on request</w:t>
+      </w:r>
+    </w:p>
+    <w:p>
+      <w:pPr>
+        <w:pStyle w:val="ListBullet"/>
+        <w:ind w:left="202" w:hanging="202"/>
+      </w:pPr>
+      <w:r>
+        <w:t>Three Flutter apps (customer, rider, shop) in one Dart workspace sharing a core package: dio client with rotating refresh tokens, Socket.io live tracking, OTP login, and Firebase push wired behind config.</w:t>
+      </w:r>
+    </w:p>
+    <w:p>
+      <w:pPr>
+        <w:pStyle w:val="ListBullet"/>
+        <w:ind w:left="202" w:hanging="202"/>
+      </w:pPr>
+      <w:r>
+        <w:t>Express 5 API on PostgreSQL with PostGIS nearby-shop search, pickup slots, rider assignment, and an end-to-end order-flow test; React and Vite admin panel for shops, riders, and orders.</w:t>
+      </w:r>
+    </w:p>
+    <w:p>
+      <w:r>
+        <w:rPr>
+          <w:b/>
+        </w:rPr>
+        <w:t>StockFlow  |  Offline-first Flutter inventory app  |  public, GitHub Actions CI, Android release</w:t>
+      </w:r>
+    </w:p>
+    <w:p>
+      <w:pPr>
+        <w:pStyle w:val="ListBullet"/>
+        <w:ind w:left="202" w:hanging="202"/>
+      </w:pPr>
+      <w:r>
+        <w:t>Riverpod state with repository, domain, and presentation layers; responsive Material 3 for phone, tablet, and web; English/Arabic RTL; light and dark themes; widget tests on the dashboard flow.</w:t>
+      </w:r>
+    </w:p>
+    <w:p>
+      <w:hyperlink r:id="rId16">
+        <w:r>
+          <w:rPr>
+            <w:color w:val="000000"/>
+            <w:sz w:val="19"/>
+            <w:rFonts w:ascii="Calibri" w:hAnsi="Calibri"/>
+          </w:rPr>
+          <w:t>github.com/MuhammedMubashir-dev/stockflow-flutter</w:t>
+        </w:r>
+      </w:hyperlink>
+    </w:p>
+    <w:p>
+      <w:r>
+        <w:rPr>
+          <w:b/>
+        </w:rPr>
+        <w:t>Next.js e-commerce store  |  live on Vercel</w:t>
+      </w:r>
+    </w:p>
+    <w:p>
+      <w:pPr>
+        <w:pStyle w:val="ListBullet"/>
+        <w:ind w:left="202" w:hanging="202"/>
+      </w:pPr>
+      <w:r>
+        <w:t>App Router storefront with ISR, Algolia typo-tolerant search, category filters, persistent cart and checkout, and React Hook Form with Zod validation.</w:t>
+      </w:r>
+    </w:p>
+    <w:p>
+      <w:hyperlink r:id="rId17">
+        <w:r>
+          <w:rPr>
+            <w:color w:val="000000"/>
+            <w:sz w:val="19"/>
+            <w:rFonts w:ascii="Calibri" w:hAnsi="Calibri"/>
+          </w:rPr>
+          <w:t>nextjs-ecommerce-amber.vercel.app</w:t>
+        </w:r>
+      </w:hyperlink>
+    </w:p>
+    <w:p>
+      <w:pPr>
+        <w:pStyle w:val="Heading1"/>
+      </w:pPr>
+      <w:r>
+        <w:t>Skills</w:t>
+      </w:r>
+    </w:p>
+    <w:p>
       <w:r>
         <w:rPr>
           <w:b/>
@@ -157,460 +329,103 @@
         <w:t xml:space="preserve">Mobile: </w:t>
       </w:r>
       <w:r>
-        <w:t>Flutter, Dart, Provider, React Native, Android and iOS, responsive UI</w:t>
+        <w:t>Flutter, Dart, Provider, Riverpod, React Native, TypeScript, Android and iOS releases</w:t>
       </w:r>
     </w:p>
     <w:p>
-      <w:pPr>
-        <w:keepNext w:val="0"/>
-        <w:spacing w:before="0" w:after="50"/>
-      </w:pPr>
-      <w:r>
-        <w:rPr>
-          <w:b w:val="0"/>
-        </w:rPr>
-      </w:r>
       <w:r>
         <w:rPr>
           <w:b/>
         </w:rPr>
-        <w:t xml:space="preserve">Integrations: </w:t>
+        <w:t xml:space="preserve">Web: </w:t>
       </w:r>
       <w:r>
-        <w:t>REST APIs, Razorpay, Google Maps, PDF and USB receipt printing, Arabic/RTL localization</w:t>
+        <w:t>React, Next.js, Tailwind CSS, ISR, SEO</w:t>
       </w:r>
     </w:p>
     <w:p>
-      <w:pPr>
-        <w:keepNext w:val="0"/>
-        <w:spacing w:before="0" w:after="50"/>
-      </w:pPr>
-      <w:r>
-        <w:rPr>
-          <w:b w:val="0"/>
-        </w:rPr>
-      </w:r>
       <w:r>
         <w:rPr>
           <w:b/>
         </w:rPr>
-        <w:t xml:space="preserve">Engineering: </w:t>
+        <w:t xml:space="preserve">Backend and data: </w:t>
       </w:r>
       <w:r>
-        <w:t>Git, GitHub, Postman, unit and widget testing</w:t>
+        <w:t>Node.js, Express, PostgreSQL and PostGIS, REST APIs, JWT, Socket.io, Firebase</w:t>
       </w:r>
     </w:p>
     <w:p>
-      <w:pPr>
-        <w:keepNext w:val="0"/>
-        <w:spacing w:before="0" w:after="50"/>
-      </w:pPr>
-      <w:r>
-        <w:rPr>
-          <w:b w:val="0"/>
-        </w:rPr>
-      </w:r>
       <w:r>
         <w:rPr>
           <w:b/>
         </w:rPr>
-        <w:t xml:space="preserve">Supporting web: </w:t>
+        <w:t xml:space="preserve">Practice: </w:t>
       </w:r>
       <w:r>
-        <w:t>React, Next.js, JavaScript, TypeScript, Tailwind CSS, Stripe</w:t>
+        <w:t>Unit, widget, and regression tests; GitHub Actions CI; Postman; Git; AI-assisted development with Claude Code and Codex, every change reviewed</w:t>
       </w:r>
     </w:p>
     <w:p>
       <w:pPr>
         <w:pStyle w:val="Heading1"/>
-        <w:pBdr>
-          <w:bottom w:val="single" w:sz="4" w:space="1" w:color="000000"/>
-        </w:pBdr>
       </w:pPr>
       <w:r>
-        <w:t>Work Experience</w:t>
+        <w:t>Experience</w:t>
+      </w:r>
+    </w:p>
+    <w:p>
+      <w:r>
+        <w:rPr>
+          <w:b/>
+        </w:rPr>
+        <w:t>ENKE Consulting Services LLP, Kerala  |  Apr 2026 - Present</w:t>
       </w:r>
     </w:p>
     <w:p>
       <w:pPr>
-        <w:keepNext/>
-        <w:spacing w:before="0" w:after="50"/>
+        <w:pStyle w:val="ListBullet"/>
+        <w:ind w:left="202" w:hanging="202"/>
       </w:pPr>
       <w:r>
-        <w:rPr>
-          <w:b/>
-        </w:rPr>
-        <w:t>ENKE Consulting Services LLP | Apr 2026 – Present</w:t>
+        <w:t>Junior Full Stack Developer (Jul 2026 - Present, permanent from Oct 2026): feature development across POS, delivery, and commerce products; API contracts agreed with backend developers before building screens.</w:t>
       </w:r>
     </w:p>
     <w:p>
       <w:pPr>
-        <w:keepNext/>
-        <w:spacing w:before="0" w:after="50"/>
+        <w:pStyle w:val="ListBullet"/>
+        <w:ind w:left="202" w:hanging="202"/>
       </w:pPr>
       <w:r>
-        <w:rPr>
-          <w:b/>
-        </w:rPr>
-        <w:t>Junior Full Stack Developer | Jul 2026 – Present</w:t>
-      </w:r>
-    </w:p>
-    <w:p>
-      <w:pPr>
-        <w:keepNext w:val="0"/>
-        <w:spacing w:before="0" w:after="60"/>
-        <w:ind w:left="187" w:hanging="187"/>
-      </w:pPr>
-      <w:r>
-        <w:rPr>
-          <w:b w:val="0"/>
-        </w:rPr>
-        <w:t>• Develop and maintain features in existing Flutter codebases for POS, laundry ordering, and staff delivery apps.</w:t>
-      </w:r>
-    </w:p>
-    <w:p>
-      <w:pPr>
-        <w:keepNext w:val="0"/>
-        <w:spacing w:before="0" w:after="60"/>
-        <w:ind w:left="187" w:hanging="187"/>
-      </w:pPr>
-      <w:r>
-        <w:rPr>
-          <w:b w:val="0"/>
-        </w:rPr>
-        <w:t>• Coordinate API contracts with backend developers and investigate request, payload, and authentication issues.</w:t>
-      </w:r>
-    </w:p>
-    <w:p>
-      <w:pPr>
-        <w:keepNext w:val="0"/>
-        <w:spacing w:before="0" w:after="60"/>
-        <w:ind w:left="187" w:hanging="187"/>
-      </w:pPr>
-      <w:r>
-        <w:rPr>
-          <w:b w:val="0"/>
-        </w:rPr>
-        <w:t>• Verify changes with unit, widget, and regression tests, and support Android and iOS release configuration.</w:t>
-      </w:r>
-    </w:p>
-    <w:p>
-      <w:pPr>
-        <w:keepNext/>
-        <w:spacing w:before="40" w:after="50"/>
-      </w:pPr>
-      <w:r>
-        <w:rPr>
-          <w:b w:val="0"/>
-        </w:rPr>
-        <w:t>Full Stack Developer Trainee | Apr 2026 – Jul 2026</w:t>
-      </w:r>
-    </w:p>
-    <w:p>
-      <w:pPr>
-        <w:keepNext w:val="0"/>
-        <w:spacing w:before="0" w:after="60"/>
-        <w:ind w:left="187" w:hanging="187"/>
-      </w:pPr>
-      <w:r>
-        <w:rPr>
-          <w:b w:val="0"/>
-        </w:rPr>
-        <w:t>• Implemented Flutter interfaces and REST API integration for pickup and delivery workflows.</w:t>
+        <w:t>Full Stack Developer Trainee (Apr - Jul 2026): Flutter interfaces and REST integration for pickup and delivery workflows; shared React and Next.js storefront components. Promoted after three months.</w:t>
       </w:r>
     </w:p>
     <w:p>
       <w:pPr>
         <w:pStyle w:val="Heading1"/>
-        <w:pBdr>
-          <w:bottom w:val="single" w:sz="4" w:space="1" w:color="000000"/>
-        </w:pBdr>
-      </w:pPr>
-      <w:r>
-        <w:t>Selected Company Projects</w:t>
-      </w:r>
-    </w:p>
-    <w:p>
-      <w:pPr>
-        <w:keepNext/>
-        <w:spacing w:before="70" w:after="40"/>
-      </w:pPr>
-      <w:r>
-        <w:rPr>
-          <w:b w:val="0"/>
-        </w:rPr>
-      </w:r>
-      <w:hyperlink r:id="rId14">
-        <w:r>
-          <w:rPr>
-            <w:rFonts w:ascii="Calibri" w:hAnsi="Calibri"/>
-            <w:color w:val="000000"/>
-            <w:sz w:val="21"/>
-            <w:b/>
-          </w:rPr>
-          <w:t>EPOSMOB</w:t>
-        </w:r>
-      </w:hyperlink>
-      <w:r>
-        <w:t xml:space="preserve"> | Retail POS and Inventory | Flutter, Provider</w:t>
-      </w:r>
-    </w:p>
-    <w:p>
-      <w:pPr>
-        <w:keepNext w:val="0"/>
-        <w:spacing w:before="0" w:after="60"/>
-        <w:ind w:left="187" w:hanging="187"/>
-      </w:pPr>
-      <w:r>
-        <w:rPr>
-          <w:b w:val="0"/>
-        </w:rPr>
-        <w:t>• Built shift opening and Day Close workflows with cash-denomination calculations and pending-close alerts.</w:t>
-      </w:r>
-    </w:p>
-    <w:p>
-      <w:pPr>
-        <w:keepNext w:val="0"/>
-        <w:spacing w:before="0" w:after="60"/>
-        <w:ind w:left="187" w:hanging="187"/>
-      </w:pPr>
-      <w:r>
-        <w:rPr>
-          <w:b w:val="0"/>
-        </w:rPr>
-        <w:t>• Implemented purchase-return, packing, and shipping workflows.</w:t>
-      </w:r>
-    </w:p>
-    <w:p>
-      <w:pPr>
-        <w:keepNext w:val="0"/>
-        <w:spacing w:before="0" w:after="60"/>
-        <w:ind w:left="187" w:hanging="187"/>
-      </w:pPr>
-      <w:r>
-        <w:rPr>
-          <w:b w:val="0"/>
-        </w:rPr>
-        <w:t>• Developed reporting and transaction listings with shared filters and validated Excel exports.</w:t>
-      </w:r>
-    </w:p>
-    <w:p>
-      <w:pPr>
-        <w:keepNext w:val="0"/>
-        <w:spacing w:before="0" w:after="60"/>
-        <w:ind w:left="187" w:hanging="187"/>
-      </w:pPr>
-      <w:r>
-        <w:rPr>
-          <w:b w:val="0"/>
-        </w:rPr>
-        <w:t>• Fixed English/Arabic invoice rendering, USB printing, barcode pricing, and stock isolation, with regression tests.</w:t>
-      </w:r>
-    </w:p>
-    <w:p>
-      <w:pPr>
-        <w:keepNext/>
-        <w:spacing w:before="70" w:after="40"/>
-      </w:pPr>
-      <w:r>
-        <w:rPr>
-          <w:b w:val="0"/>
-        </w:rPr>
-      </w:r>
-      <w:r>
-        <w:rPr>
-          <w:b/>
-        </w:rPr>
-        <w:t>Ganvin Customer</w:t>
-      </w:r>
-      <w:r>
-        <w:t xml:space="preserve"> | Laundry Ordering and Tracking | Flutter, Provider</w:t>
-      </w:r>
-    </w:p>
-    <w:p>
-      <w:pPr>
-        <w:keepNext w:val="0"/>
-        <w:spacing w:before="0" w:after="60"/>
-        <w:ind w:left="187" w:hanging="187"/>
-      </w:pPr>
-      <w:r>
-        <w:rPr>
-          <w:b w:val="0"/>
-        </w:rPr>
-        <w:t>• Integrated Razorpay checkout and corrected payment-confirmation messaging.</w:t>
-      </w:r>
-    </w:p>
-    <w:p>
-      <w:pPr>
-        <w:keepNext w:val="0"/>
-        <w:spacing w:before="0" w:after="60"/>
-        <w:ind w:left="187" w:hanging="187"/>
-      </w:pPr>
-      <w:r>
-        <w:rPr>
-          <w:b w:val="0"/>
-        </w:rPr>
-        <w:t>• Reduced My Orders API requests from six to two by reusing responses for lists and counts.</w:t>
-      </w:r>
-    </w:p>
-    <w:p>
-      <w:pPr>
-        <w:keepNext w:val="0"/>
-        <w:spacing w:before="0" w:after="60"/>
-        <w:ind w:left="187" w:hanging="187"/>
-      </w:pPr>
-      <w:r>
-        <w:rPr>
-          <w:b w:val="0"/>
-        </w:rPr>
-        <w:t>• Added update prompts and maintenance-mode handling, and improved cart, login navigation, and saved addresses.</w:t>
-      </w:r>
-    </w:p>
-    <w:p>
-      <w:pPr>
-        <w:keepNext/>
-        <w:spacing w:before="70" w:after="40"/>
-      </w:pPr>
-      <w:r>
-        <w:rPr>
-          <w:b w:val="0"/>
-        </w:rPr>
-      </w:r>
-      <w:hyperlink r:id="rId15">
-        <w:r>
-          <w:rPr>
-            <w:rFonts w:ascii="Calibri" w:hAnsi="Calibri"/>
-            <w:color w:val="000000"/>
-            <w:sz w:val="21"/>
-            <w:b/>
-          </w:rPr>
-          <w:t>Ganvin Executive</w:t>
-        </w:r>
-      </w:hyperlink>
-      <w:r>
-        <w:t xml:space="preserve"> | Staff Pickup and Delivery | Flutter</w:t>
-      </w:r>
-    </w:p>
-    <w:p>
-      <w:pPr>
-        <w:keepNext w:val="0"/>
-        <w:spacing w:before="0" w:after="60"/>
-        <w:ind w:left="187" w:hanging="187"/>
-      </w:pPr>
-      <w:r>
-        <w:rPr>
-          <w:b w:val="0"/>
-        </w:rPr>
-        <w:t>• Implemented independent pagination and date filters across four delivery stages.</w:t>
-      </w:r>
-    </w:p>
-    <w:p>
-      <w:pPr>
-        <w:keepNext w:val="0"/>
-        <w:spacing w:before="0" w:after="60"/>
-        <w:ind w:left="187" w:hanging="187"/>
-      </w:pPr>
-      <w:r>
-        <w:rPr>
-          <w:b w:val="0"/>
-        </w:rPr>
-        <w:t>• Added Google Maps navigation and saved locations, and improved OTP entry and empty/error states.</w:t>
-      </w:r>
-    </w:p>
-    <w:p>
-      <w:pPr>
-        <w:keepNext/>
-        <w:spacing w:before="70" w:after="40"/>
-      </w:pPr>
-      <w:r>
-        <w:rPr>
-          <w:b w:val="0"/>
-        </w:rPr>
-      </w:r>
-      <w:r>
-        <w:rPr>
-          <w:b/>
-        </w:rPr>
-        <w:t>Connect App</w:t>
-      </w:r>
-      <w:r>
-        <w:t xml:space="preserve"> | Business Networking | React Native, TypeScript</w:t>
-      </w:r>
-    </w:p>
-    <w:p>
-      <w:pPr>
-        <w:keepNext w:val="0"/>
-        <w:spacing w:before="0" w:after="60"/>
-        <w:ind w:left="187" w:hanging="187"/>
-      </w:pPr>
-      <w:r>
-        <w:rPr>
-          <w:b w:val="0"/>
-        </w:rPr>
-        <w:t>• Implemented LinkedIn login on Android and iOS with PKCE and native modules, and fixed deferred deep links.</w:t>
-      </w:r>
-    </w:p>
-    <w:p>
-      <w:pPr>
-        <w:pStyle w:val="Heading1"/>
-        <w:pBdr>
-          <w:bottom w:val="single" w:sz="4" w:space="1" w:color="000000"/>
-        </w:pBdr>
-      </w:pPr>
-      <w:r>
-        <w:t>Supporting Web Experience</w:t>
-      </w:r>
-    </w:p>
-    <w:p>
-      <w:pPr>
-        <w:keepNext w:val="0"/>
-        <w:spacing w:before="0" w:after="50"/>
-      </w:pPr>
-      <w:r>
-        <w:rPr>
-          <w:b w:val="0"/>
-        </w:rPr>
-        <w:t>CloudPOS and Juice World: contributed Next.js storefront themes, tenant-aware Stripe checkout, Razorpay integration, English/Arabic localization, ISR, and SEO metadata.</w:t>
-      </w:r>
-    </w:p>
-    <w:p>
-      <w:pPr>
-        <w:pStyle w:val="Heading1"/>
-        <w:pBdr>
-          <w:bottom w:val="single" w:sz="4" w:space="1" w:color="000000"/>
-        </w:pBdr>
       </w:pPr>
       <w:r>
         <w:t>Education</w:t>
       </w:r>
     </w:p>
     <w:p>
-      <w:pPr>
-        <w:keepNext/>
-        <w:spacing w:before="0" w:after="50"/>
-      </w:pPr>
       <w:r>
         <w:rPr>
           <w:b/>
         </w:rPr>
-        <w:t>Bachelor of Computer Applications | 2023 – 2026</w:t>
+        <w:t>Bachelor of Computer Applications  |  2023 - 2026</w:t>
       </w:r>
     </w:p>
     <w:p>
-      <w:pPr>
-        <w:keepNext w:val="0"/>
-        <w:spacing w:before="0" w:after="0"/>
-      </w:pPr>
       <w:r>
         <w:rPr>
           <w:b w:val="0"/>
         </w:rPr>
-        <w:t>Priyadarshini Arts and Science College, Melmuri, Malappuram | University of Calicut</w:t>
+        <w:t>Priyadarshini Arts and Science College, Melmuri, Malappuram  |  University of Calicut</w:t>
       </w:r>
     </w:p>
     <w:sectPr>
       <w:pgSz w:w="11909" w:h="16834"/>
-      <w:pgMar w:top="763" w:right="893" w:bottom="763" w:left="893" w:header="720" w:footer="720" w:gutter="0"/>
+      <w:pgMar w:top="576" w:right="792" w:bottom="576" w:left="792" w:header="720" w:footer="720" w:gutter="0"/>
       <w:cols w:space="720"/>
       <w:docGrid w:linePitch="360"/>
     </w:sectPr>
@@ -982,13 +797,12 @@
     <w:qFormat/>
     <w:rsid w:val="00FC693F"/>
     <w:pPr>
-      <w:widowControl/>
-      <w:spacing w:before="0" w:after="50" w:line="247" w:lineRule="auto"/>
+      <w:spacing w:after="24" w:line="240" w:lineRule="auto"/>
     </w:pPr>
     <w:rPr>
       <w:rFonts w:ascii="Calibri" w:hAnsi="Calibri"/>
       <w:color w:val="000000"/>
-      <w:sz w:val="21"/>
+      <w:sz w:val="18"/>
     </w:rPr>
   </w:style>
   <w:style w:type="paragraph" w:styleId="Header">
@@ -1046,8 +860,7 @@
     <w:pPr>
       <w:keepNext/>
       <w:keepLines/>
-      <w:widowControl/>
-      <w:spacing w:before="140" w:after="60" w:line="247" w:lineRule="auto"/>
+      <w:spacing w:before="100" w:after="24" w:line="240" w:lineRule="auto"/>
       <w:outlineLvl w:val="0"/>
     </w:pPr>
     <w:rPr>
@@ -1055,7 +868,7 @@
       <w:b/>
       <w:bCs/>
       <w:color w:val="000000"/>
-      <w:sz w:val="22"/>
+      <w:sz w:val="20"/>
       <w:szCs w:val="28"/>
     </w:rPr>
   </w:style>
@@ -1078,7 +891,7 @@
       <w:rFonts w:asciiTheme="majorHAnsi" w:eastAsiaTheme="majorEastAsia" w:hAnsiTheme="majorHAnsi" w:cstheme="majorBidi"/>
       <w:b/>
       <w:bCs/>
-      <w:color w:val="000000"/>
+      <w:color w:val="4F81BD" w:themeColor="accent1"/>
       <w:sz w:val="26"/>
       <w:szCs w:val="26"/>
     </w:rPr>
@@ -1102,7 +915,7 @@
       <w:rFonts w:asciiTheme="majorHAnsi" w:eastAsiaTheme="majorEastAsia" w:hAnsiTheme="majorHAnsi" w:cstheme="majorBidi"/>
       <w:b/>
       <w:bCs/>
-      <w:color w:val="000000"/>
+      <w:color w:val="4F81BD" w:themeColor="accent1"/>
     </w:rPr>
   </w:style>
   <w:style w:type="paragraph" w:styleId="Heading4">
@@ -1127,7 +940,7 @@
       <w:bCs/>
       <w:i/>
       <w:iCs/>
-      <w:color w:val="000000"/>
+      <w:color w:val="4F81BD" w:themeColor="accent1"/>
     </w:rPr>
   </w:style>
   <w:style w:type="paragraph" w:styleId="Heading5">
@@ -1148,7 +961,7 @@
     </w:pPr>
     <w:rPr>
       <w:rFonts w:asciiTheme="majorHAnsi" w:eastAsiaTheme="majorEastAsia" w:hAnsiTheme="majorHAnsi" w:cstheme="majorBidi"/>
-      <w:color w:val="000000"/>
+      <w:color w:val="243F60" w:themeColor="accent1" w:themeShade="7F"/>
     </w:rPr>
   </w:style>
   <w:style w:type="paragraph" w:styleId="Heading6">
@@ -1171,7 +984,7 @@
       <w:rFonts w:asciiTheme="majorHAnsi" w:eastAsiaTheme="majorEastAsia" w:hAnsiTheme="majorHAnsi" w:cstheme="majorBidi"/>
       <w:i/>
       <w:iCs/>
-      <w:color w:val="000000"/>
+      <w:color w:val="243F60" w:themeColor="accent1" w:themeShade="7F"/>
     </w:rPr>
   </w:style>
   <w:style w:type="paragraph" w:styleId="Heading7">
@@ -1194,7 +1007,7 @@
       <w:rFonts w:asciiTheme="majorHAnsi" w:eastAsiaTheme="majorEastAsia" w:hAnsiTheme="majorHAnsi" w:cstheme="majorBidi"/>
       <w:i/>
       <w:iCs/>
-      <w:color w:val="000000"/>
+      <w:color w:val="404040" w:themeColor="text1" w:themeTint="BF"/>
     </w:rPr>
   </w:style>
   <w:style w:type="paragraph" w:styleId="Heading8">
@@ -1215,7 +1028,7 @@
     </w:pPr>
     <w:rPr>
       <w:rFonts w:asciiTheme="majorHAnsi" w:eastAsiaTheme="majorEastAsia" w:hAnsiTheme="majorHAnsi" w:cstheme="majorBidi"/>
-      <w:color w:val="000000"/>
+      <w:color w:val="4F81BD" w:themeColor="accent1"/>
       <w:sz w:val="20"/>
       <w:szCs w:val="20"/>
     </w:rPr>
@@ -1240,7 +1053,7 @@
       <w:rFonts w:asciiTheme="majorHAnsi" w:eastAsiaTheme="majorEastAsia" w:hAnsiTheme="majorHAnsi" w:cstheme="majorBidi"/>
       <w:i/>
       <w:iCs/>
-      <w:color w:val="000000"/>
+      <w:color w:val="404040" w:themeColor="text1" w:themeTint="BF"/>
       <w:sz w:val="20"/>
       <w:szCs w:val="20"/>
     </w:rPr>
@@ -1291,7 +1104,7 @@
       <w:rFonts w:asciiTheme="majorHAnsi" w:eastAsiaTheme="majorEastAsia" w:hAnsiTheme="majorHAnsi" w:cstheme="majorBidi"/>
       <w:b/>
       <w:bCs/>
-      <w:color w:val="000000"/>
+      <w:color w:val="365F91" w:themeColor="accent1" w:themeShade="BF"/>
       <w:sz w:val="28"/>
       <w:szCs w:val="28"/>
     </w:rPr>
@@ -1306,7 +1119,7 @@
       <w:rFonts w:asciiTheme="majorHAnsi" w:eastAsiaTheme="majorEastAsia" w:hAnsiTheme="majorHAnsi" w:cstheme="majorBidi"/>
       <w:b/>
       <w:bCs/>
-      <w:color w:val="000000"/>
+      <w:color w:val="4F81BD" w:themeColor="accent1"/>
       <w:sz w:val="26"/>
       <w:szCs w:val="26"/>
     </w:rPr>
@@ -1321,7 +1134,7 @@
       <w:rFonts w:asciiTheme="majorHAnsi" w:eastAsiaTheme="majorEastAsia" w:hAnsiTheme="majorHAnsi" w:cstheme="majorBidi"/>
       <w:b/>
       <w:bCs/>
-      <w:color w:val="000000"/>
+      <w:color w:val="4F81BD" w:themeColor="accent1"/>
     </w:rPr>
   </w:style>
   <w:style w:type="paragraph" w:styleId="Title">
@@ -1333,8 +1146,7 @@
     <w:qFormat/>
     <w:rsid w:val="00FC693F"/>
     <w:pPr>
-      <w:widowControl/>
-      <w:spacing w:after="40" w:line="247" w:lineRule="auto" w:before="0"/>
+      <w:spacing w:after="24" w:line="240" w:lineRule="auto"/>
       <w:contextualSpacing/>
     </w:pPr>
     <w:rPr>
@@ -1343,7 +1155,7 @@
       <w:color w:val="000000"/>
       <w:spacing w:val="5"/>
       <w:kern w:val="28"/>
-      <w:sz w:val="42"/>
+      <w:sz w:val="36"/>
       <w:szCs w:val="52"/>
     </w:rPr>
   </w:style>
@@ -1355,7 +1167,7 @@
     <w:rsid w:val="00FC693F"/>
     <w:rPr>
       <w:rFonts w:asciiTheme="majorHAnsi" w:eastAsiaTheme="majorEastAsia" w:hAnsiTheme="majorHAnsi" w:cstheme="majorBidi"/>
-      <w:color w:val="000000"/>
+      <w:color w:val="17365D" w:themeColor="text2" w:themeShade="BF"/>
       <w:spacing w:val="5"/>
       <w:kern w:val="28"/>
       <w:sz w:val="52"/>
@@ -1371,18 +1183,15 @@
     <w:qFormat/>
     <w:rsid w:val="00FC693F"/>
     <w:pPr>
-      <w:widowControl/>
       <w:numPr>
         <w:ilvl w:val="1"/>
       </w:numPr>
-      <w:spacing w:before="0" w:after="80" w:line="247" w:lineRule="auto"/>
     </w:pPr>
     <w:rPr>
-      <w:rFonts w:asciiTheme="majorHAnsi" w:eastAsiaTheme="majorEastAsia" w:hAnsiTheme="majorHAnsi" w:cstheme="majorBidi" w:ascii="Calibri" w:hAnsi="Calibri"/>
-      <w:b/>
+      <w:rFonts w:asciiTheme="majorHAnsi" w:eastAsiaTheme="majorEastAsia" w:hAnsiTheme="majorHAnsi" w:cstheme="majorBidi"/>
       <w:i/>
       <w:iCs/>
-      <w:color w:val="000000"/>
+      <w:color w:val="4F81BD" w:themeColor="accent1"/>
       <w:spacing w:val="15"/>
       <w:sz w:val="24"/>
       <w:szCs w:val="24"/>
@@ -1398,7 +1207,7 @@
       <w:rFonts w:asciiTheme="majorHAnsi" w:eastAsiaTheme="majorEastAsia" w:hAnsiTheme="majorHAnsi" w:cstheme="majorBidi"/>
       <w:i/>
       <w:iCs/>
-      <w:color w:val="000000"/>
+      <w:color w:val="4F81BD" w:themeColor="accent1"/>
       <w:spacing w:val="15"/>
       <w:sz w:val="24"/>
       <w:szCs w:val="24"/>
@@ -1520,8 +1329,14 @@
       <w:numPr>
         <w:numId w:val="1"/>
       </w:numPr>
+      <w:spacing w:after="24" w:line="240" w:lineRule="auto"/>
       <w:contextualSpacing/>
     </w:pPr>
+    <w:rPr>
+      <w:rFonts w:ascii="Calibri" w:hAnsi="Calibri"/>
+      <w:color w:val="000000"/>
+      <w:sz w:val="18"/>
+    </w:rPr>
   </w:style>
   <w:style w:type="paragraph" w:styleId="ListBullet2">
     <w:name w:val="List Bullet 2"/>
@@ -1670,7 +1485,7 @@
     <w:rPr>
       <w:i/>
       <w:iCs/>
-      <w:color w:val="000000"/>
+      <w:color w:val="000000" w:themeColor="text1"/>
     </w:rPr>
   </w:style>
   <w:style w:type="character" w:customStyle="1" w:styleId="QuoteChar">
@@ -1682,7 +1497,7 @@
     <w:rPr>
       <w:i/>
       <w:iCs/>
-      <w:color w:val="000000"/>
+      <w:color w:val="000000" w:themeColor="text1"/>
     </w:rPr>
   </w:style>
   <w:style w:type="character" w:customStyle="1" w:styleId="Heading4Char">
@@ -1698,7 +1513,7 @@
       <w:bCs/>
       <w:i/>
       <w:iCs/>
-      <w:color w:val="000000"/>
+      <w:color w:val="4F81BD" w:themeColor="accent1"/>
     </w:rPr>
   </w:style>
   <w:style w:type="character" w:customStyle="1" w:styleId="Heading5Char">
@@ -1710,7 +1525,7 @@
     <w:rsid w:val="00FC693F"/>
     <w:rPr>
       <w:rFonts w:asciiTheme="majorHAnsi" w:eastAsiaTheme="majorEastAsia" w:hAnsiTheme="majorHAnsi" w:cstheme="majorBidi"/>
-      <w:color w:val="000000"/>
+      <w:color w:val="243F60" w:themeColor="accent1" w:themeShade="7F"/>
     </w:rPr>
   </w:style>
   <w:style w:type="character" w:customStyle="1" w:styleId="Heading6Char">
@@ -1724,7 +1539,7 @@
       <w:rFonts w:asciiTheme="majorHAnsi" w:eastAsiaTheme="majorEastAsia" w:hAnsiTheme="majorHAnsi" w:cstheme="majorBidi"/>
       <w:i/>
       <w:iCs/>
-      <w:color w:val="000000"/>
+      <w:color w:val="243F60" w:themeColor="accent1" w:themeShade="7F"/>
     </w:rPr>
   </w:style>
   <w:style w:type="character" w:customStyle="1" w:styleId="Heading7Char">
@@ -1738,7 +1553,7 @@
       <w:rFonts w:asciiTheme="majorHAnsi" w:eastAsiaTheme="majorEastAsia" w:hAnsiTheme="majorHAnsi" w:cstheme="majorBidi"/>
       <w:i/>
       <w:iCs/>
-      <w:color w:val="000000"/>
+      <w:color w:val="404040" w:themeColor="text1" w:themeTint="BF"/>
     </w:rPr>
   </w:style>
   <w:style w:type="character" w:customStyle="1" w:styleId="Heading8Char">
@@ -1750,7 +1565,7 @@
     <w:rsid w:val="00FC693F"/>
     <w:rPr>
       <w:rFonts w:asciiTheme="majorHAnsi" w:eastAsiaTheme="majorEastAsia" w:hAnsiTheme="majorHAnsi" w:cstheme="majorBidi"/>
-      <w:color w:val="000000"/>
+      <w:color w:val="4F81BD" w:themeColor="accent1"/>
       <w:sz w:val="20"/>
       <w:szCs w:val="20"/>
     </w:rPr>
@@ -1766,7 +1581,7 @@
       <w:rFonts w:asciiTheme="majorHAnsi" w:eastAsiaTheme="majorEastAsia" w:hAnsiTheme="majorHAnsi" w:cstheme="majorBidi"/>
       <w:i/>
       <w:iCs/>
-      <w:color w:val="000000"/>
+      <w:color w:val="404040" w:themeColor="text1" w:themeTint="BF"/>
       <w:sz w:val="20"/>
       <w:szCs w:val="20"/>
     </w:rPr>
@@ -1786,7 +1601,7 @@
     <w:rPr>
       <w:b/>
       <w:bCs/>
-      <w:color w:val="000000"/>
+      <w:color w:val="4F81BD" w:themeColor="accent1"/>
       <w:sz w:val="18"/>
       <w:szCs w:val="18"/>
     </w:rPr>
@@ -1830,7 +1645,7 @@
       <w:bCs/>
       <w:i/>
       <w:iCs/>
-      <w:color w:val="000000"/>
+      <w:color w:val="4F81BD" w:themeColor="accent1"/>
     </w:rPr>
   </w:style>
   <w:style w:type="character" w:customStyle="1" w:styleId="IntenseQuoteChar">
@@ -1844,7 +1659,7 @@
       <w:bCs/>
       <w:i/>
       <w:iCs/>
-      <w:color w:val="000000"/>
+      <w:color w:val="4F81BD" w:themeColor="accent1"/>
     </w:rPr>
   </w:style>
   <w:style w:type="character" w:styleId="SubtleEmphasis">
@@ -1856,7 +1671,7 @@
     <w:rPr>
       <w:i/>
       <w:iCs/>
-      <w:color w:val="000000"/>
+      <w:color w:val="808080" w:themeColor="text1" w:themeTint="7F"/>
     </w:rPr>
   </w:style>
   <w:style w:type="character" w:styleId="IntenseEmphasis">
@@ -1870,7 +1685,7 @@
       <w:bCs/>
       <w:i/>
       <w:iCs/>
-      <w:color w:val="000000"/>
+      <w:color w:val="4F81BD" w:themeColor="accent1"/>
     </w:rPr>
   </w:style>
   <w:style w:type="character" w:styleId="SubtleReference">
@@ -1881,7 +1696,7 @@
     <w:rsid w:val="00FC693F"/>
     <w:rPr>
       <w:smallCaps/>
-      <w:color w:val="000000"/>
+      <w:color w:val="C0504D" w:themeColor="accent2"/>
       <w:u w:val="single"/>
     </w:rPr>
   </w:style>
@@ -1895,7 +1710,7 @@
       <w:b/>
       <w:bCs/>
       <w:smallCaps/>
-      <w:color w:val="000000"/>
+      <w:color w:val="C0504D" w:themeColor="accent2"/>
       <w:spacing w:val="5"/>
       <w:u w:val="single"/>
     </w:rPr>
@@ -1961,7 +1776,7 @@
       <w:spacing w:after="0" w:line="240" w:lineRule="auto"/>
     </w:pPr>
     <w:rPr>
-      <w:color w:val="000000"/>
+      <w:color w:val="000000" w:themeColor="text1" w:themeShade="BF"/>
     </w:rPr>
     <w:tblPr>
       <w:tblStyleRowBandSize w:val="1"/>
@@ -2064,7 +1879,7 @@
       <w:spacing w:after="0" w:line="240" w:lineRule="auto"/>
     </w:pPr>
     <w:rPr>
-      <w:color w:val="000000"/>
+      <w:color w:val="365F91" w:themeColor="accent1" w:themeShade="BF"/>
     </w:rPr>
     <w:tblPr>
       <w:tblStyleRowBandSize w:val="1"/>
@@ -2167,7 +1982,7 @@
       <w:spacing w:after="0" w:line="240" w:lineRule="auto"/>
     </w:pPr>
     <w:rPr>
-      <w:color w:val="000000"/>
+      <w:color w:val="943634" w:themeColor="accent2" w:themeShade="BF"/>
     </w:rPr>
     <w:tblPr>
       <w:tblStyleRowBandSize w:val="1"/>
@@ -2270,7 +2085,7 @@
       <w:spacing w:after="0" w:line="240" w:lineRule="auto"/>
     </w:pPr>
     <w:rPr>
-      <w:color w:val="000000"/>
+      <w:color w:val="76923C" w:themeColor="accent3" w:themeShade="BF"/>
     </w:rPr>
     <w:tblPr>
       <w:tblStyleRowBandSize w:val="1"/>
@@ -2373,7 +2188,7 @@
       <w:spacing w:after="0" w:line="240" w:lineRule="auto"/>
     </w:pPr>
     <w:rPr>
-      <w:color w:val="000000"/>
+      <w:color w:val="5F497A" w:themeColor="accent4" w:themeShade="BF"/>
     </w:rPr>
     <w:tblPr>
       <w:tblStyleRowBandSize w:val="1"/>
@@ -2476,7 +2291,7 @@
       <w:spacing w:after="0" w:line="240" w:lineRule="auto"/>
     </w:pPr>
     <w:rPr>
-      <w:color w:val="000000"/>
+      <w:color w:val="31849B" w:themeColor="accent5" w:themeShade="BF"/>
     </w:rPr>
     <w:tblPr>
       <w:tblStyleRowBandSize w:val="1"/>
@@ -2579,7 +2394,7 @@
       <w:spacing w:after="0" w:line="240" w:lineRule="auto"/>
     </w:pPr>
     <w:rPr>
-      <w:color w:val="000000"/>
+      <w:color w:val="E36C0A" w:themeColor="accent6" w:themeShade="BF"/>
     </w:rPr>
     <w:tblPr>
       <w:tblStyleRowBandSize w:val="1"/>
@@ -2705,7 +2520,7 @@
       <w:rPr>
         <w:b/>
         <w:bCs/>
-        <w:color w:val="000000"/>
+        <w:color w:val="FFFFFF" w:themeColor="background1"/>
       </w:rPr>
       <w:tblPr/>
       <w:tcPr>
@@ -2797,7 +2612,7 @@
       <w:rPr>
         <w:b/>
         <w:bCs/>
-        <w:color w:val="000000"/>
+        <w:color w:val="FFFFFF" w:themeColor="background1"/>
       </w:rPr>
       <w:tblPr/>
       <w:tcPr>
@@ -2889,7 +2704,7 @@
       <w:rPr>
         <w:b/>
         <w:bCs/>
-        <w:color w:val="000000"/>
+        <w:color w:val="FFFFFF" w:themeColor="background1"/>
       </w:rPr>
       <w:tblPr/>
       <w:tcPr>
@@ -2981,7 +2796,7 @@
       <w:rPr>
         <w:b/>
         <w:bCs/>
-        <w:color w:val="000000"/>
+        <w:color w:val="FFFFFF" w:themeColor="background1"/>
       </w:rPr>
       <w:tblPr/>
       <w:tcPr>
@@ -3073,7 +2888,7 @@
       <w:rPr>
         <w:b/>
         <w:bCs/>
-        <w:color w:val="000000"/>
+        <w:color w:val="FFFFFF" w:themeColor="background1"/>
       </w:rPr>
       <w:tblPr/>
       <w:tcPr>
@@ -3165,7 +2980,7 @@
       <w:rPr>
         <w:b/>
         <w:bCs/>
-        <w:color w:val="000000"/>
+        <w:color w:val="FFFFFF" w:themeColor="background1"/>
       </w:rPr>
       <w:tblPr/>
       <w:tcPr>
@@ -3257,7 +3072,7 @@
       <w:rPr>
         <w:b/>
         <w:bCs/>
-        <w:color w:val="000000"/>
+        <w:color w:val="FFFFFF" w:themeColor="background1"/>
       </w:rPr>
       <w:tblPr/>
       <w:tcPr>
@@ -4260,7 +4075,7 @@
       <w:rPr>
         <w:b/>
         <w:bCs/>
-        <w:color w:val="000000"/>
+        <w:color w:val="FFFFFF" w:themeColor="background1"/>
       </w:rPr>
       <w:tblPr/>
       <w:tcPr>
@@ -4366,7 +4181,7 @@
       <w:rPr>
         <w:b/>
         <w:bCs/>
-        <w:color w:val="000000"/>
+        <w:color w:val="FFFFFF" w:themeColor="background1"/>
       </w:rPr>
       <w:tblPr/>
       <w:tcPr>
@@ -4472,7 +4287,7 @@
       <w:rPr>
         <w:b/>
         <w:bCs/>
-        <w:color w:val="000000"/>
+        <w:color w:val="FFFFFF" w:themeColor="background1"/>
       </w:rPr>
       <w:tblPr/>
       <w:tcPr>
@@ -4578,7 +4393,7 @@
       <w:rPr>
         <w:b/>
         <w:bCs/>
-        <w:color w:val="000000"/>
+        <w:color w:val="FFFFFF" w:themeColor="background1"/>
       </w:rPr>
       <w:tblPr/>
       <w:tcPr>
@@ -4684,7 +4499,7 @@
       <w:rPr>
         <w:b/>
         <w:bCs/>
-        <w:color w:val="000000"/>
+        <w:color w:val="FFFFFF" w:themeColor="background1"/>
       </w:rPr>
       <w:tblPr/>
       <w:tcPr>
@@ -4790,7 +4605,7 @@
       <w:rPr>
         <w:b/>
         <w:bCs/>
-        <w:color w:val="000000"/>
+        <w:color w:val="FFFFFF" w:themeColor="background1"/>
       </w:rPr>
       <w:tblPr/>
       <w:tcPr>
@@ -4896,7 +4711,7 @@
       <w:rPr>
         <w:b/>
         <w:bCs/>
-        <w:color w:val="000000"/>
+        <w:color w:val="FFFFFF" w:themeColor="background1"/>
       </w:rPr>
       <w:tblPr/>
       <w:tcPr>
@@ -4999,7 +4814,7 @@
       <w:rPr>
         <w:b/>
         <w:bCs/>
-        <w:color w:val="000000"/>
+        <w:color w:val="FFFFFF" w:themeColor="background1"/>
       </w:rPr>
       <w:tblPr/>
       <w:tcPr>
@@ -5019,7 +4834,7 @@
         <w:spacing w:before="0" w:after="0" w:line="240" w:lineRule="auto"/>
       </w:pPr>
       <w:rPr>
-        <w:color w:val="000000"/>
+        <w:color w:val="auto"/>
       </w:rPr>
       <w:tblPr/>
       <w:tcPr>
@@ -5038,7 +4853,7 @@
       <w:rPr>
         <w:b/>
         <w:bCs/>
-        <w:color w:val="000000"/>
+        <w:color w:val="FFFFFF" w:themeColor="background1"/>
       </w:rPr>
       <w:tblPr/>
       <w:tcPr>
@@ -5057,7 +4872,7 @@
       <w:rPr>
         <w:b/>
         <w:bCs/>
-        <w:color w:val="000000"/>
+        <w:color w:val="FFFFFF" w:themeColor="background1"/>
       </w:rPr>
       <w:tblPr/>
       <w:tcPr>
@@ -5103,7 +4918,7 @@
     </w:tblStylePr>
     <w:tblStylePr w:type="nwCell">
       <w:rPr>
-        <w:color w:val="000000"/>
+        <w:color w:val="FFFFFF" w:themeColor="background1"/>
       </w:rPr>
       <w:tblPr/>
       <w:tcPr>
@@ -5148,7 +4963,7 @@
       <w:rPr>
         <w:b/>
         <w:bCs/>
-        <w:color w:val="000000"/>
+        <w:color w:val="FFFFFF" w:themeColor="background1"/>
       </w:rPr>
       <w:tblPr/>
       <w:tcPr>
@@ -5168,7 +4983,7 @@
         <w:spacing w:before="0" w:after="0" w:line="240" w:lineRule="auto"/>
       </w:pPr>
       <w:rPr>
-        <w:color w:val="000000"/>
+        <w:color w:val="auto"/>
       </w:rPr>
       <w:tblPr/>
       <w:tcPr>
@@ -5187,7 +5002,7 @@
       <w:rPr>
         <w:b/>
         <w:bCs/>
-        <w:color w:val="000000"/>
+        <w:color w:val="FFFFFF" w:themeColor="background1"/>
       </w:rPr>
       <w:tblPr/>
       <w:tcPr>
@@ -5206,7 +5021,7 @@
       <w:rPr>
         <w:b/>
         <w:bCs/>
-        <w:color w:val="000000"/>
+        <w:color w:val="FFFFFF" w:themeColor="background1"/>
       </w:rPr>
       <w:tblPr/>
       <w:tcPr>
@@ -5252,7 +5067,7 @@
     </w:tblStylePr>
     <w:tblStylePr w:type="nwCell">
       <w:rPr>
-        <w:color w:val="000000"/>
+        <w:color w:val="FFFFFF" w:themeColor="background1"/>
       </w:rPr>
       <w:tblPr/>
       <w:tcPr>
@@ -5297,7 +5112,7 @@
       <w:rPr>
         <w:b/>
         <w:bCs/>
-        <w:color w:val="000000"/>
+        <w:color w:val="FFFFFF" w:themeColor="background1"/>
       </w:rPr>
       <w:tblPr/>
       <w:tcPr>
@@ -5317,7 +5132,7 @@
         <w:spacing w:before="0" w:after="0" w:line="240" w:lineRule="auto"/>
       </w:pPr>
       <w:rPr>
-        <w:color w:val="000000"/>
+        <w:color w:val="auto"/>
       </w:rPr>
       <w:tblPr/>
       <w:tcPr>
@@ -5336,7 +5151,7 @@
       <w:rPr>
         <w:b/>
         <w:bCs/>
-        <w:color w:val="000000"/>
+        <w:color w:val="FFFFFF" w:themeColor="background1"/>
       </w:rPr>
       <w:tblPr/>
       <w:tcPr>
@@ -5355,7 +5170,7 @@
       <w:rPr>
         <w:b/>
         <w:bCs/>
-        <w:color w:val="000000"/>
+        <w:color w:val="FFFFFF" w:themeColor="background1"/>
       </w:rPr>
       <w:tblPr/>
       <w:tcPr>
@@ -5401,7 +5216,7 @@
     </w:tblStylePr>
     <w:tblStylePr w:type="nwCell">
       <w:rPr>
-        <w:color w:val="000000"/>
+        <w:color w:val="FFFFFF" w:themeColor="background1"/>
       </w:rPr>
       <w:tblPr/>
       <w:tcPr>
@@ -5446,7 +5261,7 @@
       <w:rPr>
         <w:b/>
         <w:bCs/>
-        <w:color w:val="000000"/>
+        <w:color w:val="FFFFFF" w:themeColor="background1"/>
       </w:rPr>
       <w:tblPr/>
       <w:tcPr>
@@ -5466,7 +5281,7 @@
         <w:spacing w:before="0" w:after="0" w:line="240" w:lineRule="auto"/>
       </w:pPr>
       <w:rPr>
-        <w:color w:val="000000"/>
+        <w:color w:val="auto"/>
       </w:rPr>
       <w:tblPr/>
       <w:tcPr>
@@ -5485,7 +5300,7 @@
       <w:rPr>
         <w:b/>
         <w:bCs/>
-        <w:color w:val="000000"/>
+        <w:color w:val="FFFFFF" w:themeColor="background1"/>
       </w:rPr>
       <w:tblPr/>
       <w:tcPr>
@@ -5504,7 +5319,7 @@
       <w:rPr>
         <w:b/>
         <w:bCs/>
-        <w:color w:val="000000"/>
+        <w:color w:val="FFFFFF" w:themeColor="background1"/>
       </w:rPr>
       <w:tblPr/>
       <w:tcPr>
@@ -5550,7 +5365,7 @@
     </w:tblStylePr>
     <w:tblStylePr w:type="nwCell">
       <w:rPr>
-        <w:color w:val="000000"/>
+        <w:color w:val="FFFFFF" w:themeColor="background1"/>
       </w:rPr>
       <w:tblPr/>
       <w:tcPr>
@@ -5595,7 +5410,7 @@
       <w:rPr>
         <w:b/>
         <w:bCs/>
-        <w:color w:val="000000"/>
+        <w:color w:val="FFFFFF" w:themeColor="background1"/>
       </w:rPr>
       <w:tblPr/>
       <w:tcPr>
@@ -5615,7 +5430,7 @@
         <w:spacing w:before="0" w:after="0" w:line="240" w:lineRule="auto"/>
       </w:pPr>
       <w:rPr>
-        <w:color w:val="000000"/>
+        <w:color w:val="auto"/>
       </w:rPr>
       <w:tblPr/>
       <w:tcPr>
@@ -5634,7 +5449,7 @@
       <w:rPr>
         <w:b/>
         <w:bCs/>
-        <w:color w:val="000000"/>
+        <w:color w:val="FFFFFF" w:themeColor="background1"/>
       </w:rPr>
       <w:tblPr/>
       <w:tcPr>
@@ -5653,7 +5468,7 @@
       <w:rPr>
         <w:b/>
         <w:bCs/>
-        <w:color w:val="000000"/>
+        <w:color w:val="FFFFFF" w:themeColor="background1"/>
       </w:rPr>
       <w:tblPr/>
       <w:tcPr>
@@ -5699,7 +5514,7 @@
     </w:tblStylePr>
     <w:tblStylePr w:type="nwCell">
       <w:rPr>
-        <w:color w:val="000000"/>
+        <w:color w:val="FFFFFF" w:themeColor="background1"/>
       </w:rPr>
       <w:tblPr/>
       <w:tcPr>
@@ -5744,7 +5559,7 @@
       <w:rPr>
         <w:b/>
         <w:bCs/>
-        <w:color w:val="000000"/>
+        <w:color w:val="FFFFFF" w:themeColor="background1"/>
       </w:rPr>
       <w:tblPr/>
       <w:tcPr>
@@ -5764,7 +5579,7 @@
         <w:spacing w:before="0" w:after="0" w:line="240" w:lineRule="auto"/>
       </w:pPr>
       <w:rPr>
-        <w:color w:val="000000"/>
+        <w:color w:val="auto"/>
       </w:rPr>
       <w:tblPr/>
       <w:tcPr>
@@ -5783,7 +5598,7 @@
       <w:rPr>
         <w:b/>
         <w:bCs/>
-        <w:color w:val="000000"/>
+        <w:color w:val="FFFFFF" w:themeColor="background1"/>
       </w:rPr>
       <w:tblPr/>
       <w:tcPr>
@@ -5802,7 +5617,7 @@
       <w:rPr>
         <w:b/>
         <w:bCs/>
-        <w:color w:val="000000"/>
+        <w:color w:val="FFFFFF" w:themeColor="background1"/>
       </w:rPr>
       <w:tblPr/>
       <w:tcPr>
@@ -5848,7 +5663,7 @@
     </w:tblStylePr>
     <w:tblStylePr w:type="nwCell">
       <w:rPr>
-        <w:color w:val="000000"/>
+        <w:color w:val="FFFFFF" w:themeColor="background1"/>
       </w:rPr>
       <w:tblPr/>
       <w:tcPr>
@@ -5893,7 +5708,7 @@
       <w:rPr>
         <w:b/>
         <w:bCs/>
-        <w:color w:val="000000"/>
+        <w:color w:val="FFFFFF" w:themeColor="background1"/>
       </w:rPr>
       <w:tblPr/>
       <w:tcPr>
@@ -5913,7 +5728,7 @@
         <w:spacing w:before="0" w:after="0" w:line="240" w:lineRule="auto"/>
       </w:pPr>
       <w:rPr>
-        <w:color w:val="000000"/>
+        <w:color w:val="auto"/>
       </w:rPr>
       <w:tblPr/>
       <w:tcPr>
@@ -5932,7 +5747,7 @@
       <w:rPr>
         <w:b/>
         <w:bCs/>
-        <w:color w:val="000000"/>
+        <w:color w:val="FFFFFF" w:themeColor="background1"/>
       </w:rPr>
       <w:tblPr/>
       <w:tcPr>
@@ -5951,7 +5766,7 @@
       <w:rPr>
         <w:b/>
         <w:bCs/>
-        <w:color w:val="000000"/>
+        <w:color w:val="FFFFFF" w:themeColor="background1"/>
       </w:rPr>
       <w:tblPr/>
       <w:tcPr>
@@ -5997,7 +5812,7 @@
     </w:tblStylePr>
     <w:tblStylePr w:type="nwCell">
       <w:rPr>
-        <w:color w:val="000000"/>
+        <w:color w:val="FFFFFF" w:themeColor="background1"/>
       </w:rPr>
       <w:tblPr/>
       <w:tcPr>
@@ -6021,7 +5836,7 @@
       <w:spacing w:after="0" w:line="240" w:lineRule="auto"/>
     </w:pPr>
     <w:rPr>
-      <w:color w:val="000000"/>
+      <w:color w:val="000000" w:themeColor="text1"/>
     </w:rPr>
     <w:tblPr>
       <w:tblStyleRowBandSize w:val="1"/>
@@ -6054,7 +5869,7 @@
       <w:rPr>
         <w:b/>
         <w:bCs/>
-        <w:color w:val="000000"/>
+        <w:color w:val="1F497D" w:themeColor="text2"/>
       </w:rPr>
       <w:tblPr/>
       <w:tcPr>
@@ -6105,7 +5920,7 @@
       <w:spacing w:after="0" w:line="240" w:lineRule="auto"/>
     </w:pPr>
     <w:rPr>
-      <w:color w:val="000000"/>
+      <w:color w:val="000000" w:themeColor="text1"/>
     </w:rPr>
     <w:tblPr>
       <w:tblStyleRowBandSize w:val="1"/>
@@ -6138,7 +5953,7 @@
       <w:rPr>
         <w:b/>
         <w:bCs/>
-        <w:color w:val="000000"/>
+        <w:color w:val="1F497D" w:themeColor="text2"/>
       </w:rPr>
       <w:tblPr/>
       <w:tcPr>
@@ -6189,7 +6004,7 @@
       <w:spacing w:after="0" w:line="240" w:lineRule="auto"/>
     </w:pPr>
     <w:rPr>
-      <w:color w:val="000000"/>
+      <w:color w:val="000000" w:themeColor="text1"/>
     </w:rPr>
     <w:tblPr>
       <w:tblStyleRowBandSize w:val="1"/>
@@ -6222,7 +6037,7 @@
       <w:rPr>
         <w:b/>
         <w:bCs/>
-        <w:color w:val="000000"/>
+        <w:color w:val="1F497D" w:themeColor="text2"/>
       </w:rPr>
       <w:tblPr/>
       <w:tcPr>
@@ -6273,7 +6088,7 @@
       <w:spacing w:after="0" w:line="240" w:lineRule="auto"/>
     </w:pPr>
     <w:rPr>
-      <w:color w:val="000000"/>
+      <w:color w:val="000000" w:themeColor="text1"/>
     </w:rPr>
     <w:tblPr>
       <w:tblStyleRowBandSize w:val="1"/>
@@ -6306,7 +6121,7 @@
       <w:rPr>
         <w:b/>
         <w:bCs/>
-        <w:color w:val="000000"/>
+        <w:color w:val="1F497D" w:themeColor="text2"/>
       </w:rPr>
       <w:tblPr/>
       <w:tcPr>
@@ -6357,7 +6172,7 @@
       <w:spacing w:after="0" w:line="240" w:lineRule="auto"/>
     </w:pPr>
     <w:rPr>
-      <w:color w:val="000000"/>
+      <w:color w:val="000000" w:themeColor="text1"/>
     </w:rPr>
     <w:tblPr>
       <w:tblStyleRowBandSize w:val="1"/>
@@ -6390,7 +6205,7 @@
       <w:rPr>
         <w:b/>
         <w:bCs/>
-        <w:color w:val="000000"/>
+        <w:color w:val="1F497D" w:themeColor="text2"/>
       </w:rPr>
       <w:tblPr/>
       <w:tcPr>
@@ -6441,7 +6256,7 @@
       <w:spacing w:after="0" w:line="240" w:lineRule="auto"/>
     </w:pPr>
     <w:rPr>
-      <w:color w:val="000000"/>
+      <w:color w:val="000000" w:themeColor="text1"/>
     </w:rPr>
     <w:tblPr>
       <w:tblStyleRowBandSize w:val="1"/>
@@ -6474,7 +6289,7 @@
       <w:rPr>
         <w:b/>
         <w:bCs/>
-        <w:color w:val="000000"/>
+        <w:color w:val="1F497D" w:themeColor="text2"/>
       </w:rPr>
       <w:tblPr/>
       <w:tcPr>
@@ -6525,7 +6340,7 @@
       <w:spacing w:after="0" w:line="240" w:lineRule="auto"/>
     </w:pPr>
     <w:rPr>
-      <w:color w:val="000000"/>
+      <w:color w:val="000000" w:themeColor="text1"/>
     </w:rPr>
     <w:tblPr>
       <w:tblStyleRowBandSize w:val="1"/>
@@ -6558,7 +6373,7 @@
       <w:rPr>
         <w:b/>
         <w:bCs/>
-        <w:color w:val="000000"/>
+        <w:color w:val="1F497D" w:themeColor="text2"/>
       </w:rPr>
       <w:tblPr/>
       <w:tcPr>
@@ -6610,7 +6425,7 @@
     </w:pPr>
     <w:rPr>
       <w:rFonts w:asciiTheme="majorHAnsi" w:eastAsiaTheme="majorEastAsia" w:hAnsiTheme="majorHAnsi" w:cstheme="majorBidi"/>
-      <w:color w:val="000000"/>
+      <w:color w:val="000000" w:themeColor="text1"/>
     </w:rPr>
     <w:tblPr>
       <w:tblStyleRowBandSize w:val="1"/>
@@ -6738,7 +6553,7 @@
     </w:pPr>
     <w:rPr>
       <w:rFonts w:asciiTheme="majorHAnsi" w:eastAsiaTheme="majorEastAsia" w:hAnsiTheme="majorHAnsi" w:cstheme="majorBidi"/>
-      <w:color w:val="000000"/>
+      <w:color w:val="000000" w:themeColor="text1"/>
     </w:rPr>
     <w:tblPr>
       <w:tblStyleRowBandSize w:val="1"/>
@@ -6866,7 +6681,7 @@
     </w:pPr>
     <w:rPr>
       <w:rFonts w:asciiTheme="majorHAnsi" w:eastAsiaTheme="majorEastAsia" w:hAnsiTheme="majorHAnsi" w:cstheme="majorBidi"/>
-      <w:color w:val="000000"/>
+      <w:color w:val="000000" w:themeColor="text1"/>
     </w:rPr>
     <w:tblPr>
       <w:tblStyleRowBandSize w:val="1"/>
@@ -6994,7 +6809,7 @@
     </w:pPr>
     <w:rPr>
       <w:rFonts w:asciiTheme="majorHAnsi" w:eastAsiaTheme="majorEastAsia" w:hAnsiTheme="majorHAnsi" w:cstheme="majorBidi"/>
-      <w:color w:val="000000"/>
+      <w:color w:val="000000" w:themeColor="text1"/>
     </w:rPr>
     <w:tblPr>
       <w:tblStyleRowBandSize w:val="1"/>
@@ -7122,7 +6937,7 @@
     </w:pPr>
     <w:rPr>
       <w:rFonts w:asciiTheme="majorHAnsi" w:eastAsiaTheme="majorEastAsia" w:hAnsiTheme="majorHAnsi" w:cstheme="majorBidi"/>
-      <w:color w:val="000000"/>
+      <w:color w:val="000000" w:themeColor="text1"/>
     </w:rPr>
     <w:tblPr>
       <w:tblStyleRowBandSize w:val="1"/>
@@ -7250,7 +7065,7 @@
     </w:pPr>
     <w:rPr>
       <w:rFonts w:asciiTheme="majorHAnsi" w:eastAsiaTheme="majorEastAsia" w:hAnsiTheme="majorHAnsi" w:cstheme="majorBidi"/>
-      <w:color w:val="000000"/>
+      <w:color w:val="000000" w:themeColor="text1"/>
     </w:rPr>
     <w:tblPr>
       <w:tblStyleRowBandSize w:val="1"/>
@@ -7378,7 +7193,7 @@
     </w:pPr>
     <w:rPr>
       <w:rFonts w:asciiTheme="majorHAnsi" w:eastAsiaTheme="majorEastAsia" w:hAnsiTheme="majorHAnsi" w:cstheme="majorBidi"/>
-      <w:color w:val="000000"/>
+      <w:color w:val="000000" w:themeColor="text1"/>
     </w:rPr>
     <w:tblPr>
       <w:tblStyleRowBandSize w:val="1"/>
@@ -8017,7 +7832,7 @@
     </w:pPr>
     <w:rPr>
       <w:rFonts w:asciiTheme="majorHAnsi" w:eastAsiaTheme="majorEastAsia" w:hAnsiTheme="majorHAnsi" w:cstheme="majorBidi"/>
-      <w:color w:val="000000"/>
+      <w:color w:val="000000" w:themeColor="text1"/>
     </w:rPr>
     <w:tblPr>
       <w:tblStyleRowBandSize w:val="1"/>
@@ -8045,7 +7860,7 @@
       <w:rPr>
         <w:b/>
         <w:bCs/>
-        <w:color w:val="000000"/>
+        <w:color w:val="000000" w:themeColor="text1"/>
       </w:rPr>
       <w:tblPr/>
       <w:tcPr>
@@ -8056,7 +7871,7 @@
       <w:rPr>
         <w:b/>
         <w:bCs/>
-        <w:color w:val="000000"/>
+        <w:color w:val="000000" w:themeColor="text1"/>
       </w:rPr>
       <w:tblPr/>
       <w:tcPr>
@@ -8075,7 +7890,7 @@
       <w:rPr>
         <w:b/>
         <w:bCs/>
-        <w:color w:val="000000"/>
+        <w:color w:val="000000" w:themeColor="text1"/>
       </w:rPr>
       <w:tblPr/>
       <w:tcPr>
@@ -8094,7 +7909,7 @@
       <w:rPr>
         <w:b w:val="0"/>
         <w:bCs w:val="0"/>
-        <w:color w:val="000000"/>
+        <w:color w:val="000000" w:themeColor="text1"/>
       </w:rPr>
       <w:tblPr/>
       <w:tcPr>
@@ -8142,7 +7957,7 @@
     </w:pPr>
     <w:rPr>
       <w:rFonts w:asciiTheme="majorHAnsi" w:eastAsiaTheme="majorEastAsia" w:hAnsiTheme="majorHAnsi" w:cstheme="majorBidi"/>
-      <w:color w:val="000000"/>
+      <w:color w:val="000000" w:themeColor="text1"/>
     </w:rPr>
     <w:tblPr>
       <w:tblStyleRowBandSize w:val="1"/>
@@ -8170,7 +7985,7 @@
       <w:rPr>
         <w:b/>
         <w:bCs/>
-        <w:color w:val="000000"/>
+        <w:color w:val="000000" w:themeColor="text1"/>
       </w:rPr>
       <w:tblPr/>
       <w:tcPr>
@@ -8181,7 +7996,7 @@
       <w:rPr>
         <w:b/>
         <w:bCs/>
-        <w:color w:val="000000"/>
+        <w:color w:val="000000" w:themeColor="text1"/>
       </w:rPr>
       <w:tblPr/>
       <w:tcPr>
@@ -8200,7 +8015,7 @@
       <w:rPr>
         <w:b/>
         <w:bCs/>
-        <w:color w:val="000000"/>
+        <w:color w:val="000000" w:themeColor="text1"/>
       </w:rPr>
       <w:tblPr/>
       <w:tcPr>
@@ -8219,7 +8034,7 @@
       <w:rPr>
         <w:b w:val="0"/>
         <w:bCs w:val="0"/>
-        <w:color w:val="000000"/>
+        <w:color w:val="000000" w:themeColor="text1"/>
       </w:rPr>
       <w:tblPr/>
       <w:tcPr>
@@ -8267,7 +8082,7 @@
     </w:pPr>
     <w:rPr>
       <w:rFonts w:asciiTheme="majorHAnsi" w:eastAsiaTheme="majorEastAsia" w:hAnsiTheme="majorHAnsi" w:cstheme="majorBidi"/>
-      <w:color w:val="000000"/>
+      <w:color w:val="000000" w:themeColor="text1"/>
     </w:rPr>
     <w:tblPr>
       <w:tblStyleRowBandSize w:val="1"/>
@@ -8295,7 +8110,7 @@
       <w:rPr>
         <w:b/>
         <w:bCs/>
-        <w:color w:val="000000"/>
+        <w:color w:val="000000" w:themeColor="text1"/>
       </w:rPr>
       <w:tblPr/>
       <w:tcPr>
@@ -8306,7 +8121,7 @@
       <w:rPr>
         <w:b/>
         <w:bCs/>
-        <w:color w:val="000000"/>
+        <w:color w:val="000000" w:themeColor="text1"/>
       </w:rPr>
       <w:tblPr/>
       <w:tcPr>
@@ -8325,7 +8140,7 @@
       <w:rPr>
         <w:b/>
         <w:bCs/>
-        <w:color w:val="000000"/>
+        <w:color w:val="000000" w:themeColor="text1"/>
       </w:rPr>
       <w:tblPr/>
       <w:tcPr>
@@ -8344,7 +8159,7 @@
       <w:rPr>
         <w:b w:val="0"/>
         <w:bCs w:val="0"/>
-        <w:color w:val="000000"/>
+        <w:color w:val="000000" w:themeColor="text1"/>
       </w:rPr>
       <w:tblPr/>
       <w:tcPr>
@@ -8392,7 +8207,7 @@
     </w:pPr>
     <w:rPr>
       <w:rFonts w:asciiTheme="majorHAnsi" w:eastAsiaTheme="majorEastAsia" w:hAnsiTheme="majorHAnsi" w:cstheme="majorBidi"/>
-      <w:color w:val="000000"/>
+      <w:color w:val="000000" w:themeColor="text1"/>
     </w:rPr>
     <w:tblPr>
       <w:tblStyleRowBandSize w:val="1"/>
@@ -8420,7 +8235,7 @@
       <w:rPr>
         <w:b/>
         <w:bCs/>
-        <w:color w:val="000000"/>
+        <w:color w:val="000000" w:themeColor="text1"/>
       </w:rPr>
       <w:tblPr/>
       <w:tcPr>
@@ -8431,7 +8246,7 @@
       <w:rPr>
         <w:b/>
         <w:bCs/>
-        <w:color w:val="000000"/>
+        <w:color w:val="000000" w:themeColor="text1"/>
       </w:rPr>
       <w:tblPr/>
       <w:tcPr>
@@ -8450,7 +8265,7 @@
       <w:rPr>
         <w:b/>
         <w:bCs/>
-        <w:color w:val="000000"/>
+        <w:color w:val="000000" w:themeColor="text1"/>
       </w:rPr>
       <w:tblPr/>
       <w:tcPr>
@@ -8469,7 +8284,7 @@
       <w:rPr>
         <w:b w:val="0"/>
         <w:bCs w:val="0"/>
-        <w:color w:val="000000"/>
+        <w:color w:val="000000" w:themeColor="text1"/>
       </w:rPr>
       <w:tblPr/>
       <w:tcPr>
@@ -8517,7 +8332,7 @@
     </w:pPr>
     <w:rPr>
       <w:rFonts w:asciiTheme="majorHAnsi" w:eastAsiaTheme="majorEastAsia" w:hAnsiTheme="majorHAnsi" w:cstheme="majorBidi"/>
-      <w:color w:val="000000"/>
+      <w:color w:val="000000" w:themeColor="text1"/>
     </w:rPr>
     <w:tblPr>
       <w:tblStyleRowBandSize w:val="1"/>
@@ -8545,7 +8360,7 @@
       <w:rPr>
         <w:b/>
         <w:bCs/>
-        <w:color w:val="000000"/>
+        <w:color w:val="000000" w:themeColor="text1"/>
       </w:rPr>
       <w:tblPr/>
       <w:tcPr>
@@ -8556,7 +8371,7 @@
       <w:rPr>
         <w:b/>
         <w:bCs/>
-        <w:color w:val="000000"/>
+        <w:color w:val="000000" w:themeColor="text1"/>
       </w:rPr>
       <w:tblPr/>
       <w:tcPr>
@@ -8575,7 +8390,7 @@
       <w:rPr>
         <w:b/>
         <w:bCs/>
-        <w:color w:val="000000"/>
+        <w:color w:val="000000" w:themeColor="text1"/>
       </w:rPr>
       <w:tblPr/>
       <w:tcPr>
@@ -8594,7 +8409,7 @@
       <w:rPr>
         <w:b w:val="0"/>
         <w:bCs w:val="0"/>
-        <w:color w:val="000000"/>
+        <w:color w:val="000000" w:themeColor="text1"/>
       </w:rPr>
       <w:tblPr/>
       <w:tcPr>
@@ -8642,7 +8457,7 @@
     </w:pPr>
     <w:rPr>
       <w:rFonts w:asciiTheme="majorHAnsi" w:eastAsiaTheme="majorEastAsia" w:hAnsiTheme="majorHAnsi" w:cstheme="majorBidi"/>
-      <w:color w:val="000000"/>
+      <w:color w:val="000000" w:themeColor="text1"/>
     </w:rPr>
     <w:tblPr>
       <w:tblStyleRowBandSize w:val="1"/>
@@ -8670,7 +8485,7 @@
       <w:rPr>
         <w:b/>
         <w:bCs/>
-        <w:color w:val="000000"/>
+        <w:color w:val="000000" w:themeColor="text1"/>
       </w:rPr>
       <w:tblPr/>
       <w:tcPr>
@@ -8681,7 +8496,7 @@
       <w:rPr>
         <w:b/>
         <w:bCs/>
-        <w:color w:val="000000"/>
+        <w:color w:val="000000" w:themeColor="text1"/>
       </w:rPr>
       <w:tblPr/>
       <w:tcPr>
@@ -8700,7 +8515,7 @@
       <w:rPr>
         <w:b/>
         <w:bCs/>
-        <w:color w:val="000000"/>
+        <w:color w:val="000000" w:themeColor="text1"/>
       </w:rPr>
       <w:tblPr/>
       <w:tcPr>
@@ -8719,7 +8534,7 @@
       <w:rPr>
         <w:b w:val="0"/>
         <w:bCs w:val="0"/>
-        <w:color w:val="000000"/>
+        <w:color w:val="000000" w:themeColor="text1"/>
       </w:rPr>
       <w:tblPr/>
       <w:tcPr>
@@ -8767,7 +8582,7 @@
     </w:pPr>
     <w:rPr>
       <w:rFonts w:asciiTheme="majorHAnsi" w:eastAsiaTheme="majorEastAsia" w:hAnsiTheme="majorHAnsi" w:cstheme="majorBidi"/>
-      <w:color w:val="000000"/>
+      <w:color w:val="000000" w:themeColor="text1"/>
     </w:rPr>
     <w:tblPr>
       <w:tblStyleRowBandSize w:val="1"/>
@@ -8795,7 +8610,7 @@
       <w:rPr>
         <w:b/>
         <w:bCs/>
-        <w:color w:val="000000"/>
+        <w:color w:val="000000" w:themeColor="text1"/>
       </w:rPr>
       <w:tblPr/>
       <w:tcPr>
@@ -8806,7 +8621,7 @@
       <w:rPr>
         <w:b/>
         <w:bCs/>
-        <w:color w:val="000000"/>
+        <w:color w:val="000000" w:themeColor="text1"/>
       </w:rPr>
       <w:tblPr/>
       <w:tcPr>
@@ -8825,7 +8640,7 @@
       <w:rPr>
         <w:b/>
         <w:bCs/>
-        <w:color w:val="000000"/>
+        <w:color w:val="000000" w:themeColor="text1"/>
       </w:rPr>
       <w:tblPr/>
       <w:tcPr>
@@ -8844,7 +8659,7 @@
       <w:rPr>
         <w:b w:val="0"/>
         <w:bCs w:val="0"/>
-        <w:color w:val="000000"/>
+        <w:color w:val="000000" w:themeColor="text1"/>
       </w:rPr>
       <w:tblPr/>
       <w:tcPr>
@@ -8918,7 +8733,7 @@
         <w:bCs/>
         <w:i w:val="0"/>
         <w:iCs w:val="0"/>
-        <w:color w:val="000000"/>
+        <w:color w:val="FFFFFF" w:themeColor="background1"/>
       </w:rPr>
       <w:tblPr/>
       <w:tcPr>
@@ -8939,7 +8754,7 @@
         <w:bCs/>
         <w:i w:val="0"/>
         <w:iCs w:val="0"/>
-        <w:color w:val="000000"/>
+        <w:color w:val="FFFFFF" w:themeColor="background1"/>
       </w:rPr>
       <w:tblPr/>
       <w:tcPr>
@@ -8960,7 +8775,7 @@
         <w:bCs/>
         <w:i w:val="0"/>
         <w:iCs w:val="0"/>
-        <w:color w:val="000000"/>
+        <w:color w:val="FFFFFF" w:themeColor="background1"/>
       </w:rPr>
       <w:tblPr/>
       <w:tcPr>
@@ -8979,7 +8794,7 @@
         <w:bCs/>
         <w:i w:val="0"/>
         <w:iCs w:val="0"/>
-        <w:color w:val="000000"/>
+        <w:color w:val="FFFFFF" w:themeColor="background1"/>
       </w:rPr>
       <w:tblPr/>
       <w:tcPr>
@@ -9059,7 +8874,7 @@
         <w:bCs/>
         <w:i w:val="0"/>
         <w:iCs w:val="0"/>
-        <w:color w:val="000000"/>
+        <w:color w:val="FFFFFF" w:themeColor="background1"/>
       </w:rPr>
       <w:tblPr/>
       <w:tcPr>
@@ -9080,7 +8895,7 @@
         <w:bCs/>
         <w:i w:val="0"/>
         <w:iCs w:val="0"/>
-        <w:color w:val="000000"/>
+        <w:color w:val="FFFFFF" w:themeColor="background1"/>
       </w:rPr>
       <w:tblPr/>
       <w:tcPr>
@@ -9101,7 +8916,7 @@
         <w:bCs/>
         <w:i w:val="0"/>
         <w:iCs w:val="0"/>
-        <w:color w:val="000000"/>
+        <w:color w:val="FFFFFF" w:themeColor="background1"/>
       </w:rPr>
       <w:tblPr/>
       <w:tcPr>
@@ -9120,7 +8935,7 @@
         <w:bCs/>
         <w:i w:val="0"/>
         <w:iCs w:val="0"/>
-        <w:color w:val="000000"/>
+        <w:color w:val="FFFFFF" w:themeColor="background1"/>
       </w:rPr>
       <w:tblPr/>
       <w:tcPr>
@@ -9200,7 +9015,7 @@
         <w:bCs/>
         <w:i w:val="0"/>
         <w:iCs w:val="0"/>
-        <w:color w:val="000000"/>
+        <w:color w:val="FFFFFF" w:themeColor="background1"/>
       </w:rPr>
       <w:tblPr/>
       <w:tcPr>
@@ -9221,7 +9036,7 @@
         <w:bCs/>
         <w:i w:val="0"/>
         <w:iCs w:val="0"/>
-        <w:color w:val="000000"/>
+        <w:color w:val="FFFFFF" w:themeColor="background1"/>
       </w:rPr>
       <w:tblPr/>
       <w:tcPr>
@@ -9242,7 +9057,7 @@
         <w:bCs/>
         <w:i w:val="0"/>
         <w:iCs w:val="0"/>
-        <w:color w:val="000000"/>
+        <w:color w:val="FFFFFF" w:themeColor="background1"/>
       </w:rPr>
       <w:tblPr/>
       <w:tcPr>
@@ -9261,7 +9076,7 @@
         <w:bCs/>
         <w:i w:val="0"/>
         <w:iCs w:val="0"/>
-        <w:color w:val="000000"/>
+        <w:color w:val="FFFFFF" w:themeColor="background1"/>
       </w:rPr>
       <w:tblPr/>
       <w:tcPr>
@@ -9341,7 +9156,7 @@
         <w:bCs/>
         <w:i w:val="0"/>
         <w:iCs w:val="0"/>
-        <w:color w:val="000000"/>
+        <w:color w:val="FFFFFF" w:themeColor="background1"/>
       </w:rPr>
       <w:tblPr/>
       <w:tcPr>
@@ -9362,7 +9177,7 @@
         <w:bCs/>
         <w:i w:val="0"/>
         <w:iCs w:val="0"/>
-        <w:color w:val="000000"/>
+        <w:color w:val="FFFFFF" w:themeColor="background1"/>
       </w:rPr>
       <w:tblPr/>
       <w:tcPr>
@@ -9383,7 +9198,7 @@
         <w:bCs/>
         <w:i w:val="0"/>
         <w:iCs w:val="0"/>
-        <w:color w:val="000000"/>
+        <w:color w:val="FFFFFF" w:themeColor="background1"/>
       </w:rPr>
       <w:tblPr/>
       <w:tcPr>
@@ -9402,7 +9217,7 @@
         <w:bCs/>
         <w:i w:val="0"/>
         <w:iCs w:val="0"/>
-        <w:color w:val="000000"/>
+        <w:color w:val="FFFFFF" w:themeColor="background1"/>
       </w:rPr>
       <w:tblPr/>
       <w:tcPr>
@@ -9482,7 +9297,7 @@
         <w:bCs/>
         <w:i w:val="0"/>
         <w:iCs w:val="0"/>
-        <w:color w:val="000000"/>
+        <w:color w:val="FFFFFF" w:themeColor="background1"/>
       </w:rPr>
       <w:tblPr/>
       <w:tcPr>
@@ -9503,7 +9318,7 @@
         <w:bCs/>
         <w:i w:val="0"/>
         <w:iCs w:val="0"/>
-        <w:color w:val="000000"/>
+        <w:color w:val="FFFFFF" w:themeColor="background1"/>
       </w:rPr>
       <w:tblPr/>
       <w:tcPr>
@@ -9524,7 +9339,7 @@
         <w:bCs/>
         <w:i w:val="0"/>
         <w:iCs w:val="0"/>
-        <w:color w:val="000000"/>
+        <w:color w:val="FFFFFF" w:themeColor="background1"/>
       </w:rPr>
       <w:tblPr/>
       <w:tcPr>
@@ -9543,7 +9358,7 @@
         <w:bCs/>
         <w:i w:val="0"/>
         <w:iCs w:val="0"/>
-        <w:color w:val="000000"/>
+        <w:color w:val="FFFFFF" w:themeColor="background1"/>
       </w:rPr>
       <w:tblPr/>
       <w:tcPr>
@@ -9623,7 +9438,7 @@
         <w:bCs/>
         <w:i w:val="0"/>
         <w:iCs w:val="0"/>
-        <w:color w:val="000000"/>
+        <w:color w:val="FFFFFF" w:themeColor="background1"/>
       </w:rPr>
       <w:tblPr/>
       <w:tcPr>
@@ -9644,7 +9459,7 @@
         <w:bCs/>
         <w:i w:val="0"/>
         <w:iCs w:val="0"/>
-        <w:color w:val="000000"/>
+        <w:color w:val="FFFFFF" w:themeColor="background1"/>
       </w:rPr>
       <w:tblPr/>
       <w:tcPr>
@@ -9665,7 +9480,7 @@
         <w:bCs/>
         <w:i w:val="0"/>
         <w:iCs w:val="0"/>
-        <w:color w:val="000000"/>
+        <w:color w:val="FFFFFF" w:themeColor="background1"/>
       </w:rPr>
       <w:tblPr/>
       <w:tcPr>
@@ -9684,7 +9499,7 @@
         <w:bCs/>
         <w:i w:val="0"/>
         <w:iCs w:val="0"/>
-        <w:color w:val="000000"/>
+        <w:color w:val="FFFFFF" w:themeColor="background1"/>
       </w:rPr>
       <w:tblPr/>
       <w:tcPr>
@@ -9764,7 +9579,7 @@
         <w:bCs/>
         <w:i w:val="0"/>
         <w:iCs w:val="0"/>
-        <w:color w:val="000000"/>
+        <w:color w:val="FFFFFF" w:themeColor="background1"/>
       </w:rPr>
       <w:tblPr/>
       <w:tcPr>
@@ -9785,7 +9600,7 @@
         <w:bCs/>
         <w:i w:val="0"/>
         <w:iCs w:val="0"/>
-        <w:color w:val="000000"/>
+        <w:color w:val="FFFFFF" w:themeColor="background1"/>
       </w:rPr>
       <w:tblPr/>
       <w:tcPr>
@@ -9806,7 +9621,7 @@
         <w:bCs/>
         <w:i w:val="0"/>
         <w:iCs w:val="0"/>
-        <w:color w:val="000000"/>
+        <w:color w:val="FFFFFF" w:themeColor="background1"/>
       </w:rPr>
       <w:tblPr/>
       <w:tcPr>
@@ -9825,7 +9640,7 @@
         <w:bCs/>
         <w:i w:val="0"/>
         <w:iCs w:val="0"/>
-        <w:color w:val="000000"/>
+        <w:color w:val="FFFFFF" w:themeColor="background1"/>
       </w:rPr>
       <w:tblPr/>
       <w:tcPr>
@@ -9878,7 +9693,7 @@
       <w:spacing w:after="0" w:line="240" w:lineRule="auto"/>
     </w:pPr>
     <w:rPr>
-      <w:color w:val="000000"/>
+      <w:color w:val="FFFFFF" w:themeColor="background1"/>
     </w:rPr>
     <w:tblPr>
       <w:tblStyleRowBandSize w:val="1"/>
@@ -9992,7 +9807,7 @@
       <w:spacing w:after="0" w:line="240" w:lineRule="auto"/>
     </w:pPr>
     <w:rPr>
-      <w:color w:val="000000"/>
+      <w:color w:val="FFFFFF" w:themeColor="background1"/>
     </w:rPr>
     <w:tblPr>
       <w:tblStyleRowBandSize w:val="1"/>
@@ -10106,7 +9921,7 @@
       <w:spacing w:after="0" w:line="240" w:lineRule="auto"/>
     </w:pPr>
     <w:rPr>
-      <w:color w:val="000000"/>
+      <w:color w:val="FFFFFF" w:themeColor="background1"/>
     </w:rPr>
     <w:tblPr>
       <w:tblStyleRowBandSize w:val="1"/>
@@ -10220,7 +10035,7 @@
       <w:spacing w:after="0" w:line="240" w:lineRule="auto"/>
     </w:pPr>
     <w:rPr>
-      <w:color w:val="000000"/>
+      <w:color w:val="FFFFFF" w:themeColor="background1"/>
     </w:rPr>
     <w:tblPr>
       <w:tblStyleRowBandSize w:val="1"/>
@@ -10334,7 +10149,7 @@
       <w:spacing w:after="0" w:line="240" w:lineRule="auto"/>
     </w:pPr>
     <w:rPr>
-      <w:color w:val="000000"/>
+      <w:color w:val="FFFFFF" w:themeColor="background1"/>
     </w:rPr>
     <w:tblPr>
       <w:tblStyleRowBandSize w:val="1"/>
@@ -10448,7 +10263,7 @@
       <w:spacing w:after="0" w:line="240" w:lineRule="auto"/>
     </w:pPr>
     <w:rPr>
-      <w:color w:val="000000"/>
+      <w:color w:val="FFFFFF" w:themeColor="background1"/>
     </w:rPr>
     <w:tblPr>
       <w:tblStyleRowBandSize w:val="1"/>
@@ -10562,7 +10377,7 @@
       <w:spacing w:after="0" w:line="240" w:lineRule="auto"/>
     </w:pPr>
     <w:rPr>
-      <w:color w:val="000000"/>
+      <w:color w:val="FFFFFF" w:themeColor="background1"/>
     </w:rPr>
     <w:tblPr>
       <w:tblStyleRowBandSize w:val="1"/>
@@ -10676,7 +10491,7 @@
       <w:spacing w:after="0" w:line="240" w:lineRule="auto"/>
     </w:pPr>
     <w:rPr>
-      <w:color w:val="000000"/>
+      <w:color w:val="000000" w:themeColor="text1"/>
     </w:rPr>
     <w:tblPr>
       <w:tblStyleRowBandSize w:val="1"/>
@@ -10722,7 +10537,7 @@
       <w:rPr>
         <w:b/>
         <w:bCs/>
-        <w:color w:val="000000"/>
+        <w:color w:val="FFFFFF" w:themeColor="background1"/>
       </w:rPr>
       <w:tblPr/>
       <w:tcPr>
@@ -10734,7 +10549,7 @@
     </w:tblStylePr>
     <w:tblStylePr w:type="firstCol">
       <w:rPr>
-        <w:color w:val="000000"/>
+        <w:color w:val="FFFFFF" w:themeColor="background1"/>
       </w:rPr>
       <w:tblPr/>
       <w:tcPr>
@@ -10751,7 +10566,7 @@
     </w:tblStylePr>
     <w:tblStylePr w:type="lastCol">
       <w:rPr>
-        <w:color w:val="000000"/>
+        <w:color w:val="FFFFFF" w:themeColor="background1"/>
       </w:rPr>
       <w:tblPr/>
       <w:tcPr>
@@ -10780,12 +10595,12 @@
     </w:tblStylePr>
     <w:tblStylePr w:type="neCell">
       <w:rPr>
-        <w:color w:val="000000"/>
+        <w:color w:val="000000" w:themeColor="text1"/>
       </w:rPr>
     </w:tblStylePr>
     <w:tblStylePr w:type="nwCell">
       <w:rPr>
-        <w:color w:val="000000"/>
+        <w:color w:val="000000" w:themeColor="text1"/>
       </w:rPr>
     </w:tblStylePr>
   </w:style>
@@ -10798,7 +10613,7 @@
       <w:spacing w:after="0" w:line="240" w:lineRule="auto"/>
     </w:pPr>
     <w:rPr>
-      <w:color w:val="000000"/>
+      <w:color w:val="000000" w:themeColor="text1"/>
     </w:rPr>
     <w:tblPr>
       <w:tblStyleRowBandSize w:val="1"/>
@@ -10844,7 +10659,7 @@
       <w:rPr>
         <w:b/>
         <w:bCs/>
-        <w:color w:val="000000"/>
+        <w:color w:val="FFFFFF" w:themeColor="background1"/>
       </w:rPr>
       <w:tblPr/>
       <w:tcPr>
@@ -10856,7 +10671,7 @@
     </w:tblStylePr>
     <w:tblStylePr w:type="firstCol">
       <w:rPr>
-        <w:color w:val="000000"/>
+        <w:color w:val="FFFFFF" w:themeColor="background1"/>
       </w:rPr>
       <w:tblPr/>
       <w:tcPr>
@@ -10873,7 +10688,7 @@
     </w:tblStylePr>
     <w:tblStylePr w:type="lastCol">
       <w:rPr>
-        <w:color w:val="000000"/>
+        <w:color w:val="FFFFFF" w:themeColor="background1"/>
       </w:rPr>
       <w:tblPr/>
       <w:tcPr>
@@ -10902,12 +10717,12 @@
     </w:tblStylePr>
     <w:tblStylePr w:type="neCell">
       <w:rPr>
-        <w:color w:val="000000"/>
+        <w:color w:val="000000" w:themeColor="text1"/>
       </w:rPr>
     </w:tblStylePr>
     <w:tblStylePr w:type="nwCell">
       <w:rPr>
-        <w:color w:val="000000"/>
+        <w:color w:val="000000" w:themeColor="text1"/>
       </w:rPr>
     </w:tblStylePr>
   </w:style>
@@ -10920,7 +10735,7 @@
       <w:spacing w:after="0" w:line="240" w:lineRule="auto"/>
     </w:pPr>
     <w:rPr>
-      <w:color w:val="000000"/>
+      <w:color w:val="000000" w:themeColor="text1"/>
     </w:rPr>
     <w:tblPr>
       <w:tblStyleRowBandSize w:val="1"/>
@@ -10966,7 +10781,7 @@
       <w:rPr>
         <w:b/>
         <w:bCs/>
-        <w:color w:val="000000"/>
+        <w:color w:val="FFFFFF" w:themeColor="background1"/>
       </w:rPr>
       <w:tblPr/>
       <w:tcPr>
@@ -10978,7 +10793,7 @@
     </w:tblStylePr>
     <w:tblStylePr w:type="firstCol">
       <w:rPr>
-        <w:color w:val="000000"/>
+        <w:color w:val="FFFFFF" w:themeColor="background1"/>
       </w:rPr>
       <w:tblPr/>
       <w:tcPr>
@@ -10995,7 +10810,7 @@
     </w:tblStylePr>
     <w:tblStylePr w:type="lastCol">
       <w:rPr>
-        <w:color w:val="000000"/>
+        <w:color w:val="FFFFFF" w:themeColor="background1"/>
       </w:rPr>
       <w:tblPr/>
       <w:tcPr>
@@ -11024,12 +10839,12 @@
     </w:tblStylePr>
     <w:tblStylePr w:type="neCell">
       <w:rPr>
-        <w:color w:val="000000"/>
+        <w:color w:val="000000" w:themeColor="text1"/>
       </w:rPr>
     </w:tblStylePr>
     <w:tblStylePr w:type="nwCell">
       <w:rPr>
-        <w:color w:val="000000"/>
+        <w:color w:val="000000" w:themeColor="text1"/>
       </w:rPr>
     </w:tblStylePr>
   </w:style>
@@ -11042,7 +10857,7 @@
       <w:spacing w:after="0" w:line="240" w:lineRule="auto"/>
     </w:pPr>
     <w:rPr>
-      <w:color w:val="000000"/>
+      <w:color w:val="000000" w:themeColor="text1"/>
     </w:rPr>
     <w:tblPr>
       <w:tblStyleRowBandSize w:val="1"/>
@@ -11088,7 +10903,7 @@
       <w:rPr>
         <w:b/>
         <w:bCs/>
-        <w:color w:val="000000"/>
+        <w:color w:val="FFFFFF" w:themeColor="background1"/>
       </w:rPr>
       <w:tblPr/>
       <w:tcPr>
@@ -11100,7 +10915,7 @@
     </w:tblStylePr>
     <w:tblStylePr w:type="firstCol">
       <w:rPr>
-        <w:color w:val="000000"/>
+        <w:color w:val="FFFFFF" w:themeColor="background1"/>
       </w:rPr>
       <w:tblPr/>
       <w:tcPr>
@@ -11117,7 +10932,7 @@
     </w:tblStylePr>
     <w:tblStylePr w:type="lastCol">
       <w:rPr>
-        <w:color w:val="000000"/>
+        <w:color w:val="FFFFFF" w:themeColor="background1"/>
       </w:rPr>
       <w:tblPr/>
       <w:tcPr>
@@ -11154,7 +10969,7 @@
       <w:spacing w:after="0" w:line="240" w:lineRule="auto"/>
     </w:pPr>
     <w:rPr>
-      <w:color w:val="000000"/>
+      <w:color w:val="000000" w:themeColor="text1"/>
     </w:rPr>
     <w:tblPr>
       <w:tblStyleRowBandSize w:val="1"/>
@@ -11200,7 +11015,7 @@
       <w:rPr>
         <w:b/>
         <w:bCs/>
-        <w:color w:val="000000"/>
+        <w:color w:val="FFFFFF" w:themeColor="background1"/>
       </w:rPr>
       <w:tblPr/>
       <w:tcPr>
@@ -11212,7 +11027,7 @@
     </w:tblStylePr>
     <w:tblStylePr w:type="firstCol">
       <w:rPr>
-        <w:color w:val="000000"/>
+        <w:color w:val="FFFFFF" w:themeColor="background1"/>
       </w:rPr>
       <w:tblPr/>
       <w:tcPr>
@@ -11229,7 +11044,7 @@
     </w:tblStylePr>
     <w:tblStylePr w:type="lastCol">
       <w:rPr>
-        <w:color w:val="000000"/>
+        <w:color w:val="FFFFFF" w:themeColor="background1"/>
       </w:rPr>
       <w:tblPr/>
       <w:tcPr>
@@ -11258,12 +11073,12 @@
     </w:tblStylePr>
     <w:tblStylePr w:type="neCell">
       <w:rPr>
-        <w:color w:val="000000"/>
+        <w:color w:val="000000" w:themeColor="text1"/>
       </w:rPr>
     </w:tblStylePr>
     <w:tblStylePr w:type="nwCell">
       <w:rPr>
-        <w:color w:val="000000"/>
+        <w:color w:val="000000" w:themeColor="text1"/>
       </w:rPr>
     </w:tblStylePr>
   </w:style>
@@ -11276,7 +11091,7 @@
       <w:spacing w:after="0" w:line="240" w:lineRule="auto"/>
     </w:pPr>
     <w:rPr>
-      <w:color w:val="000000"/>
+      <w:color w:val="000000" w:themeColor="text1"/>
     </w:rPr>
     <w:tblPr>
       <w:tblStyleRowBandSize w:val="1"/>
@@ -11322,7 +11137,7 @@
       <w:rPr>
         <w:b/>
         <w:bCs/>
-        <w:color w:val="000000"/>
+        <w:color w:val="FFFFFF" w:themeColor="background1"/>
       </w:rPr>
       <w:tblPr/>
       <w:tcPr>
@@ -11334,7 +11149,7 @@
     </w:tblStylePr>
     <w:tblStylePr w:type="firstCol">
       <w:rPr>
-        <w:color w:val="000000"/>
+        <w:color w:val="FFFFFF" w:themeColor="background1"/>
       </w:rPr>
       <w:tblPr/>
       <w:tcPr>
@@ -11351,7 +11166,7 @@
     </w:tblStylePr>
     <w:tblStylePr w:type="lastCol">
       <w:rPr>
-        <w:color w:val="000000"/>
+        <w:color w:val="FFFFFF" w:themeColor="background1"/>
       </w:rPr>
       <w:tblPr/>
       <w:tcPr>
@@ -11380,12 +11195,12 @@
     </w:tblStylePr>
     <w:tblStylePr w:type="neCell">
       <w:rPr>
-        <w:color w:val="000000"/>
+        <w:color w:val="000000" w:themeColor="text1"/>
       </w:rPr>
     </w:tblStylePr>
     <w:tblStylePr w:type="nwCell">
       <w:rPr>
-        <w:color w:val="000000"/>
+        <w:color w:val="000000" w:themeColor="text1"/>
       </w:rPr>
     </w:tblStylePr>
   </w:style>
@@ -11398,7 +11213,7 @@
       <w:spacing w:after="0" w:line="240" w:lineRule="auto"/>
     </w:pPr>
     <w:rPr>
-      <w:color w:val="000000"/>
+      <w:color w:val="000000" w:themeColor="text1"/>
     </w:rPr>
     <w:tblPr>
       <w:tblStyleRowBandSize w:val="1"/>
@@ -11444,7 +11259,7 @@
       <w:rPr>
         <w:b/>
         <w:bCs/>
-        <w:color w:val="000000"/>
+        <w:color w:val="FFFFFF" w:themeColor="background1"/>
       </w:rPr>
       <w:tblPr/>
       <w:tcPr>
@@ -11456,7 +11271,7 @@
     </w:tblStylePr>
     <w:tblStylePr w:type="firstCol">
       <w:rPr>
-        <w:color w:val="000000"/>
+        <w:color w:val="FFFFFF" w:themeColor="background1"/>
       </w:rPr>
       <w:tblPr/>
       <w:tcPr>
@@ -11473,7 +11288,7 @@
     </w:tblStylePr>
     <w:tblStylePr w:type="lastCol">
       <w:rPr>
-        <w:color w:val="000000"/>
+        <w:color w:val="FFFFFF" w:themeColor="background1"/>
       </w:rPr>
       <w:tblPr/>
       <w:tcPr>
@@ -11502,12 +11317,12 @@
     </w:tblStylePr>
     <w:tblStylePr w:type="neCell">
       <w:rPr>
-        <w:color w:val="000000"/>
+        <w:color w:val="000000" w:themeColor="text1"/>
       </w:rPr>
     </w:tblStylePr>
     <w:tblStylePr w:type="nwCell">
       <w:rPr>
-        <w:color w:val="000000"/>
+        <w:color w:val="000000" w:themeColor="text1"/>
       </w:rPr>
     </w:tblStylePr>
   </w:style>
@@ -11520,7 +11335,7 @@
       <w:spacing w:after="0" w:line="240" w:lineRule="auto"/>
     </w:pPr>
     <w:rPr>
-      <w:color w:val="000000"/>
+      <w:color w:val="000000" w:themeColor="text1"/>
     </w:rPr>
     <w:tblPr>
       <w:tblStyleRowBandSize w:val="1"/>
@@ -11540,7 +11355,7 @@
       <w:rPr>
         <w:b/>
         <w:bCs/>
-        <w:color w:val="000000"/>
+        <w:color w:val="FFFFFF" w:themeColor="background1"/>
       </w:rPr>
       <w:tblPr/>
       <w:tcPr>
@@ -11554,7 +11369,7 @@
       <w:rPr>
         <w:b/>
         <w:bCs/>
-        <w:color w:val="000000"/>
+        <w:color w:val="9E3A38" w:themeColor="accent2" w:themeShade="CC"/>
       </w:rPr>
       <w:tblPr/>
       <w:tcPr>
@@ -11606,7 +11421,7 @@
       <w:spacing w:after="0" w:line="240" w:lineRule="auto"/>
     </w:pPr>
     <w:rPr>
-      <w:color w:val="000000"/>
+      <w:color w:val="000000" w:themeColor="text1"/>
     </w:rPr>
     <w:tblPr>
       <w:tblStyleRowBandSize w:val="1"/>
@@ -11626,7 +11441,7 @@
       <w:rPr>
         <w:b/>
         <w:bCs/>
-        <w:color w:val="000000"/>
+        <w:color w:val="FFFFFF" w:themeColor="background1"/>
       </w:rPr>
       <w:tblPr/>
       <w:tcPr>
@@ -11640,7 +11455,7 @@
       <w:rPr>
         <w:b/>
         <w:bCs/>
-        <w:color w:val="000000"/>
+        <w:color w:val="9E3A38" w:themeColor="accent2" w:themeShade="CC"/>
       </w:rPr>
       <w:tblPr/>
       <w:tcPr>
@@ -11692,7 +11507,7 @@
       <w:spacing w:after="0" w:line="240" w:lineRule="auto"/>
     </w:pPr>
     <w:rPr>
-      <w:color w:val="000000"/>
+      <w:color w:val="000000" w:themeColor="text1"/>
     </w:rPr>
     <w:tblPr>
       <w:tblStyleRowBandSize w:val="1"/>
@@ -11712,7 +11527,7 @@
       <w:rPr>
         <w:b/>
         <w:bCs/>
-        <w:color w:val="000000"/>
+        <w:color w:val="FFFFFF" w:themeColor="background1"/>
       </w:rPr>
       <w:tblPr/>
       <w:tcPr>
@@ -11726,7 +11541,7 @@
       <w:rPr>
         <w:b/>
         <w:bCs/>
-        <w:color w:val="000000"/>
+        <w:color w:val="9E3A38" w:themeColor="accent2" w:themeShade="CC"/>
       </w:rPr>
       <w:tblPr/>
       <w:tcPr>
@@ -11778,7 +11593,7 @@
       <w:spacing w:after="0" w:line="240" w:lineRule="auto"/>
     </w:pPr>
     <w:rPr>
-      <w:color w:val="000000"/>
+      <w:color w:val="000000" w:themeColor="text1"/>
     </w:rPr>
     <w:tblPr>
       <w:tblStyleRowBandSize w:val="1"/>
@@ -11798,7 +11613,7 @@
       <w:rPr>
         <w:b/>
         <w:bCs/>
-        <w:color w:val="000000"/>
+        <w:color w:val="FFFFFF" w:themeColor="background1"/>
       </w:rPr>
       <w:tblPr/>
       <w:tcPr>
@@ -11812,7 +11627,7 @@
       <w:rPr>
         <w:b/>
         <w:bCs/>
-        <w:color w:val="000000"/>
+        <w:color w:val="664E82" w:themeColor="accent4" w:themeShade="CC"/>
       </w:rPr>
       <w:tblPr/>
       <w:tcPr>
@@ -11864,7 +11679,7 @@
       <w:spacing w:after="0" w:line="240" w:lineRule="auto"/>
     </w:pPr>
     <w:rPr>
-      <w:color w:val="000000"/>
+      <w:color w:val="000000" w:themeColor="text1"/>
     </w:rPr>
     <w:tblPr>
       <w:tblStyleRowBandSize w:val="1"/>
@@ -11884,7 +11699,7 @@
       <w:rPr>
         <w:b/>
         <w:bCs/>
-        <w:color w:val="000000"/>
+        <w:color w:val="FFFFFF" w:themeColor="background1"/>
       </w:rPr>
       <w:tblPr/>
       <w:tcPr>
@@ -11898,7 +11713,7 @@
       <w:rPr>
         <w:b/>
         <w:bCs/>
-        <w:color w:val="000000"/>
+        <w:color w:val="7E9C40" w:themeColor="accent3" w:themeShade="CC"/>
       </w:rPr>
       <w:tblPr/>
       <w:tcPr>
@@ -11950,7 +11765,7 @@
       <w:spacing w:after="0" w:line="240" w:lineRule="auto"/>
     </w:pPr>
     <w:rPr>
-      <w:color w:val="000000"/>
+      <w:color w:val="000000" w:themeColor="text1"/>
     </w:rPr>
     <w:tblPr>
       <w:tblStyleRowBandSize w:val="1"/>
@@ -11970,7 +11785,7 @@
       <w:rPr>
         <w:b/>
         <w:bCs/>
-        <w:color w:val="000000"/>
+        <w:color w:val="FFFFFF" w:themeColor="background1"/>
       </w:rPr>
       <w:tblPr/>
       <w:tcPr>
@@ -11984,7 +11799,7 @@
       <w:rPr>
         <w:b/>
         <w:bCs/>
-        <w:color w:val="000000"/>
+        <w:color w:val="F2730A" w:themeColor="accent6" w:themeShade="CC"/>
       </w:rPr>
       <w:tblPr/>
       <w:tcPr>
@@ -12036,7 +11851,7 @@
       <w:spacing w:after="0" w:line="240" w:lineRule="auto"/>
     </w:pPr>
     <w:rPr>
-      <w:color w:val="000000"/>
+      <w:color w:val="000000" w:themeColor="text1"/>
     </w:rPr>
     <w:tblPr>
       <w:tblStyleRowBandSize w:val="1"/>
@@ -12056,7 +11871,7 @@
       <w:rPr>
         <w:b/>
         <w:bCs/>
-        <w:color w:val="000000"/>
+        <w:color w:val="FFFFFF" w:themeColor="background1"/>
       </w:rPr>
       <w:tblPr/>
       <w:tcPr>
@@ -12070,7 +11885,7 @@
       <w:rPr>
         <w:b/>
         <w:bCs/>
-        <w:color w:val="000000"/>
+        <w:color w:val="348DA5" w:themeColor="accent5" w:themeShade="CC"/>
       </w:rPr>
       <w:tblPr/>
       <w:tcPr>
@@ -12122,7 +11937,7 @@
       <w:spacing w:after="0" w:line="240" w:lineRule="auto"/>
     </w:pPr>
     <w:rPr>
-      <w:color w:val="000000"/>
+      <w:color w:val="000000" w:themeColor="text1"/>
     </w:rPr>
     <w:tblPr>
       <w:tblStyleRowBandSize w:val="1"/>
@@ -12155,7 +11970,7 @@
       <w:rPr>
         <w:b/>
         <w:bCs/>
-        <w:color w:val="000000"/>
+        <w:color w:val="000000" w:themeColor="text1"/>
       </w:rPr>
       <w:tblPr/>
       <w:tcPr>
@@ -12164,7 +11979,7 @@
     </w:tblStylePr>
     <w:tblStylePr w:type="firstCol">
       <w:rPr>
-        <w:color w:val="000000"/>
+        <w:color w:val="FFFFFF" w:themeColor="background1"/>
       </w:rPr>
       <w:tblPr/>
       <w:tcPr>
@@ -12173,7 +11988,7 @@
     </w:tblStylePr>
     <w:tblStylePr w:type="lastCol">
       <w:rPr>
-        <w:color w:val="000000"/>
+        <w:color w:val="FFFFFF" w:themeColor="background1"/>
       </w:rPr>
       <w:tblPr/>
       <w:tcPr>
@@ -12202,7 +12017,7 @@
       <w:spacing w:after="0" w:line="240" w:lineRule="auto"/>
     </w:pPr>
     <w:rPr>
-      <w:color w:val="000000"/>
+      <w:color w:val="000000" w:themeColor="text1"/>
     </w:rPr>
     <w:tblPr>
       <w:tblStyleRowBandSize w:val="1"/>
@@ -12235,7 +12050,7 @@
       <w:rPr>
         <w:b/>
         <w:bCs/>
-        <w:color w:val="000000"/>
+        <w:color w:val="000000" w:themeColor="text1"/>
       </w:rPr>
       <w:tblPr/>
       <w:tcPr>
@@ -12244,7 +12059,7 @@
     </w:tblStylePr>
     <w:tblStylePr w:type="firstCol">
       <w:rPr>
-        <w:color w:val="000000"/>
+        <w:color w:val="FFFFFF" w:themeColor="background1"/>
       </w:rPr>
       <w:tblPr/>
       <w:tcPr>
@@ -12253,7 +12068,7 @@
     </w:tblStylePr>
     <w:tblStylePr w:type="lastCol">
       <w:rPr>
-        <w:color w:val="000000"/>
+        <w:color w:val="FFFFFF" w:themeColor="background1"/>
       </w:rPr>
       <w:tblPr/>
       <w:tcPr>
@@ -12282,7 +12097,7 @@
       <w:spacing w:after="0" w:line="240" w:lineRule="auto"/>
     </w:pPr>
     <w:rPr>
-      <w:color w:val="000000"/>
+      <w:color w:val="000000" w:themeColor="text1"/>
     </w:rPr>
     <w:tblPr>
       <w:tblStyleRowBandSize w:val="1"/>
@@ -12315,7 +12130,7 @@
       <w:rPr>
         <w:b/>
         <w:bCs/>
-        <w:color w:val="000000"/>
+        <w:color w:val="000000" w:themeColor="text1"/>
       </w:rPr>
       <w:tblPr/>
       <w:tcPr>
@@ -12324,7 +12139,7 @@
     </w:tblStylePr>
     <w:tblStylePr w:type="firstCol">
       <w:rPr>
-        <w:color w:val="000000"/>
+        <w:color w:val="FFFFFF" w:themeColor="background1"/>
       </w:rPr>
       <w:tblPr/>
       <w:tcPr>
@@ -12333,7 +12148,7 @@
     </w:tblStylePr>
     <w:tblStylePr w:type="lastCol">
       <w:rPr>
-        <w:color w:val="000000"/>
+        <w:color w:val="FFFFFF" w:themeColor="background1"/>
       </w:rPr>
       <w:tblPr/>
       <w:tcPr>
@@ -12362,7 +12177,7 @@
       <w:spacing w:after="0" w:line="240" w:lineRule="auto"/>
     </w:pPr>
     <w:rPr>
-      <w:color w:val="000000"/>
+      <w:color w:val="000000" w:themeColor="text1"/>
     </w:rPr>
     <w:tblPr>
       <w:tblStyleRowBandSize w:val="1"/>
@@ -12395,7 +12210,7 @@
       <w:rPr>
         <w:b/>
         <w:bCs/>
-        <w:color w:val="000000"/>
+        <w:color w:val="000000" w:themeColor="text1"/>
       </w:rPr>
       <w:tblPr/>
       <w:tcPr>
@@ -12404,7 +12219,7 @@
     </w:tblStylePr>
     <w:tblStylePr w:type="firstCol">
       <w:rPr>
-        <w:color w:val="000000"/>
+        <w:color w:val="FFFFFF" w:themeColor="background1"/>
       </w:rPr>
       <w:tblPr/>
       <w:tcPr>
@@ -12413,7 +12228,7 @@
     </w:tblStylePr>
     <w:tblStylePr w:type="lastCol">
       <w:rPr>
-        <w:color w:val="000000"/>
+        <w:color w:val="FFFFFF" w:themeColor="background1"/>
       </w:rPr>
       <w:tblPr/>
       <w:tcPr>
@@ -12442,7 +12257,7 @@
       <w:spacing w:after="0" w:line="240" w:lineRule="auto"/>
     </w:pPr>
     <w:rPr>
-      <w:color w:val="000000"/>
+      <w:color w:val="000000" w:themeColor="text1"/>
     </w:rPr>
     <w:tblPr>
       <w:tblStyleRowBandSize w:val="1"/>
@@ -12475,7 +12290,7 @@
       <w:rPr>
         <w:b/>
         <w:bCs/>
-        <w:color w:val="000000"/>
+        <w:color w:val="000000" w:themeColor="text1"/>
       </w:rPr>
       <w:tblPr/>
       <w:tcPr>
@@ -12484,7 +12299,7 @@
     </w:tblStylePr>
     <w:tblStylePr w:type="firstCol">
       <w:rPr>
-        <w:color w:val="000000"/>
+        <w:color w:val="FFFFFF" w:themeColor="background1"/>
       </w:rPr>
       <w:tblPr/>
       <w:tcPr>
@@ -12493,7 +12308,7 @@
     </w:tblStylePr>
     <w:tblStylePr w:type="lastCol">
       <w:rPr>
-        <w:color w:val="000000"/>
+        <w:color w:val="FFFFFF" w:themeColor="background1"/>
       </w:rPr>
       <w:tblPr/>
       <w:tcPr>
@@ -12522,7 +12337,7 @@
       <w:spacing w:after="0" w:line="240" w:lineRule="auto"/>
     </w:pPr>
     <w:rPr>
-      <w:color w:val="000000"/>
+      <w:color w:val="000000" w:themeColor="text1"/>
     </w:rPr>
     <w:tblPr>
       <w:tblStyleRowBandSize w:val="1"/>
@@ -12555,7 +12370,7 @@
       <w:rPr>
         <w:b/>
         <w:bCs/>
-        <w:color w:val="000000"/>
+        <w:color w:val="000000" w:themeColor="text1"/>
       </w:rPr>
       <w:tblPr/>
       <w:tcPr>
@@ -12564,7 +12379,7 @@
     </w:tblStylePr>
     <w:tblStylePr w:type="firstCol">
       <w:rPr>
-        <w:color w:val="000000"/>
+        <w:color w:val="FFFFFF" w:themeColor="background1"/>
       </w:rPr>
       <w:tblPr/>
       <w:tcPr>
@@ -12573,7 +12388,7 @@
     </w:tblStylePr>
     <w:tblStylePr w:type="lastCol">
       <w:rPr>
-        <w:color w:val="000000"/>
+        <w:color w:val="FFFFFF" w:themeColor="background1"/>
       </w:rPr>
       <w:tblPr/>
       <w:tcPr>
@@ -12602,7 +12417,7 @@
       <w:spacing w:after="0" w:line="240" w:lineRule="auto"/>
     </w:pPr>
     <w:rPr>
-      <w:color w:val="000000"/>
+      <w:color w:val="000000" w:themeColor="text1"/>
     </w:rPr>
     <w:tblPr>
       <w:tblStyleRowBandSize w:val="1"/>
@@ -12635,7 +12450,7 @@
       <w:rPr>
         <w:b/>
         <w:bCs/>
-        <w:color w:val="000000"/>
+        <w:color w:val="000000" w:themeColor="text1"/>
       </w:rPr>
       <w:tblPr/>
       <w:tcPr>
@@ -12644,7 +12459,7 @@
     </w:tblStylePr>
     <w:tblStylePr w:type="firstCol">
       <w:rPr>
-        <w:color w:val="000000"/>
+        <w:color w:val="FFFFFF" w:themeColor="background1"/>
       </w:rPr>
       <w:tblPr/>
       <w:tcPr>
@@ -12653,7 +12468,7 @@
     </w:tblStylePr>
     <w:tblStylePr w:type="lastCol">
       <w:rPr>
-        <w:color w:val="000000"/>
+        <w:color w:val="FFFFFF" w:themeColor="background1"/>
       </w:rPr>
       <w:tblPr/>
       <w:tcPr>

</xml_diff>